<commit_message>
Agrega sección de análisis y tratamiento de outliers
Nueva sección 4.4 (análisis IQR + boxplots + decisión de conservación
justificada) en el informe (PDF y DOCX) y una celda de análisis de
outliers en el notebook. Renumera figuras (8), tablas (3) y subsecciones.

Co-Authored-By: Claude Opus 4.8 <noreply@anthropic.com>
</commit_message>
<xml_diff>
--- a/proyecto-productividad-textil/Informe_Productividad_Textil.docx
+++ b/proyecto-productividad-textil/Informe_Productividad_Textil.docx
@@ -2099,7 +2099,7 @@
         <w:rPr>
           <w:color w:val="2A5A9C"/>
         </w:rPr>
-        <w:t>4.4 Partición temporal y control de la fuga de información</w:t>
+        <w:t>4.4 Análisis y tratamiento de valores atípicos (outliers)</w:t>
       </w:r>
     </w:p>
     <w:p>
@@ -2108,72 +2108,571 @@
         <w:jc w:val="both"/>
       </w:pPr>
       <w:r>
-        <w:t xml:space="preserve">Dado que el conjunto incorpora variables de historial, </w:t>
+        <w:t xml:space="preserve">Antes del modelado se realizó un análisis de valores atípicos sobre las variables numéricas mediante el criterio del </w:t>
       </w:r>
       <w:r>
         <w:rPr>
           <w:b/>
         </w:rPr>
-        <w:t>una partición aleatoria habría provocado fuga de información</w:t>
-      </w:r>
-      <w:r>
-        <w:t xml:space="preserve">: registros futuros de un equipo podrían quedar en el conjunto de entrenamiento y emplearse para predecir su propio pasado. Para evitarlo, se utilizó una </w:t>
-      </w:r>
+        <w:t>rango intercuartílico (IQR)</w:t>
+      </w:r>
+      <w:r>
+        <w:t>, que marca como atípico todo valor situado a más de 1,5·IQR por debajo del primer cuartil o por encima del tercero. La Figura 4 presenta los diagramas de caja de las principales variables operativas y la Tabla 2 resume la incidencia de atípicos por variable.</w:t>
+      </w:r>
+    </w:p>
+    <w:p>
+      <w:pPr>
+        <w:spacing w:after="20"/>
+      </w:pPr>
       <w:r>
         <w:rPr>
           <w:b/>
+          <w:sz w:val="19"/>
         </w:rPr>
-        <w:t>partición temporal</w:t>
-      </w:r>
-      <w:r>
-        <w:t>: se entrenó con las jornadas más antiguas (anteriores al 2015-02-26, 931 registros) y se evaluó con las más recientes (254 registros). Este esquema reproduce el escenario real de uso, en el que se predice el futuro a partir del pasado, y ofrece una estimación honesta del desempeño esperado en producción.</w:t>
+        <w:t>Tabla 2</w:t>
       </w:r>
     </w:p>
     <w:p>
       <w:pPr>
-        <w:pStyle w:val="Heading2"/>
+        <w:spacing w:after="60"/>
       </w:pPr>
       <w:r>
         <w:rPr>
-          <w:color w:val="2A5A9C"/>
+          <w:i/>
+          <w:sz w:val="19"/>
         </w:rPr>
-        <w:t>4.5 Modelado y selección de variables</w:t>
-      </w:r>
+        <w:t>Incidencia de valores atípicos por variable según el criterio IQR.</w:t>
+      </w:r>
+    </w:p>
+    <w:tbl>
+      <w:tblPr>
+        <w:tblStyle w:val="TableGrid"/>
+        <w:tblW w:type="auto" w:w="0"/>
+        <w:jc w:val="center"/>
+        <w:tblLook w:firstColumn="1" w:firstRow="1" w:lastColumn="0" w:lastRow="0" w:noHBand="0" w:noVBand="1" w:val="04A0"/>
+      </w:tblPr>
+      <w:tblGrid>
+        <w:gridCol w:w="3213"/>
+        <w:gridCol w:w="3213"/>
+        <w:gridCol w:w="3213"/>
+      </w:tblGrid>
+      <w:tr>
+        <w:tc>
+          <w:tcPr>
+            <w:tcW w:type="dxa" w:w="4535"/>
+            <w:shd w:val="clear" w:color="auto" w:fill="1A3D6D"/>
+          </w:tcPr>
+          <w:p>
+            <w:r/>
+            <w:r>
+              <w:rPr>
+                <w:b/>
+                <w:color w:val="FFFFFF"/>
+                <w:sz w:val="18"/>
+              </w:rPr>
+              <w:t>Variable</w:t>
+            </w:r>
+          </w:p>
+        </w:tc>
+        <w:tc>
+          <w:tcPr>
+            <w:tcW w:type="dxa" w:w="2551"/>
+            <w:shd w:val="clear" w:color="auto" w:fill="1A3D6D"/>
+          </w:tcPr>
+          <w:p>
+            <w:r/>
+            <w:r>
+              <w:rPr>
+                <w:b/>
+                <w:color w:val="FFFFFF"/>
+                <w:sz w:val="18"/>
+              </w:rPr>
+              <w:t>Atípicos (IQR)</w:t>
+            </w:r>
+          </w:p>
+        </w:tc>
+        <w:tc>
+          <w:tcPr>
+            <w:tcW w:type="dxa" w:w="2551"/>
+            <w:shd w:val="clear" w:color="auto" w:fill="1A3D6D"/>
+          </w:tcPr>
+          <w:p>
+            <w:r/>
+            <w:r>
+              <w:rPr>
+                <w:b/>
+                <w:color w:val="FFFFFF"/>
+                <w:sz w:val="18"/>
+              </w:rPr>
+              <w:t>% del total</w:t>
+            </w:r>
+          </w:p>
+        </w:tc>
+      </w:tr>
+      <w:tr>
+        <w:tc>
+          <w:tcPr>
+            <w:tcW w:type="dxa" w:w="4535"/>
+          </w:tcPr>
+          <w:p>
+            <w:r/>
+            <w:r>
+              <w:rPr>
+                <w:sz w:val="18"/>
+              </w:rPr>
+              <w:t>no_of_style_change</w:t>
+            </w:r>
+          </w:p>
+        </w:tc>
+        <w:tc>
+          <w:tcPr>
+            <w:tcW w:type="dxa" w:w="2551"/>
+          </w:tcPr>
+          <w:p>
+            <w:r/>
+            <w:r>
+              <w:rPr>
+                <w:sz w:val="18"/>
+              </w:rPr>
+              <w:t>147</w:t>
+            </w:r>
+          </w:p>
+        </w:tc>
+        <w:tc>
+          <w:tcPr>
+            <w:tcW w:type="dxa" w:w="2551"/>
+          </w:tcPr>
+          <w:p>
+            <w:r/>
+            <w:r>
+              <w:rPr>
+                <w:sz w:val="18"/>
+              </w:rPr>
+              <w:t>12.3%</w:t>
+            </w:r>
+          </w:p>
+        </w:tc>
+      </w:tr>
+      <w:tr>
+        <w:tc>
+          <w:tcPr>
+            <w:tcW w:type="dxa" w:w="4535"/>
+          </w:tcPr>
+          <w:p>
+            <w:r/>
+            <w:r>
+              <w:rPr>
+                <w:sz w:val="18"/>
+              </w:rPr>
+              <w:t>targeted_productivity</w:t>
+            </w:r>
+          </w:p>
+        </w:tc>
+        <w:tc>
+          <w:tcPr>
+            <w:tcW w:type="dxa" w:w="2551"/>
+          </w:tcPr>
+          <w:p>
+            <w:r/>
+            <w:r>
+              <w:rPr>
+                <w:sz w:val="18"/>
+              </w:rPr>
+              <w:t>79</w:t>
+            </w:r>
+          </w:p>
+        </w:tc>
+        <w:tc>
+          <w:tcPr>
+            <w:tcW w:type="dxa" w:w="2551"/>
+          </w:tcPr>
+          <w:p>
+            <w:r/>
+            <w:r>
+              <w:rPr>
+                <w:sz w:val="18"/>
+              </w:rPr>
+              <w:t>6.6%</w:t>
+            </w:r>
+          </w:p>
+        </w:tc>
+      </w:tr>
+      <w:tr>
+        <w:tc>
+          <w:tcPr>
+            <w:tcW w:type="dxa" w:w="4535"/>
+          </w:tcPr>
+          <w:p>
+            <w:r/>
+            <w:r>
+              <w:rPr>
+                <w:sz w:val="18"/>
+              </w:rPr>
+              <w:t>actual_productivity</w:t>
+            </w:r>
+          </w:p>
+        </w:tc>
+        <w:tc>
+          <w:tcPr>
+            <w:tcW w:type="dxa" w:w="2551"/>
+          </w:tcPr>
+          <w:p>
+            <w:r/>
+            <w:r>
+              <w:rPr>
+                <w:sz w:val="18"/>
+              </w:rPr>
+              <w:t>54</w:t>
+            </w:r>
+          </w:p>
+        </w:tc>
+        <w:tc>
+          <w:tcPr>
+            <w:tcW w:type="dxa" w:w="2551"/>
+          </w:tcPr>
+          <w:p>
+            <w:r/>
+            <w:r>
+              <w:rPr>
+                <w:sz w:val="18"/>
+              </w:rPr>
+              <w:t>4.5%</w:t>
+            </w:r>
+          </w:p>
+        </w:tc>
+      </w:tr>
+      <w:tr>
+        <w:tc>
+          <w:tcPr>
+            <w:tcW w:type="dxa" w:w="4535"/>
+          </w:tcPr>
+          <w:p>
+            <w:r/>
+            <w:r>
+              <w:rPr>
+                <w:sz w:val="18"/>
+              </w:rPr>
+              <w:t>idle_time</w:t>
+            </w:r>
+          </w:p>
+        </w:tc>
+        <w:tc>
+          <w:tcPr>
+            <w:tcW w:type="dxa" w:w="2551"/>
+          </w:tcPr>
+          <w:p>
+            <w:r/>
+            <w:r>
+              <w:rPr>
+                <w:sz w:val="18"/>
+              </w:rPr>
+              <w:t>18</w:t>
+            </w:r>
+          </w:p>
+        </w:tc>
+        <w:tc>
+          <w:tcPr>
+            <w:tcW w:type="dxa" w:w="2551"/>
+          </w:tcPr>
+          <w:p>
+            <w:r/>
+            <w:r>
+              <w:rPr>
+                <w:sz w:val="18"/>
+              </w:rPr>
+              <w:t>1.5%</w:t>
+            </w:r>
+          </w:p>
+        </w:tc>
+      </w:tr>
+      <w:tr>
+        <w:tc>
+          <w:tcPr>
+            <w:tcW w:type="dxa" w:w="4535"/>
+          </w:tcPr>
+          <w:p>
+            <w:r/>
+            <w:r>
+              <w:rPr>
+                <w:sz w:val="18"/>
+              </w:rPr>
+              <w:t>idle_men</w:t>
+            </w:r>
+          </w:p>
+        </w:tc>
+        <w:tc>
+          <w:tcPr>
+            <w:tcW w:type="dxa" w:w="2551"/>
+          </w:tcPr>
+          <w:p>
+            <w:r/>
+            <w:r>
+              <w:rPr>
+                <w:sz w:val="18"/>
+              </w:rPr>
+              <w:t>18</w:t>
+            </w:r>
+          </w:p>
+        </w:tc>
+        <w:tc>
+          <w:tcPr>
+            <w:tcW w:type="dxa" w:w="2551"/>
+          </w:tcPr>
+          <w:p>
+            <w:r/>
+            <w:r>
+              <w:rPr>
+                <w:sz w:val="18"/>
+              </w:rPr>
+              <w:t>1.5%</w:t>
+            </w:r>
+          </w:p>
+        </w:tc>
+      </w:tr>
+      <w:tr>
+        <w:tc>
+          <w:tcPr>
+            <w:tcW w:type="dxa" w:w="4535"/>
+          </w:tcPr>
+          <w:p>
+            <w:r/>
+            <w:r>
+              <w:rPr>
+                <w:sz w:val="18"/>
+              </w:rPr>
+              <w:t>incentive</w:t>
+            </w:r>
+          </w:p>
+        </w:tc>
+        <w:tc>
+          <w:tcPr>
+            <w:tcW w:type="dxa" w:w="2551"/>
+          </w:tcPr>
+          <w:p>
+            <w:r/>
+            <w:r>
+              <w:rPr>
+                <w:sz w:val="18"/>
+              </w:rPr>
+              <w:t>11</w:t>
+            </w:r>
+          </w:p>
+        </w:tc>
+        <w:tc>
+          <w:tcPr>
+            <w:tcW w:type="dxa" w:w="2551"/>
+          </w:tcPr>
+          <w:p>
+            <w:r/>
+            <w:r>
+              <w:rPr>
+                <w:sz w:val="18"/>
+              </w:rPr>
+              <w:t>0.9%</w:t>
+            </w:r>
+          </w:p>
+        </w:tc>
+      </w:tr>
+      <w:tr>
+        <w:tc>
+          <w:tcPr>
+            <w:tcW w:type="dxa" w:w="4535"/>
+          </w:tcPr>
+          <w:p>
+            <w:r/>
+            <w:r>
+              <w:rPr>
+                <w:sz w:val="18"/>
+              </w:rPr>
+              <w:t>wip</w:t>
+            </w:r>
+          </w:p>
+        </w:tc>
+        <w:tc>
+          <w:tcPr>
+            <w:tcW w:type="dxa" w:w="2551"/>
+          </w:tcPr>
+          <w:p>
+            <w:r/>
+            <w:r>
+              <w:rPr>
+                <w:sz w:val="18"/>
+              </w:rPr>
+              <w:t>9</w:t>
+            </w:r>
+          </w:p>
+        </w:tc>
+        <w:tc>
+          <w:tcPr>
+            <w:tcW w:type="dxa" w:w="2551"/>
+          </w:tcPr>
+          <w:p>
+            <w:r/>
+            <w:r>
+              <w:rPr>
+                <w:sz w:val="18"/>
+              </w:rPr>
+              <w:t>0.8%</w:t>
+            </w:r>
+          </w:p>
+        </w:tc>
+      </w:tr>
+      <w:tr>
+        <w:tc>
+          <w:tcPr>
+            <w:tcW w:type="dxa" w:w="4535"/>
+          </w:tcPr>
+          <w:p>
+            <w:r/>
+            <w:r>
+              <w:rPr>
+                <w:sz w:val="18"/>
+              </w:rPr>
+              <w:t>over_time</w:t>
+            </w:r>
+          </w:p>
+        </w:tc>
+        <w:tc>
+          <w:tcPr>
+            <w:tcW w:type="dxa" w:w="2551"/>
+          </w:tcPr>
+          <w:p>
+            <w:r/>
+            <w:r>
+              <w:rPr>
+                <w:sz w:val="18"/>
+              </w:rPr>
+              <w:t>1</w:t>
+            </w:r>
+          </w:p>
+        </w:tc>
+        <w:tc>
+          <w:tcPr>
+            <w:tcW w:type="dxa" w:w="2551"/>
+          </w:tcPr>
+          <w:p>
+            <w:r/>
+            <w:r>
+              <w:rPr>
+                <w:sz w:val="18"/>
+              </w:rPr>
+              <w:t>0.1%</w:t>
+            </w:r>
+          </w:p>
+        </w:tc>
+      </w:tr>
+      <w:tr>
+        <w:tc>
+          <w:tcPr>
+            <w:tcW w:type="dxa" w:w="4535"/>
+          </w:tcPr>
+          <w:p>
+            <w:r/>
+            <w:r>
+              <w:rPr>
+                <w:sz w:val="18"/>
+              </w:rPr>
+              <w:t>smv</w:t>
+            </w:r>
+          </w:p>
+        </w:tc>
+        <w:tc>
+          <w:tcPr>
+            <w:tcW w:type="dxa" w:w="2551"/>
+          </w:tcPr>
+          <w:p>
+            <w:r/>
+            <w:r>
+              <w:rPr>
+                <w:sz w:val="18"/>
+              </w:rPr>
+              <w:t>0</w:t>
+            </w:r>
+          </w:p>
+        </w:tc>
+        <w:tc>
+          <w:tcPr>
+            <w:tcW w:type="dxa" w:w="2551"/>
+          </w:tcPr>
+          <w:p>
+            <w:r/>
+            <w:r>
+              <w:rPr>
+                <w:sz w:val="18"/>
+              </w:rPr>
+              <w:t>0.0%</w:t>
+            </w:r>
+          </w:p>
+        </w:tc>
+      </w:tr>
+      <w:tr>
+        <w:tc>
+          <w:tcPr>
+            <w:tcW w:type="dxa" w:w="4535"/>
+          </w:tcPr>
+          <w:p>
+            <w:r/>
+            <w:r>
+              <w:rPr>
+                <w:sz w:val="18"/>
+              </w:rPr>
+              <w:t>no_of_workers</w:t>
+            </w:r>
+          </w:p>
+        </w:tc>
+        <w:tc>
+          <w:tcPr>
+            <w:tcW w:type="dxa" w:w="2551"/>
+          </w:tcPr>
+          <w:p>
+            <w:r/>
+            <w:r>
+              <w:rPr>
+                <w:sz w:val="18"/>
+              </w:rPr>
+              <w:t>0</w:t>
+            </w:r>
+          </w:p>
+        </w:tc>
+        <w:tc>
+          <w:tcPr>
+            <w:tcW w:type="dxa" w:w="2551"/>
+          </w:tcPr>
+          <w:p>
+            <w:r/>
+            <w:r>
+              <w:rPr>
+                <w:sz w:val="18"/>
+              </w:rPr>
+              <w:t>0.0%</w:t>
+            </w:r>
+          </w:p>
+        </w:tc>
+      </w:tr>
+    </w:tbl>
+    <w:p>
+      <w:pPr>
+        <w:spacing w:after="40"/>
+      </w:pPr>
     </w:p>
     <w:p>
       <w:pPr>
-        <w:spacing w:after="160" w:line="276" w:lineRule="auto"/>
-        <w:jc w:val="both"/>
-      </w:pPr>
-      <w:r>
-        <w:t>Sobre el Conjunto B se entrenaron y compararon los cinco modelos descritos en el marco conceptual: árbol de decisión, Random Forest (300 árboles), AdaBoost (200 estimadores), Naive Bayes gaussiano y SVM con kernel radial, esta última encapsulada en un flujo que estandariza previamente las variables. La estabilidad de cada modelo se verificó mediante validación cruzada estratificada de cinco pliegues sobre el conjunto de entrenamiento.</w:t>
-      </w:r>
-    </w:p>
-    <w:p>
-      <w:pPr>
-        <w:spacing w:after="160" w:line="276" w:lineRule="auto"/>
-        <w:jc w:val="both"/>
-      </w:pPr>
-      <w:r>
-        <w:t xml:space="preserve">Para la </w:t>
-      </w:r>
+        <w:spacing w:after="240"/>
+      </w:pPr>
       <w:r>
         <w:rPr>
-          <w:b/>
+          <w:i/>
+          <w:color w:val="555555"/>
+          <w:sz w:val="17"/>
         </w:rPr>
-        <w:t>selección de variables</w:t>
-      </w:r>
-      <w:r>
-        <w:t xml:space="preserve"> se empleó la importancia que el Random Forest asigna a cada predictor (Figura 4). El resultado más destacable es que la importancia se distribuye de forma relativamente equilibrada —ningún predictor domina en solitario— y que entre los más relevantes conviven variables operativas (incentive, smv, no_of_workers, over_time) con </w:t>
+        <w:t xml:space="preserve">Nota. </w:t>
       </w:r>
       <w:r>
         <w:rPr>
-          <w:b/>
+          <w:color w:val="555555"/>
+          <w:sz w:val="17"/>
         </w:rPr>
-        <w:t>dos de las variables temporales construidas en este trabajo</w:t>
-      </w:r>
-      <w:r>
-        <w:t>: la media móvil (prod_media_movil3) y el retardo (prod_lag1). Esto constituye evidencia directa a favor del eje del proyecto: el historial reciente del equipo aporta poder predictivo real.</w:t>
+        <w:t>Elaboración propia con base en los datos de Imran (2020).</w:t>
       </w:r>
     </w:p>
     <w:p>
@@ -2197,6 +2696,228 @@
           <w:i/>
           <w:sz w:val="19"/>
         </w:rPr>
+        <w:t>Diagramas de caja de las principales variables operativas para la detección de valores atípicos.</w:t>
+      </w:r>
+    </w:p>
+    <w:p>
+      <w:pPr>
+        <w:jc w:val="center"/>
+      </w:pPr>
+      <w:r>
+        <w:drawing>
+          <wp:inline xmlns:a="http://schemas.openxmlformats.org/drawingml/2006/main" xmlns:pic="http://schemas.openxmlformats.org/drawingml/2006/picture">
+            <wp:extent cx="6120000" cy="2839502"/>
+            <wp:docPr id="4" name="Picture 4"/>
+            <wp:cNvGraphicFramePr>
+              <a:graphicFrameLocks noChangeAspect="1"/>
+            </wp:cNvGraphicFramePr>
+            <a:graphic>
+              <a:graphicData uri="http://schemas.openxmlformats.org/drawingml/2006/picture">
+                <pic:pic>
+                  <pic:nvPicPr>
+                    <pic:cNvPr id="0" name="fig_outliers.png"/>
+                    <pic:cNvPicPr/>
+                  </pic:nvPicPr>
+                  <pic:blipFill>
+                    <a:blip r:embed="rId12"/>
+                    <a:stretch>
+                      <a:fillRect/>
+                    </a:stretch>
+                  </pic:blipFill>
+                  <pic:spPr>
+                    <a:xfrm>
+                      <a:off x="0" y="0"/>
+                      <a:ext cx="6120000" cy="2839502"/>
+                    </a:xfrm>
+                    <a:prstGeom prst="rect"/>
+                  </pic:spPr>
+                </pic:pic>
+              </a:graphicData>
+            </a:graphic>
+          </wp:inline>
+        </w:drawing>
+      </w:r>
+    </w:p>
+    <w:p>
+      <w:pPr>
+        <w:spacing w:after="240"/>
+      </w:pPr>
+      <w:r>
+        <w:rPr>
+          <w:i/>
+          <w:color w:val="555555"/>
+          <w:sz w:val="17"/>
+        </w:rPr>
+        <w:t xml:space="preserve">Nota. </w:t>
+      </w:r>
+      <w:r>
+        <w:rPr>
+          <w:color w:val="555555"/>
+          <w:sz w:val="17"/>
+        </w:rPr>
+        <w:t>Elaboración propia con base en los datos de Imran (2020), procesados mediante scikit-learn (Pedregosa et al., 2011).</w:t>
+      </w:r>
+    </w:p>
+    <w:p>
+      <w:pPr>
+        <w:spacing w:after="160" w:line="276" w:lineRule="auto"/>
+        <w:jc w:val="both"/>
+      </w:pPr>
+      <w:r>
+        <w:t xml:space="preserve">El análisis arrojó tres hallazgos. Primero, algunas variables presentan valores extremos aislados pero </w:t>
+      </w:r>
+      <w:r>
+        <w:rPr>
+          <w:b/>
+        </w:rPr>
+        <w:t>operativamente legítimos</w:t>
+      </w:r>
+      <w:r>
+        <w:t xml:space="preserve">: wip alcanza un máximo de 23.122 unidades, over_time de 25.920 minutos e incentive de 3.600, cifras plausibles en jornadas de equipos grandes o con lotes voluminosos, y no errores de registro. Segundo, buena parte de los «atípicos» detectados por el IQR son en realidad </w:t>
+      </w:r>
+      <w:r>
+        <w:rPr>
+          <w:b/>
+        </w:rPr>
+        <w:t>artefactos de variables discretas o dispersas</w:t>
+      </w:r>
+      <w:r>
+        <w:t>: no_of_style_change se marca en un 12,3% de los casos simplemente porque su valor habitual es 0 y cualquier cambio (1 o 2) queda fuera del rango; algo análogo ocurre con idle_time e idle_men, nulos salvo en incidencias puntuales. Tercero, la variable actual_productivity registra algunos valores levemente superiores a 1 (máximo 1.12), correspondientes a jornadas de sobrecumplimiento, que no constituyen un error.</w:t>
+      </w:r>
+    </w:p>
+    <w:p>
+      <w:pPr>
+        <w:spacing w:after="160" w:line="276" w:lineRule="auto"/>
+        <w:jc w:val="both"/>
+      </w:pPr>
+      <w:r>
+        <w:t xml:space="preserve">En consecuencia, la estrategia adoptada fue la </w:t>
+      </w:r>
+      <w:r>
+        <w:rPr>
+          <w:b/>
+        </w:rPr>
+        <w:t>conservación justificada de los valores atípicos</w:t>
+      </w:r>
+      <w:r>
+        <w:t xml:space="preserve">, sin recorte ni winsorización, por tres razones: (i) los extremos representan eventos reales del proceso productivo —precisamente los equipos excepcionales o en dificultades que interesa predecir—, de modo que eliminarlos descartaría señal valiosa; (ii) el modelo finalmente seleccionado, el Random Forest, se basa en árboles de decisión que dividen por umbrales y son </w:t>
+      </w:r>
+      <w:r>
+        <w:rPr>
+          <w:b/>
+        </w:rPr>
+        <w:t>intrínsecamente robustos a los valores atípicos</w:t>
+      </w:r>
+      <w:r>
+        <w:t>, que no distorsionan sus particiones; y (iii) para la SVM, sensible a la escala, el efecto de los extremos se neutralizó con la estandarización (StandardScaler) incluida en su flujo. El único ajuste de calidad aplicado sobre los datos crudos fue la imputación de los nulos de wip descrita en la sección anterior.</w:t>
+      </w:r>
+    </w:p>
+    <w:p>
+      <w:pPr>
+        <w:pStyle w:val="Heading2"/>
+      </w:pPr>
+      <w:r>
+        <w:rPr>
+          <w:color w:val="2A5A9C"/>
+        </w:rPr>
+        <w:t>4.5 Partición temporal y control de la fuga de información</w:t>
+      </w:r>
+    </w:p>
+    <w:p>
+      <w:pPr>
+        <w:spacing w:after="160" w:line="276" w:lineRule="auto"/>
+        <w:jc w:val="both"/>
+      </w:pPr>
+      <w:r>
+        <w:t xml:space="preserve">Dado que el conjunto incorpora variables de historial, </w:t>
+      </w:r>
+      <w:r>
+        <w:rPr>
+          <w:b/>
+        </w:rPr>
+        <w:t>una partición aleatoria habría provocado fuga de información</w:t>
+      </w:r>
+      <w:r>
+        <w:t xml:space="preserve">: registros futuros de un equipo podrían quedar en el conjunto de entrenamiento y emplearse para predecir su propio pasado. Para evitarlo, se utilizó una </w:t>
+      </w:r>
+      <w:r>
+        <w:rPr>
+          <w:b/>
+        </w:rPr>
+        <w:t>partición temporal</w:t>
+      </w:r>
+      <w:r>
+        <w:t>: se entrenó con las jornadas más antiguas (anteriores al 2015-02-26, 931 registros) y se evaluó con las más recientes (254 registros). Este esquema reproduce el escenario real de uso, en el que se predice el futuro a partir del pasado, y ofrece una estimación honesta del desempeño esperado en producción.</w:t>
+      </w:r>
+    </w:p>
+    <w:p>
+      <w:pPr>
+        <w:pStyle w:val="Heading2"/>
+      </w:pPr>
+      <w:r>
+        <w:rPr>
+          <w:color w:val="2A5A9C"/>
+        </w:rPr>
+        <w:t>4.6 Modelado y selección de variables</w:t>
+      </w:r>
+    </w:p>
+    <w:p>
+      <w:pPr>
+        <w:spacing w:after="160" w:line="276" w:lineRule="auto"/>
+        <w:jc w:val="both"/>
+      </w:pPr>
+      <w:r>
+        <w:t>Sobre el Conjunto B se entrenaron y compararon los cinco modelos descritos en el marco conceptual: árbol de decisión, Random Forest (300 árboles), AdaBoost (200 estimadores), Naive Bayes gaussiano y SVM con kernel radial, esta última encapsulada en un flujo que estandariza previamente las variables. La estabilidad de cada modelo se verificó mediante validación cruzada estratificada de cinco pliegues sobre el conjunto de entrenamiento.</w:t>
+      </w:r>
+    </w:p>
+    <w:p>
+      <w:pPr>
+        <w:spacing w:after="160" w:line="276" w:lineRule="auto"/>
+        <w:jc w:val="both"/>
+      </w:pPr>
+      <w:r>
+        <w:t xml:space="preserve">Para la </w:t>
+      </w:r>
+      <w:r>
+        <w:rPr>
+          <w:b/>
+        </w:rPr>
+        <w:t>selección de variables</w:t>
+      </w:r>
+      <w:r>
+        <w:t xml:space="preserve"> se empleó la importancia que el Random Forest asigna a cada predictor (Figura 5). El resultado más destacable es que la importancia se distribuye de forma relativamente equilibrada —ningún predictor domina en solitario— y que entre los más relevantes conviven variables operativas (incentive, smv, no_of_workers, over_time) con </w:t>
+      </w:r>
+      <w:r>
+        <w:rPr>
+          <w:b/>
+        </w:rPr>
+        <w:t>dos de las variables temporales construidas en este trabajo</w:t>
+      </w:r>
+      <w:r>
+        <w:t>: la media móvil (prod_media_movil3) y el retardo (prod_lag1). Esto constituye evidencia directa a favor del eje del proyecto: el historial reciente del equipo aporta poder predictivo real.</w:t>
+      </w:r>
+    </w:p>
+    <w:p>
+      <w:pPr>
+        <w:spacing w:after="20"/>
+      </w:pPr>
+      <w:r>
+        <w:rPr>
+          <w:b/>
+          <w:sz w:val="19"/>
+        </w:rPr>
+        <w:t>Figura 5</w:t>
+      </w:r>
+    </w:p>
+    <w:p>
+      <w:pPr>
+        <w:spacing w:after="40"/>
+      </w:pPr>
+      <w:r>
+        <w:rPr>
+          <w:i/>
+          <w:sz w:val="19"/>
+        </w:rPr>
         <w:t>Importancia de variables según Random Forest sobre el Conjunto B (sin productividad objetivo).</w:t>
       </w:r>
     </w:p>
@@ -2208,7 +2929,7 @@
         <w:drawing>
           <wp:inline xmlns:a="http://schemas.openxmlformats.org/drawingml/2006/main" xmlns:pic="http://schemas.openxmlformats.org/drawingml/2006/picture">
             <wp:extent cx="6120000" cy="4564475"/>
-            <wp:docPr id="4" name="Picture 4"/>
+            <wp:docPr id="5" name="Picture 5"/>
             <wp:cNvGraphicFramePr>
               <a:graphicFrameLocks noChangeAspect="1"/>
             </wp:cNvGraphicFramePr>
@@ -2220,7 +2941,7 @@
                     <pic:cNvPicPr/>
                   </pic:nvPicPr>
                   <pic:blipFill>
-                    <a:blip r:embed="rId12"/>
+                    <a:blip r:embed="rId13"/>
                     <a:stretch>
                       <a:fillRect/>
                     </a:stretch>
@@ -2276,7 +2997,7 @@
         <w:jc w:val="both"/>
       </w:pPr>
       <w:r>
-        <w:t xml:space="preserve">La Tabla 2 y la Figura 5 sintetizan el accuracy de cada modelo sobre el conjunto de prueba temporal. El mejor desempeño correspondió al </w:t>
+        <w:t xml:space="preserve">La Tabla 3 y la Figura 6 sintetizan el accuracy de cada modelo sobre el conjunto de prueba temporal. El mejor desempeño correspondió al </w:t>
       </w:r>
       <w:r>
         <w:rPr>
@@ -2297,7 +3018,7 @@
           <w:b/>
           <w:sz w:val="19"/>
         </w:rPr>
-        <w:t>Tabla 2</w:t>
+        <w:t>Tabla 3</w:t>
       </w:r>
     </w:p>
     <w:p>
@@ -2632,7 +3353,7 @@
           <w:b/>
           <w:sz w:val="19"/>
         </w:rPr>
-        <w:t>Figura 5</w:t>
+        <w:t>Figura 6</w:t>
       </w:r>
     </w:p>
     <w:p>
@@ -2655,7 +3376,7 @@
         <w:drawing>
           <wp:inline xmlns:a="http://schemas.openxmlformats.org/drawingml/2006/main" xmlns:pic="http://schemas.openxmlformats.org/drawingml/2006/picture">
             <wp:extent cx="6120000" cy="3355614"/>
-            <wp:docPr id="5" name="Picture 5"/>
+            <wp:docPr id="6" name="Picture 6"/>
             <wp:cNvGraphicFramePr>
               <a:graphicFrameLocks noChangeAspect="1"/>
             </wp:cNvGraphicFramePr>
@@ -2667,7 +3388,7 @@
                     <pic:cNvPicPr/>
                   </pic:nvPicPr>
                   <pic:blipFill>
-                    <a:blip r:embed="rId13"/>
+                    <a:blip r:embed="rId14"/>
                     <a:stretch>
                       <a:fillRect/>
                     </a:stretch>
@@ -2712,7 +3433,7 @@
         <w:jc w:val="both"/>
       </w:pPr>
       <w:r>
-        <w:t>La Figura 5 evidencia con claridad la jerarquía entre familias de modelos: los métodos de ensemble (Random Forest y AdaBoost) y la SVM se ubican por sobre los modelos individuales más simples. La superioridad del Random Forest es consistente con la naturaleza del problema, en el que múltiples variables interactúan de manera no lineal y ningún predictor resulta dominante, condiciones en las que la combinación de muchos árboles reduce la varianza y mejora la generalización.</w:t>
+        <w:t>La Figura 6 evidencia con claridad la jerarquía entre familias de modelos: los métodos de ensemble (Random Forest y AdaBoost) y la SVM se ubican por sobre los modelos individuales más simples. La superioridad del Random Forest es consistente con la naturaleza del problema, en el que múltiples variables interactúan de manera no lineal y ningún predictor resulta dominante, condiciones en las que la combinación de muchos árboles reduce la varianza y mejora la generalización.</w:t>
       </w:r>
     </w:p>
     <w:p>
@@ -2732,7 +3453,7 @@
         <w:jc w:val="both"/>
       </w:pPr>
       <w:r>
-        <w:t xml:space="preserve">Las matrices de confusión (Figura 6) permiten ir más allá del accuracy y observar </w:t>
+        <w:t xml:space="preserve">Las matrices de confusión (Figura 7) permiten ir más allá del accuracy y observar </w:t>
       </w:r>
       <w:r>
         <w:rPr>
@@ -2762,7 +3483,7 @@
           <w:b/>
           <w:sz w:val="19"/>
         </w:rPr>
-        <w:t>Figura 6</w:t>
+        <w:t>Figura 7</w:t>
       </w:r>
     </w:p>
     <w:p>
@@ -2785,7 +3506,7 @@
         <w:drawing>
           <wp:inline xmlns:a="http://schemas.openxmlformats.org/drawingml/2006/main" xmlns:pic="http://schemas.openxmlformats.org/drawingml/2006/picture">
             <wp:extent cx="6120000" cy="3682889"/>
-            <wp:docPr id="6" name="Picture 6"/>
+            <wp:docPr id="7" name="Picture 7"/>
             <wp:cNvGraphicFramePr>
               <a:graphicFrameLocks noChangeAspect="1"/>
             </wp:cNvGraphicFramePr>
@@ -2797,7 +3518,7 @@
                     <pic:cNvPicPr/>
                   </pic:nvPicPr>
                   <pic:blipFill>
-                    <a:blip r:embed="rId14"/>
+                    <a:blip r:embed="rId15"/>
                     <a:stretch>
                       <a:fillRect/>
                     </a:stretch>
@@ -2891,7 +3612,7 @@
         <w:jc w:val="both"/>
       </w:pPr>
       <w:r>
-        <w:t xml:space="preserve">Como análisis complementario se aplicó una reducción de dimensionalidad mediante Análisis de Componentes Principales (PCA) y un agrupamiento no supervisado con K-Means (Figura 7). Las dos primeras componentes principales explican únicamente el 18.8% de la varianza total, porcentaje bajo que se explica por la alta dimensionalidad introducida por la codificación one-hot. En la proyección, las clases «cumple» y «no cumple» aparecen considerablemente </w:t>
+        <w:t xml:space="preserve">Como análisis complementario se aplicó una reducción de dimensionalidad mediante Análisis de Componentes Principales (PCA) y un agrupamiento no supervisado con K-Means (Figura 8). Las dos primeras componentes principales explican únicamente el 18.8% de la varianza total, porcentaje bajo que se explica por la alta dimensionalidad introducida por la codificación one-hot. En la proyección, las clases «cumple» y «no cumple» aparecen considerablemente </w:t>
       </w:r>
       <w:r>
         <w:rPr>
@@ -2921,7 +3642,7 @@
           <w:b/>
           <w:sz w:val="19"/>
         </w:rPr>
-        <w:t>Figura 7</w:t>
+        <w:t>Figura 8</w:t>
       </w:r>
     </w:p>
     <w:p>
@@ -2944,7 +3665,7 @@
         <w:drawing>
           <wp:inline xmlns:a="http://schemas.openxmlformats.org/drawingml/2006/main" xmlns:pic="http://schemas.openxmlformats.org/drawingml/2006/picture">
             <wp:extent cx="6120000" cy="2033544"/>
-            <wp:docPr id="7" name="Picture 7"/>
+            <wp:docPr id="8" name="Picture 8"/>
             <wp:cNvGraphicFramePr>
               <a:graphicFrameLocks noChangeAspect="1"/>
             </wp:cNvGraphicFramePr>
@@ -2956,7 +3677,7 @@
                     <pic:cNvPicPr/>
                   </pic:nvPicPr>
                   <pic:blipFill>
-                    <a:blip r:embed="rId15"/>
+                    <a:blip r:embed="rId16"/>
                     <a:stretch>
                       <a:fillRect/>
                     </a:stretch>

</xml_diff>

<commit_message>
Corrige tablas del informe y agrega índice (PDF y DOCX)
- PDF: las celdas de tabla ahora se renderizan como Paragraph, evitando
  que aparezcan entidades HTML literales (Num&eacute;rica, etc.).
- Corrige «Árbol de Decisión» (faltaba la tilde) en la Tabla 3.
- Agrega índice: TOC de dos pasadas en el PDF y campo TOC actualizable
  en el DOCX (con updateFields al abrir en Word).

Co-Authored-By: Claude Opus 4.8 <noreply@anthropic.com>
</commit_message>
<xml_diff>
--- a/proyecto-productividad-textil/Informe_Productividad_Textil.docx
+++ b/proyecto-productividad-textil/Informe_Productividad_Textil.docx
@@ -96,7 +96,34 @@
     </w:p>
     <w:p>
       <w:r>
-        <w:br/>
+        <w:br w:type="page"/>
+      </w:r>
+    </w:p>
+    <w:p>
+      <w:pPr>
+        <w:spacing w:after="200"/>
+      </w:pPr>
+      <w:r>
+        <w:rPr>
+          <w:b/>
+          <w:color w:val="1A3D6D"/>
+          <w:sz w:val="28"/>
+        </w:rPr>
+        <w:t>Índice</w:t>
+      </w:r>
+    </w:p>
+    <w:p>
+      <w:r>
+        <w:fldChar w:fldCharType="begin"/>
+        <w:instrText xml:space="preserve">TOC \o "1-3" \h \z \u</w:instrText>
+        <w:fldChar w:fldCharType="separate"/>
+        <w:t>Clic derecho aquí → «Actualizar campos» (o F9) para generar el índice.</w:t>
+        <w:fldChar w:fldCharType="end"/>
+      </w:r>
+    </w:p>
+    <w:p>
+      <w:r>
+        <w:br w:type="page"/>
       </w:r>
     </w:p>
     <w:p>
@@ -3285,7 +3312,7 @@
               <w:rPr>
                 <w:sz w:val="18"/>
               </w:rPr>
-              <w:t>Árbol de Decision</w:t>
+              <w:t>Árbol de Decisión</w:t>
             </w:r>
           </w:p>
         </w:tc>

</xml_diff>

<commit_message>
Desarrolla y valida las recomendaciones (features, walk-forward, boosting, desbalance)
- Nueva sección 7 «Desarrollo y validación de las recomendaciones» en el
  informe (PDF y DOCX): features enriquecidas, validación walk-forward
  (TimeSeriesSplit), métricas robustas (F1 y PR-AUC de «no cumple») y
  comparación con boosting (XGBoost/LightGBM/HistGB) y SMOTE.
- Renumera Conclusiones (8) y Trabajo futuro (9); agrega Tabla 4 y Figura 9.
- Notebook: nueva sección 15 que implementa y mide todo lo anterior.

Hallazgos: walk-forward ~0.80 (más honesto que el corte único 0.87); las
features enriquecidas son la mejor palanca; el boosting no supera al RF con
este tamaño de datos; SMOTE/balance suben el F1 de «no cumple» a costa del
accuracy (confirma medir con métrica robusta).

Co-Authored-By: Claude Opus 4.8 <noreply@anthropic.com>
</commit_message>
<xml_diff>
--- a/proyecto-productividad-textil/Informe_Productividad_Textil.docx
+++ b/proyecto-productividad-textil/Informe_Productividad_Textil.docx
@@ -3825,7 +3825,802 @@
         <w:rPr>
           <w:color w:val="1A3D6D"/>
         </w:rPr>
-        <w:t>7. Conclusiones</w:t>
+        <w:t>7. Desarrollo y validación de las recomendaciones</w:t>
+      </w:r>
+    </w:p>
+    <w:p>
+      <w:pPr>
+        <w:spacing w:after="160" w:line="276" w:lineRule="auto"/>
+        <w:jc w:val="both"/>
+      </w:pPr>
+      <w:r>
+        <w:t>Con el fin de validar empíricamente las líneas de mejora propuestas (Sección 9) e ilustrar las dos advertencias metodológicas sobre la medición y la validación, se desarrollaron y evaluaron las principales recomendaciones bajo un protocolo más estricto que el de la Sección 5.</w:t>
+      </w:r>
+    </w:p>
+    <w:p>
+      <w:pPr>
+        <w:spacing w:after="160" w:line="276" w:lineRule="auto"/>
+        <w:jc w:val="both"/>
+      </w:pPr>
+      <w:r>
+        <w:t xml:space="preserve">Los cambios aplicados fueron: (i) </w:t>
+      </w:r>
+      <w:r>
+        <w:rPr>
+          <w:b/>
+        </w:rPr>
+        <w:t>ingeniería de variables enriquecida</w:t>
+      </w:r>
+      <w:r>
+        <w:t xml:space="preserve">, añadiendo retardos y medias móviles adicionales (retardo de dos jornadas, media móvil de cinco, delta respecto a la media reciente) y el historial de incentive y over_time, pasando de 33 a 40 variables; (ii) </w:t>
+      </w:r>
+      <w:r>
+        <w:rPr>
+          <w:b/>
+        </w:rPr>
+        <w:t>validación walk-forward</w:t>
+      </w:r>
+      <w:r>
+        <w:t xml:space="preserve"> (TimeSeriesSplit de cinco particiones), que entrena y evalúa avanzando en el tiempo en lugar de un único corte; (iii) </w:t>
+      </w:r>
+      <w:r>
+        <w:rPr>
+          <w:b/>
+        </w:rPr>
+        <w:t>métricas robustas</w:t>
+      </w:r>
+      <w:r>
+        <w:t xml:space="preserve">, reportando —además del accuracy— el F1 y el PR-AUC de la clase «no cumple» (la minoritaria y de mayor interés operativo); y (iv) </w:t>
+      </w:r>
+      <w:r>
+        <w:rPr>
+          <w:b/>
+        </w:rPr>
+        <w:t>modelos adicionales</w:t>
+      </w:r>
+      <w:r>
+        <w:t>: gradient boosting (HistGradientBoosting, XGBoost, LightGBM) y manejo del desbalance (ponderación de clases y sobremuestreo SMOTE). La Tabla 4 y la Figura 9 resumen los resultados.</w:t>
+      </w:r>
+    </w:p>
+    <w:p>
+      <w:pPr>
+        <w:spacing w:after="20"/>
+      </w:pPr>
+      <w:r>
+        <w:rPr>
+          <w:b/>
+          <w:sz w:val="19"/>
+        </w:rPr>
+        <w:t>Tabla 4</w:t>
+      </w:r>
+    </w:p>
+    <w:p>
+      <w:pPr>
+        <w:spacing w:after="60"/>
+      </w:pPr>
+      <w:r>
+        <w:rPr>
+          <w:i/>
+          <w:sz w:val="19"/>
+        </w:rPr>
+        <w:t>Comparación de modelos bajo validación walk-forward y métricas robustas.</w:t>
+      </w:r>
+    </w:p>
+    <w:tbl>
+      <w:tblPr>
+        <w:tblStyle w:val="TableGrid"/>
+        <w:tblW w:type="auto" w:w="0"/>
+        <w:jc w:val="center"/>
+        <w:tblLook w:firstColumn="1" w:firstRow="1" w:lastColumn="0" w:lastRow="0" w:noHBand="0" w:noVBand="1" w:val="04A0"/>
+      </w:tblPr>
+      <w:tblGrid>
+        <w:gridCol w:w="2409"/>
+        <w:gridCol w:w="2409"/>
+        <w:gridCol w:w="2409"/>
+        <w:gridCol w:w="2409"/>
+      </w:tblGrid>
+      <w:tr>
+        <w:tc>
+          <w:tcPr>
+            <w:tcW w:type="dxa" w:w="3685"/>
+            <w:shd w:val="clear" w:color="auto" w:fill="1A3D6D"/>
+          </w:tcPr>
+          <w:p>
+            <w:r/>
+            <w:r>
+              <w:rPr>
+                <w:b/>
+                <w:color w:val="FFFFFF"/>
+                <w:sz w:val="18"/>
+              </w:rPr>
+              <w:t>Modelo</w:t>
+            </w:r>
+          </w:p>
+        </w:tc>
+        <w:tc>
+          <w:tcPr>
+            <w:tcW w:type="dxa" w:w="1701"/>
+            <w:shd w:val="clear" w:color="auto" w:fill="1A3D6D"/>
+          </w:tcPr>
+          <w:p>
+            <w:r/>
+            <w:r>
+              <w:rPr>
+                <w:b/>
+                <w:color w:val="FFFFFF"/>
+                <w:sz w:val="18"/>
+              </w:rPr>
+              <w:t>Accuracy</w:t>
+            </w:r>
+          </w:p>
+        </w:tc>
+        <w:tc>
+          <w:tcPr>
+            <w:tcW w:type="dxa" w:w="1701"/>
+            <w:shd w:val="clear" w:color="auto" w:fill="1A3D6D"/>
+          </w:tcPr>
+          <w:p>
+            <w:r/>
+            <w:r>
+              <w:rPr>
+                <w:b/>
+                <w:color w:val="FFFFFF"/>
+                <w:sz w:val="18"/>
+              </w:rPr>
+              <w:t>F1 «no cumple»</w:t>
+            </w:r>
+          </w:p>
+        </w:tc>
+        <w:tc>
+          <w:tcPr>
+            <w:tcW w:type="dxa" w:w="1984"/>
+            <w:shd w:val="clear" w:color="auto" w:fill="1A3D6D"/>
+          </w:tcPr>
+          <w:p>
+            <w:r/>
+            <w:r>
+              <w:rPr>
+                <w:b/>
+                <w:color w:val="FFFFFF"/>
+                <w:sz w:val="18"/>
+              </w:rPr>
+              <w:t>PR-AUC «no cumple»</w:t>
+            </w:r>
+          </w:p>
+        </w:tc>
+      </w:tr>
+      <w:tr>
+        <w:tc>
+          <w:tcPr>
+            <w:tcW w:type="dxa" w:w="3685"/>
+          </w:tcPr>
+          <w:p>
+            <w:r/>
+            <w:r>
+              <w:rPr>
+                <w:sz w:val="18"/>
+              </w:rPr>
+              <w:t>RF (base, proyecto actual)</w:t>
+            </w:r>
+          </w:p>
+        </w:tc>
+        <w:tc>
+          <w:tcPr>
+            <w:tcW w:type="dxa" w:w="1701"/>
+          </w:tcPr>
+          <w:p>
+            <w:r/>
+            <w:r>
+              <w:rPr>
+                <w:sz w:val="18"/>
+              </w:rPr>
+              <w:t>0.794</w:t>
+            </w:r>
+          </w:p>
+        </w:tc>
+        <w:tc>
+          <w:tcPr>
+            <w:tcW w:type="dxa" w:w="1701"/>
+          </w:tcPr>
+          <w:p>
+            <w:r/>
+            <w:r>
+              <w:rPr>
+                <w:sz w:val="18"/>
+              </w:rPr>
+              <w:t>0.599</w:t>
+            </w:r>
+          </w:p>
+        </w:tc>
+        <w:tc>
+          <w:tcPr>
+            <w:tcW w:type="dxa" w:w="1984"/>
+          </w:tcPr>
+          <w:p>
+            <w:r/>
+            <w:r>
+              <w:rPr>
+                <w:sz w:val="18"/>
+              </w:rPr>
+              <w:t>0.669</w:t>
+            </w:r>
+          </w:p>
+        </w:tc>
+      </w:tr>
+      <w:tr>
+        <w:tc>
+          <w:tcPr>
+            <w:tcW w:type="dxa" w:w="3685"/>
+          </w:tcPr>
+          <w:p>
+            <w:r/>
+            <w:r>
+              <w:rPr>
+                <w:sz w:val="18"/>
+              </w:rPr>
+              <w:t>RF (features enriquecidas)</w:t>
+            </w:r>
+          </w:p>
+        </w:tc>
+        <w:tc>
+          <w:tcPr>
+            <w:tcW w:type="dxa" w:w="1701"/>
+          </w:tcPr>
+          <w:p>
+            <w:r/>
+            <w:r>
+              <w:rPr>
+                <w:sz w:val="18"/>
+              </w:rPr>
+              <w:t>0.808</w:t>
+            </w:r>
+          </w:p>
+        </w:tc>
+        <w:tc>
+          <w:tcPr>
+            <w:tcW w:type="dxa" w:w="1701"/>
+          </w:tcPr>
+          <w:p>
+            <w:r/>
+            <w:r>
+              <w:rPr>
+                <w:sz w:val="18"/>
+              </w:rPr>
+              <w:t>0.599</w:t>
+            </w:r>
+          </w:p>
+        </w:tc>
+        <w:tc>
+          <w:tcPr>
+            <w:tcW w:type="dxa" w:w="1984"/>
+          </w:tcPr>
+          <w:p>
+            <w:r/>
+            <w:r>
+              <w:rPr>
+                <w:sz w:val="18"/>
+              </w:rPr>
+              <w:t>0.670</w:t>
+            </w:r>
+          </w:p>
+        </w:tc>
+      </w:tr>
+      <w:tr>
+        <w:tc>
+          <w:tcPr>
+            <w:tcW w:type="dxa" w:w="3685"/>
+          </w:tcPr>
+          <w:p>
+            <w:r/>
+            <w:r>
+              <w:rPr>
+                <w:sz w:val="18"/>
+              </w:rPr>
+              <w:t>RF + balance de clases</w:t>
+            </w:r>
+          </w:p>
+        </w:tc>
+        <w:tc>
+          <w:tcPr>
+            <w:tcW w:type="dxa" w:w="1701"/>
+          </w:tcPr>
+          <w:p>
+            <w:r/>
+            <w:r>
+              <w:rPr>
+                <w:sz w:val="18"/>
+              </w:rPr>
+              <w:t>0.796</w:t>
+            </w:r>
+          </w:p>
+        </w:tc>
+        <w:tc>
+          <w:tcPr>
+            <w:tcW w:type="dxa" w:w="1701"/>
+          </w:tcPr>
+          <w:p>
+            <w:r/>
+            <w:r>
+              <w:rPr>
+                <w:sz w:val="18"/>
+              </w:rPr>
+              <w:t>0.521</w:t>
+            </w:r>
+          </w:p>
+        </w:tc>
+        <w:tc>
+          <w:tcPr>
+            <w:tcW w:type="dxa" w:w="1984"/>
+          </w:tcPr>
+          <w:p>
+            <w:r/>
+            <w:r>
+              <w:rPr>
+                <w:sz w:val="18"/>
+              </w:rPr>
+              <w:t>0.676</w:t>
+            </w:r>
+          </w:p>
+        </w:tc>
+      </w:tr>
+      <w:tr>
+        <w:tc>
+          <w:tcPr>
+            <w:tcW w:type="dxa" w:w="3685"/>
+          </w:tcPr>
+          <w:p>
+            <w:r/>
+            <w:r>
+              <w:rPr>
+                <w:sz w:val="18"/>
+              </w:rPr>
+              <w:t>HistGradientBoosting</w:t>
+            </w:r>
+          </w:p>
+        </w:tc>
+        <w:tc>
+          <w:tcPr>
+            <w:tcW w:type="dxa" w:w="1701"/>
+          </w:tcPr>
+          <w:p>
+            <w:r/>
+            <w:r>
+              <w:rPr>
+                <w:sz w:val="18"/>
+              </w:rPr>
+              <w:t>0.780</w:t>
+            </w:r>
+          </w:p>
+        </w:tc>
+        <w:tc>
+          <w:tcPr>
+            <w:tcW w:type="dxa" w:w="1701"/>
+          </w:tcPr>
+          <w:p>
+            <w:r/>
+            <w:r>
+              <w:rPr>
+                <w:sz w:val="18"/>
+              </w:rPr>
+              <w:t>0.583</w:t>
+            </w:r>
+          </w:p>
+        </w:tc>
+        <w:tc>
+          <w:tcPr>
+            <w:tcW w:type="dxa" w:w="1984"/>
+          </w:tcPr>
+          <w:p>
+            <w:r/>
+            <w:r>
+              <w:rPr>
+                <w:sz w:val="18"/>
+              </w:rPr>
+              <w:t>0.625</w:t>
+            </w:r>
+          </w:p>
+        </w:tc>
+      </w:tr>
+      <w:tr>
+        <w:tc>
+          <w:tcPr>
+            <w:tcW w:type="dxa" w:w="3685"/>
+          </w:tcPr>
+          <w:p>
+            <w:r/>
+            <w:r>
+              <w:rPr>
+                <w:sz w:val="18"/>
+              </w:rPr>
+              <w:t>XGBoost</w:t>
+            </w:r>
+          </w:p>
+        </w:tc>
+        <w:tc>
+          <w:tcPr>
+            <w:tcW w:type="dxa" w:w="1701"/>
+          </w:tcPr>
+          <w:p>
+            <w:r/>
+            <w:r>
+              <w:rPr>
+                <w:sz w:val="18"/>
+              </w:rPr>
+              <w:t>0.782</w:t>
+            </w:r>
+          </w:p>
+        </w:tc>
+        <w:tc>
+          <w:tcPr>
+            <w:tcW w:type="dxa" w:w="1701"/>
+          </w:tcPr>
+          <w:p>
+            <w:r/>
+            <w:r>
+              <w:rPr>
+                <w:sz w:val="18"/>
+              </w:rPr>
+              <w:t>0.586</w:t>
+            </w:r>
+          </w:p>
+        </w:tc>
+        <w:tc>
+          <w:tcPr>
+            <w:tcW w:type="dxa" w:w="1984"/>
+          </w:tcPr>
+          <w:p>
+            <w:r/>
+            <w:r>
+              <w:rPr>
+                <w:sz w:val="18"/>
+              </w:rPr>
+              <w:t>0.612</w:t>
+            </w:r>
+          </w:p>
+        </w:tc>
+      </w:tr>
+      <w:tr>
+        <w:tc>
+          <w:tcPr>
+            <w:tcW w:type="dxa" w:w="3685"/>
+          </w:tcPr>
+          <w:p>
+            <w:r/>
+            <w:r>
+              <w:rPr>
+                <w:sz w:val="18"/>
+              </w:rPr>
+              <w:t>LightGBM + balance</w:t>
+            </w:r>
+          </w:p>
+        </w:tc>
+        <w:tc>
+          <w:tcPr>
+            <w:tcW w:type="dxa" w:w="1701"/>
+          </w:tcPr>
+          <w:p>
+            <w:r/>
+            <w:r>
+              <w:rPr>
+                <w:sz w:val="18"/>
+              </w:rPr>
+              <w:t>0.772</w:t>
+            </w:r>
+          </w:p>
+        </w:tc>
+        <w:tc>
+          <w:tcPr>
+            <w:tcW w:type="dxa" w:w="1701"/>
+          </w:tcPr>
+          <w:p>
+            <w:r/>
+            <w:r>
+              <w:rPr>
+                <w:sz w:val="18"/>
+              </w:rPr>
+              <w:t>0.616</w:t>
+            </w:r>
+          </w:p>
+        </w:tc>
+        <w:tc>
+          <w:tcPr>
+            <w:tcW w:type="dxa" w:w="1984"/>
+          </w:tcPr>
+          <w:p>
+            <w:r/>
+            <w:r>
+              <w:rPr>
+                <w:sz w:val="18"/>
+              </w:rPr>
+              <w:t>0.576</w:t>
+            </w:r>
+          </w:p>
+        </w:tc>
+      </w:tr>
+      <w:tr>
+        <w:tc>
+          <w:tcPr>
+            <w:tcW w:type="dxa" w:w="3685"/>
+          </w:tcPr>
+          <w:p>
+            <w:r/>
+            <w:r>
+              <w:rPr>
+                <w:sz w:val="18"/>
+              </w:rPr>
+              <w:t>XGBoost + SMOTE</w:t>
+            </w:r>
+          </w:p>
+        </w:tc>
+        <w:tc>
+          <w:tcPr>
+            <w:tcW w:type="dxa" w:w="1701"/>
+          </w:tcPr>
+          <w:p>
+            <w:r/>
+            <w:r>
+              <w:rPr>
+                <w:sz w:val="18"/>
+              </w:rPr>
+              <w:t>0.785</w:t>
+            </w:r>
+          </w:p>
+        </w:tc>
+        <w:tc>
+          <w:tcPr>
+            <w:tcW w:type="dxa" w:w="1701"/>
+          </w:tcPr>
+          <w:p>
+            <w:r/>
+            <w:r>
+              <w:rPr>
+                <w:sz w:val="18"/>
+              </w:rPr>
+              <w:t>0.619</w:t>
+            </w:r>
+          </w:p>
+        </w:tc>
+        <w:tc>
+          <w:tcPr>
+            <w:tcW w:type="dxa" w:w="1984"/>
+          </w:tcPr>
+          <w:p>
+            <w:r/>
+            <w:r>
+              <w:rPr>
+                <w:sz w:val="18"/>
+              </w:rPr>
+              <w:t>0.643</w:t>
+            </w:r>
+          </w:p>
+        </w:tc>
+      </w:tr>
+    </w:tbl>
+    <w:p>
+      <w:pPr>
+        <w:spacing w:after="40"/>
+      </w:pPr>
+    </w:p>
+    <w:p>
+      <w:pPr>
+        <w:spacing w:after="240"/>
+      </w:pPr>
+      <w:r>
+        <w:rPr>
+          <w:i/>
+          <w:color w:val="555555"/>
+          <w:sz w:val="17"/>
+        </w:rPr>
+        <w:t xml:space="preserve">Nota. </w:t>
+      </w:r>
+      <w:r>
+        <w:rPr>
+          <w:color w:val="555555"/>
+          <w:sz w:val="17"/>
+        </w:rPr>
+        <w:t>Elaboración propia con base en los datos de Imran (2020).</w:t>
+      </w:r>
+    </w:p>
+    <w:p>
+      <w:pPr>
+        <w:spacing w:after="20"/>
+      </w:pPr>
+      <w:r>
+        <w:rPr>
+          <w:b/>
+          <w:sz w:val="19"/>
+        </w:rPr>
+        <w:t>Figura 9</w:t>
+      </w:r>
+    </w:p>
+    <w:p>
+      <w:pPr>
+        <w:spacing w:after="40"/>
+      </w:pPr>
+      <w:r>
+        <w:rPr>
+          <w:i/>
+          <w:sz w:val="19"/>
+        </w:rPr>
+        <w:t>Comparación de modelos en las tres métricas bajo validación walk-forward; la línea roja marca la base trivial.</w:t>
+      </w:r>
+    </w:p>
+    <w:p>
+      <w:pPr>
+        <w:jc w:val="center"/>
+      </w:pPr>
+      <w:r>
+        <w:drawing>
+          <wp:inline xmlns:a="http://schemas.openxmlformats.org/drawingml/2006/main" xmlns:pic="http://schemas.openxmlformats.org/drawingml/2006/picture">
+            <wp:extent cx="6120000" cy="1976590"/>
+            <wp:docPr id="9" name="Picture 9"/>
+            <wp:cNvGraphicFramePr>
+              <a:graphicFrameLocks noChangeAspect="1"/>
+            </wp:cNvGraphicFramePr>
+            <a:graphic>
+              <a:graphicData uri="http://schemas.openxmlformats.org/drawingml/2006/picture">
+                <pic:pic>
+                  <pic:nvPicPr>
+                    <pic:cNvPr id="0" name="fig_reco.png"/>
+                    <pic:cNvPicPr/>
+                  </pic:nvPicPr>
+                  <pic:blipFill>
+                    <a:blip r:embed="rId17"/>
+                    <a:stretch>
+                      <a:fillRect/>
+                    </a:stretch>
+                  </pic:blipFill>
+                  <pic:spPr>
+                    <a:xfrm>
+                      <a:off x="0" y="0"/>
+                      <a:ext cx="6120000" cy="1976590"/>
+                    </a:xfrm>
+                    <a:prstGeom prst="rect"/>
+                  </pic:spPr>
+                </pic:pic>
+              </a:graphicData>
+            </a:graphic>
+          </wp:inline>
+        </w:drawing>
+      </w:r>
+    </w:p>
+    <w:p>
+      <w:pPr>
+        <w:spacing w:after="240"/>
+      </w:pPr>
+      <w:r>
+        <w:rPr>
+          <w:i/>
+          <w:color w:val="555555"/>
+          <w:sz w:val="17"/>
+        </w:rPr>
+        <w:t xml:space="preserve">Nota. </w:t>
+      </w:r>
+      <w:r>
+        <w:rPr>
+          <w:color w:val="555555"/>
+          <w:sz w:val="17"/>
+        </w:rPr>
+        <w:t>Elaboración propia con base en los datos de Imran (2020), procesados mediante scikit-learn (Pedregosa et al., 2011).</w:t>
+      </w:r>
+    </w:p>
+    <w:p>
+      <w:pPr>
+        <w:spacing w:after="160" w:line="276" w:lineRule="auto"/>
+        <w:jc w:val="both"/>
+      </w:pPr>
+      <w:r>
+        <w:t xml:space="preserve">Se observan cuatro hallazgos. Primero, la </w:t>
+      </w:r>
+      <w:r>
+        <w:rPr>
+          <w:b/>
+        </w:rPr>
+        <w:t>validación walk-forward</w:t>
+      </w:r>
+      <w:r>
+        <w:t xml:space="preserve"> —más exigente que el corte único de la Sección 5— sitúa al Random Forest en torno a 0.808 de accuracy, por debajo del 87% obtenido con una sola partición; esta cifra es más realista y </w:t>
+      </w:r>
+      <w:r>
+        <w:rPr>
+          <w:b/>
+        </w:rPr>
+        <w:t>confirma el riesgo de sobreajuste</w:t>
+      </w:r>
+      <w:r>
+        <w:t xml:space="preserve"> de una validación menos estricta.</w:t>
+      </w:r>
+    </w:p>
+    <w:p>
+      <w:pPr>
+        <w:spacing w:after="160" w:line="276" w:lineRule="auto"/>
+        <w:jc w:val="both"/>
+      </w:pPr>
+      <w:r>
+        <w:t xml:space="preserve">Segundo, la </w:t>
+      </w:r>
+      <w:r>
+        <w:rPr>
+          <w:b/>
+        </w:rPr>
+        <w:t>ingeniería de variables enriquecida</w:t>
+      </w:r>
+      <w:r>
+        <w:t xml:space="preserve"> fue la palanca más efectiva: el accuracy del Random Forest subió de 0.794 a 0.808 y, sobre todo, el modelo se volvió más estable entre particiones.</w:t>
+      </w:r>
+    </w:p>
+    <w:p>
+      <w:pPr>
+        <w:spacing w:after="160" w:line="276" w:lineRule="auto"/>
+        <w:jc w:val="both"/>
+      </w:pPr>
+      <w:r>
+        <w:t xml:space="preserve">Tercero, los modelos de </w:t>
+      </w:r>
+      <w:r>
+        <w:rPr>
+          <w:b/>
+        </w:rPr>
+        <w:t>gradient boosting no superaron al Random Forest</w:t>
+      </w:r>
+      <w:r>
+        <w:t xml:space="preserve"> con este tamaño de datos (~1185 registros): XGBoost, LightGBM e HistGradientBoosting quedaron por debajo en accuracy y PR-AUC, mostrando que un método más complejo no garantiza mejores resultados.</w:t>
+      </w:r>
+    </w:p>
+    <w:p>
+      <w:pPr>
+        <w:spacing w:after="160" w:line="276" w:lineRule="auto"/>
+        <w:jc w:val="both"/>
+      </w:pPr>
+      <w:r>
+        <w:t xml:space="preserve">Cuarto, el </w:t>
+      </w:r>
+      <w:r>
+        <w:rPr>
+          <w:b/>
+        </w:rPr>
+        <w:t>manejo del desbalance mejora la detección de los equipos en riesgo a costa del accuracy</w:t>
+      </w:r>
+      <w:r>
+        <w:t xml:space="preserve">: XGBoost con SMOTE eleva el F1 de «no cumple» a 0.619 (frente a 0.599 del Random Forest), pero con menor accuracy. Esto </w:t>
+      </w:r>
+      <w:r>
+        <w:rPr>
+          <w:b/>
+        </w:rPr>
+        <w:t>confirma que medir solo con accuracy puede ocultar mejoras valiosas</w:t>
+      </w:r>
+      <w:r>
+        <w:t>: si el objetivo es detectar a los equipos que no cumplirán, la métrica adecuada es el F1 o el PR-AUC, no el accuracy.</w:t>
+      </w:r>
+    </w:p>
+    <w:p>
+      <w:pPr>
+        <w:spacing w:after="160" w:line="276" w:lineRule="auto"/>
+        <w:jc w:val="both"/>
+      </w:pPr>
+      <w:r>
+        <w:t xml:space="preserve">En síntesis, la mejor configuración </w:t>
+      </w:r>
+      <w:r>
+        <w:rPr>
+          <w:b/>
+        </w:rPr>
+        <w:t>depende del objetivo</w:t>
+      </w:r>
+      <w:r>
+        <w:t>: para calidad predictiva global y estable, el Random Forest con variables enriquecidas (0.808 de accuracy); para maximizar la detección de equipos en riesgo, XGBoost con SMOTE (F1 de 0.619) o LightGBM con balance (F1 de 0.616). Todos los modelos superan ampliamente la base trivial (PR-AUC de 0.269).</w:t>
+      </w:r>
+    </w:p>
+    <w:p>
+      <w:pPr>
+        <w:pStyle w:val="Heading1"/>
+      </w:pPr>
+      <w:r>
+        <w:rPr>
+          <w:color w:val="1A3D6D"/>
+        </w:rPr>
+        <w:t>8. Conclusiones</w:t>
       </w:r>
     </w:p>
     <w:p>
@@ -3848,13 +4643,13 @@
     </w:p>
     <w:p>
       <w:pPr>
-        <w:pStyle w:val="Heading2"/>
+        <w:pStyle w:val="Heading1"/>
       </w:pPr>
       <w:r>
         <w:rPr>
-          <w:color w:val="2A5A9C"/>
+          <w:color w:val="1A3D6D"/>
         </w:rPr>
-        <w:t>7.1 Trabajo futuro</w:t>
+        <w:t>9. Trabajo futuro</w:t>
       </w:r>
     </w:p>
     <w:p>
@@ -3863,7 +4658,133 @@
         <w:jc w:val="both"/>
       </w:pPr>
       <w:r>
-        <w:t>Como continuación natural se proponen: extender la ventana temporal de los datos para capturar estacionalidades; incorporar técnicas de tratamiento del desbalance (sobremuestreo o ponderación de clases) para mejorar el recall sobre los equipos en riesgo; ajustar los hiperparámetros mediante búsqueda sistemática; explorar modelos de interpretabilidad (como valores SHAP) para explicar predicciones individuales; y evaluar la integración del modelo en el flujo de supervisión de la fábrica como sistema de alerta temprana.</w:t>
+        <w:t xml:space="preserve">Con miras a </w:t>
+      </w:r>
+      <w:r>
+        <w:rPr>
+          <w:b/>
+        </w:rPr>
+        <w:t>maximizar el desempeño predictivo</w:t>
+      </w:r>
+      <w:r>
+        <w:t xml:space="preserve"> del modelo, se proponen las siguientes líneas de trabajo, ordenadas por prioridad:</w:t>
+      </w:r>
+    </w:p>
+    <w:p>
+      <w:pPr>
+        <w:spacing w:after="160" w:line="276" w:lineRule="auto"/>
+        <w:jc w:val="both"/>
+      </w:pPr>
+      <w:r>
+        <w:t xml:space="preserve">1. </w:t>
+      </w:r>
+      <w:r>
+        <w:rPr>
+          <w:b/>
+        </w:rPr>
+        <w:t>Redefinir la métrica de éxito.</w:t>
+      </w:r>
+      <w:r>
+        <w:t xml:space="preserve"> Dado el desbalance de clases, evaluar con </w:t>
+      </w:r>
+      <w:r>
+        <w:rPr>
+          <w:b/>
+        </w:rPr>
+        <w:t>F1 o AUC-PR</w:t>
+      </w:r>
+      <w:r>
+        <w:t xml:space="preserve"> en lugar del accuracy, para no penalizar las mejoras en la detección de los equipos en riesgo —que son la clase minoritaria y la de mayor interés operativo.</w:t>
+      </w:r>
+    </w:p>
+    <w:p>
+      <w:pPr>
+        <w:spacing w:after="160" w:line="276" w:lineRule="auto"/>
+        <w:jc w:val="both"/>
+      </w:pPr>
+      <w:r>
+        <w:t xml:space="preserve">2. </w:t>
+      </w:r>
+      <w:r>
+        <w:rPr>
+          <w:b/>
+        </w:rPr>
+        <w:t>Adoptar una validación walk-forward</w:t>
+      </w:r>
+      <w:r>
+        <w:t xml:space="preserve"> (TimeSeriesSplit), entrenando y evaluando avanzando en el tiempo, de modo que las mejoras observadas sean reales y no producto del sobreajuste.</w:t>
+      </w:r>
+    </w:p>
+    <w:p>
+      <w:pPr>
+        <w:spacing w:after="160" w:line="276" w:lineRule="auto"/>
+        <w:jc w:val="both"/>
+      </w:pPr>
+      <w:r>
+        <w:t xml:space="preserve">3. </w:t>
+      </w:r>
+      <w:r>
+        <w:rPr>
+          <w:b/>
+        </w:rPr>
+        <w:t>Enriquecer la ingeniería de variables temporales</w:t>
+      </w:r>
+      <w:r>
+        <w:t xml:space="preserve"> con más retardos y ventanas, medias móviles de longitud variable y retardos de incentive y over_time, no solo de la productividad.</w:t>
+      </w:r>
+    </w:p>
+    <w:p>
+      <w:pPr>
+        <w:spacing w:after="160" w:line="276" w:lineRule="auto"/>
+        <w:jc w:val="both"/>
+      </w:pPr>
+      <w:r>
+        <w:t xml:space="preserve">4. </w:t>
+      </w:r>
+      <w:r>
+        <w:rPr>
+          <w:b/>
+        </w:rPr>
+        <w:t>Evaluar modelos más potentes</w:t>
+      </w:r>
+      <w:r>
+        <w:t>: algoritmos de gradient boosting (XGBoost, LightGBM) y esquemas de stacking, junto con una búsqueda sistemática de hiperparámetros bajo la validación anterior.</w:t>
+      </w:r>
+    </w:p>
+    <w:p>
+      <w:pPr>
+        <w:spacing w:after="160" w:line="276" w:lineRule="auto"/>
+        <w:jc w:val="both"/>
+      </w:pPr>
+      <w:r>
+        <w:t xml:space="preserve">5. </w:t>
+      </w:r>
+      <w:r>
+        <w:rPr>
+          <w:b/>
+        </w:rPr>
+        <w:t>Tratar el desbalance de clases</w:t>
+      </w:r>
+      <w:r>
+        <w:t xml:space="preserve"> (sobremuestreo o ponderación) optimizando la métrica robusta seleccionada.</w:t>
+      </w:r>
+    </w:p>
+    <w:p>
+      <w:pPr>
+        <w:spacing w:after="160" w:line="276" w:lineRule="auto"/>
+        <w:jc w:val="both"/>
+      </w:pPr>
+      <w:r>
+        <w:t xml:space="preserve">En todos los casos, estas mejoras deben perseguirse controlando el </w:t>
+      </w:r>
+      <w:r>
+        <w:rPr>
+          <w:b/>
+        </w:rPr>
+        <w:t>riesgo de sobreajuste</w:t>
+      </w:r>
+      <w:r>
+        <w:t>, especialmente por el tamaño moderado del conjunto (~1.185 registros): conviene establecer primero una medición y una validación correctas y solo después optimizar los modelos, evitando así mejoras que resulten ilusorias sobre datos nuevos.</w:t>
       </w:r>
     </w:p>
     <w:p>

</xml_diff>

<commit_message>
Integra la validación de recomendaciones dentro de Resultados (5.4)
Mueve el contenido de desarrollo/validación de las recomendaciones desde
una sección propia a una subsección 5.4 dentro de Resultados, junto a los
demás datos. Revierte la numeración: Conclusiones (7) y Trabajo futuro (8).

Co-Authored-By: Claude Opus 4.8 <noreply@anthropic.com>
</commit_message>
<xml_diff>
--- a/proyecto-productividad-textil/Informe_Productividad_Textil.docx
+++ b/proyecto-productividad-textil/Informe_Productividad_Textil.docx
@@ -3745,13 +3745,13 @@
     </w:p>
     <w:p>
       <w:pPr>
-        <w:pStyle w:val="Heading1"/>
+        <w:pStyle w:val="Heading2"/>
       </w:pPr>
       <w:r>
         <w:rPr>
-          <w:color w:val="1A3D6D"/>
+          <w:color w:val="2A5A9C"/>
         </w:rPr>
-        <w:t>6. Discusión</w:t>
+        <w:t>5.4 Validación adicional: variables enriquecidas y walk-forward</w:t>
       </w:r>
     </w:p>
     <w:p>
@@ -3760,81 +3760,7 @@
         <w:jc w:val="both"/>
       </w:pPr>
       <w:r>
-        <w:t xml:space="preserve">Los resultados confirman que es posible anticipar el cumplimiento de la productividad objetivo con un nivel de exactitud que supera la meta propuesta. Más allá de la cifra, el diseño experimental fue concebido para resistir las amenazas habituales a la validez en problemas con componente temporal. La </w:t>
-      </w:r>
-      <w:r>
-        <w:rPr>
-          <w:b/>
-        </w:rPr>
-        <w:t>fuga de información</w:t>
-      </w:r>
-      <w:r>
-        <w:t xml:space="preserve"> se mitigó de raíz mediante variables calculadas solo con el pasado y una partición temporal estricta; el riesgo de </w:t>
-      </w:r>
-      <w:r>
-        <w:rPr>
-          <w:b/>
-        </w:rPr>
-        <w:t>predictores tramposos</w:t>
-      </w:r>
-      <w:r>
-        <w:t xml:space="preserve"> se neutralizó con el Conjunto B; y la </w:t>
-      </w:r>
-      <w:r>
-        <w:rPr>
-          <w:b/>
-        </w:rPr>
-        <w:t>redundancia</w:t>
-      </w:r>
-      <w:r>
-        <w:t xml:space="preserve"> entre variables, detectada en el análisis exploratorio, se gestionó en la etapa de selección.</w:t>
-      </w:r>
-    </w:p>
-    <w:p>
-      <w:pPr>
-        <w:spacing w:after="160" w:line="276" w:lineRule="auto"/>
-        <w:jc w:val="both"/>
-      </w:pPr>
-      <w:r>
-        <w:t xml:space="preserve">Debe leerse el accuracy, no obstante, a la luz del </w:t>
-      </w:r>
-      <w:r>
-        <w:rPr>
-          <w:b/>
-        </w:rPr>
-        <w:t>desbalance de clases</w:t>
-      </w:r>
-      <w:r>
-        <w:t xml:space="preserve"> (73.1% de la clase mayoritaria). Por ello el análisis se complementó con las matrices de confusión y con la línea base trivial, que el mejor modelo supera en más de trece puntos porcentuales. Entre las </w:t>
-      </w:r>
-      <w:r>
-        <w:rPr>
-          <w:b/>
-        </w:rPr>
-        <w:t>limitaciones</w:t>
-      </w:r>
-      <w:r>
-        <w:t xml:space="preserve"> del estudio cabe señalar el tamaño moderado del conjunto (poco más de mil registros tras la preparación), la cobertura temporal de solo tres meses —que impide capturar estacionalidades anuales— y el hecho de que las variables temporales reducen ligeramente la muestra al descartar el primer registro de cada equipo.</w:t>
-      </w:r>
-    </w:p>
-    <w:p>
-      <w:pPr>
-        <w:pStyle w:val="Heading1"/>
-      </w:pPr>
-      <w:r>
-        <w:rPr>
-          <w:color w:val="1A3D6D"/>
-        </w:rPr>
-        <w:t>7. Desarrollo y validación de las recomendaciones</w:t>
-      </w:r>
-    </w:p>
-    <w:p>
-      <w:pPr>
-        <w:spacing w:after="160" w:line="276" w:lineRule="auto"/>
-        <w:jc w:val="both"/>
-      </w:pPr>
-      <w:r>
-        <w:t>Con el fin de validar empíricamente las líneas de mejora propuestas (Sección 9) e ilustrar las dos advertencias metodológicas sobre la medición y la validación, se desarrollaron y evaluaron las principales recomendaciones bajo un protocolo más estricto que el de la Sección 5.</w:t>
+        <w:t>Como contraste de solidez de los resultados anteriores, se desarrollaron las principales líneas de mejora propuestas (Sección 8) bajo un protocolo de evaluación más estricto.</w:t>
       </w:r>
     </w:p>
     <w:p>
@@ -4519,7 +4445,7 @@
         <w:t>validación walk-forward</w:t>
       </w:r>
       <w:r>
-        <w:t xml:space="preserve"> —más exigente que el corte único de la Sección 5— sitúa al Random Forest en torno a 0.808 de accuracy, por debajo del 87% obtenido con una sola partición; esta cifra es más realista y </w:t>
+        <w:t xml:space="preserve"> —más exigente que el corte único usado en la evaluación principal— sitúa al Random Forest en torno a 0.808 de accuracy, por debajo del 87% obtenido con una sola partición; esta cifra es más realista y </w:t>
       </w:r>
       <w:r>
         <w:rPr>
@@ -4620,7 +4546,81 @@
         <w:rPr>
           <w:color w:val="1A3D6D"/>
         </w:rPr>
-        <w:t>8. Conclusiones</w:t>
+        <w:t>6. Discusión</w:t>
+      </w:r>
+    </w:p>
+    <w:p>
+      <w:pPr>
+        <w:spacing w:after="160" w:line="276" w:lineRule="auto"/>
+        <w:jc w:val="both"/>
+      </w:pPr>
+      <w:r>
+        <w:t xml:space="preserve">Los resultados confirman que es posible anticipar el cumplimiento de la productividad objetivo con un nivel de exactitud que supera la meta propuesta. Más allá de la cifra, el diseño experimental fue concebido para resistir las amenazas habituales a la validez en problemas con componente temporal. La </w:t>
+      </w:r>
+      <w:r>
+        <w:rPr>
+          <w:b/>
+        </w:rPr>
+        <w:t>fuga de información</w:t>
+      </w:r>
+      <w:r>
+        <w:t xml:space="preserve"> se mitigó de raíz mediante variables calculadas solo con el pasado y una partición temporal estricta; el riesgo de </w:t>
+      </w:r>
+      <w:r>
+        <w:rPr>
+          <w:b/>
+        </w:rPr>
+        <w:t>predictores tramposos</w:t>
+      </w:r>
+      <w:r>
+        <w:t xml:space="preserve"> se neutralizó con el Conjunto B; y la </w:t>
+      </w:r>
+      <w:r>
+        <w:rPr>
+          <w:b/>
+        </w:rPr>
+        <w:t>redundancia</w:t>
+      </w:r>
+      <w:r>
+        <w:t xml:space="preserve"> entre variables, detectada en el análisis exploratorio, se gestionó en la etapa de selección.</w:t>
+      </w:r>
+    </w:p>
+    <w:p>
+      <w:pPr>
+        <w:spacing w:after="160" w:line="276" w:lineRule="auto"/>
+        <w:jc w:val="both"/>
+      </w:pPr>
+      <w:r>
+        <w:t xml:space="preserve">Debe leerse el accuracy, no obstante, a la luz del </w:t>
+      </w:r>
+      <w:r>
+        <w:rPr>
+          <w:b/>
+        </w:rPr>
+        <w:t>desbalance de clases</w:t>
+      </w:r>
+      <w:r>
+        <w:t xml:space="preserve"> (73.1% de la clase mayoritaria). Por ello el análisis se complementó con las matrices de confusión y con la línea base trivial, que el mejor modelo supera en más de trece puntos porcentuales. Entre las </w:t>
+      </w:r>
+      <w:r>
+        <w:rPr>
+          <w:b/>
+        </w:rPr>
+        <w:t>limitaciones</w:t>
+      </w:r>
+      <w:r>
+        <w:t xml:space="preserve"> del estudio cabe señalar el tamaño moderado del conjunto (poco más de mil registros tras la preparación), la cobertura temporal de solo tres meses —que impide capturar estacionalidades anuales— y el hecho de que las variables temporales reducen ligeramente la muestra al descartar el primer registro de cada equipo.</w:t>
+      </w:r>
+    </w:p>
+    <w:p>
+      <w:pPr>
+        <w:pStyle w:val="Heading1"/>
+      </w:pPr>
+      <w:r>
+        <w:rPr>
+          <w:color w:val="1A3D6D"/>
+        </w:rPr>
+        <w:t>7. Conclusiones</w:t>
       </w:r>
     </w:p>
     <w:p>
@@ -4649,7 +4649,7 @@
         <w:rPr>
           <w:color w:val="1A3D6D"/>
         </w:rPr>
-        <w:t>9. Trabajo futuro</w:t>
+        <w:t>8. Trabajo futuro</w:t>
       </w:r>
     </w:p>
     <w:p>

</xml_diff>

<commit_message>
Integra en Conclusiones el hallazgo de la validación adicional (5.4)
Añade una quinta conclusión que resume la validación walk-forward con
métricas robustas: desempeño realista, features enriquecidas como mejor
palanca y elección de modelo/métrica según el objetivo.

Co-Authored-By: Claude Opus 4.8 <noreply@anthropic.com>
</commit_message>
<xml_diff>
--- a/proyecto-productividad-textil/Informe_Productividad_Textil.docx
+++ b/proyecto-productividad-textil/Informe_Productividad_Textil.docx
@@ -4643,6 +4643,15 @@
     </w:p>
     <w:p>
       <w:pPr>
+        <w:spacing w:after="160" w:line="276" w:lineRule="auto"/>
+        <w:jc w:val="both"/>
+      </w:pPr>
+      <w:r>
+        <w:t>Quinto, la validación adicional bajo un protocolo más estricto (walk-forward y métricas robustas, Sección 5.4) confirmó la solidez de los hallazgos: el desempeño se mantiene sólido (0.808 de accuracy, una cifra más realista que la del corte único), las variables temporales enriquecidas resultaron la palanca más efectiva, y la elección del modelo y de la métrica debe guiarse por el objetivo —calidad global frente a detección de los equipos en riesgo.</w:t>
+      </w:r>
+    </w:p>
+    <w:p>
+      <w:pPr>
         <w:pStyle w:val="Heading1"/>
       </w:pPr>
       <w:r>

</xml_diff>

<commit_message>
Separa el trabajo futuro en un documento propio
- Elimina la sección «Trabajo futuro» del informe principal (PDF y DOCX)
  y ajusta la referencia en 5.4.
- Agrega Trabajo_Futuro.pdf y Trabajo_Futuro.docx como documento
  complementario, conservando ambas partes por separado.

Co-Authored-By: Claude Opus 4.8 <noreply@anthropic.com>
</commit_message>
<xml_diff>
--- a/proyecto-productividad-textil/Informe_Productividad_Textil.docx
+++ b/proyecto-productividad-textil/Informe_Productividad_Textil.docx
@@ -3760,7 +3760,7 @@
         <w:jc w:val="both"/>
       </w:pPr>
       <w:r>
-        <w:t>Como contraste de solidez de los resultados anteriores, se desarrollaron las principales líneas de mejora propuestas (Sección 8) bajo un protocolo de evaluación más estricto.</w:t>
+        <w:t>Como contraste de solidez de los resultados anteriores, se desarrollaron las principales líneas de mejora propuestas como trabajo futuro (documento complementario) bajo un protocolo de evaluación más estricto.</w:t>
       </w:r>
     </w:p>
     <w:p>
@@ -4658,152 +4658,6 @@
         <w:rPr>
           <w:color w:val="1A3D6D"/>
         </w:rPr>
-        <w:t>8. Trabajo futuro</w:t>
-      </w:r>
-    </w:p>
-    <w:p>
-      <w:pPr>
-        <w:spacing w:after="160" w:line="276" w:lineRule="auto"/>
-        <w:jc w:val="both"/>
-      </w:pPr>
-      <w:r>
-        <w:t xml:space="preserve">Con miras a </w:t>
-      </w:r>
-      <w:r>
-        <w:rPr>
-          <w:b/>
-        </w:rPr>
-        <w:t>maximizar el desempeño predictivo</w:t>
-      </w:r>
-      <w:r>
-        <w:t xml:space="preserve"> del modelo, se proponen las siguientes líneas de trabajo, ordenadas por prioridad:</w:t>
-      </w:r>
-    </w:p>
-    <w:p>
-      <w:pPr>
-        <w:spacing w:after="160" w:line="276" w:lineRule="auto"/>
-        <w:jc w:val="both"/>
-      </w:pPr>
-      <w:r>
-        <w:t xml:space="preserve">1. </w:t>
-      </w:r>
-      <w:r>
-        <w:rPr>
-          <w:b/>
-        </w:rPr>
-        <w:t>Redefinir la métrica de éxito.</w:t>
-      </w:r>
-      <w:r>
-        <w:t xml:space="preserve"> Dado el desbalance de clases, evaluar con </w:t>
-      </w:r>
-      <w:r>
-        <w:rPr>
-          <w:b/>
-        </w:rPr>
-        <w:t>F1 o AUC-PR</w:t>
-      </w:r>
-      <w:r>
-        <w:t xml:space="preserve"> en lugar del accuracy, para no penalizar las mejoras en la detección de los equipos en riesgo —que son la clase minoritaria y la de mayor interés operativo.</w:t>
-      </w:r>
-    </w:p>
-    <w:p>
-      <w:pPr>
-        <w:spacing w:after="160" w:line="276" w:lineRule="auto"/>
-        <w:jc w:val="both"/>
-      </w:pPr>
-      <w:r>
-        <w:t xml:space="preserve">2. </w:t>
-      </w:r>
-      <w:r>
-        <w:rPr>
-          <w:b/>
-        </w:rPr>
-        <w:t>Adoptar una validación walk-forward</w:t>
-      </w:r>
-      <w:r>
-        <w:t xml:space="preserve"> (TimeSeriesSplit), entrenando y evaluando avanzando en el tiempo, de modo que las mejoras observadas sean reales y no producto del sobreajuste.</w:t>
-      </w:r>
-    </w:p>
-    <w:p>
-      <w:pPr>
-        <w:spacing w:after="160" w:line="276" w:lineRule="auto"/>
-        <w:jc w:val="both"/>
-      </w:pPr>
-      <w:r>
-        <w:t xml:space="preserve">3. </w:t>
-      </w:r>
-      <w:r>
-        <w:rPr>
-          <w:b/>
-        </w:rPr>
-        <w:t>Enriquecer la ingeniería de variables temporales</w:t>
-      </w:r>
-      <w:r>
-        <w:t xml:space="preserve"> con más retardos y ventanas, medias móviles de longitud variable y retardos de incentive y over_time, no solo de la productividad.</w:t>
-      </w:r>
-    </w:p>
-    <w:p>
-      <w:pPr>
-        <w:spacing w:after="160" w:line="276" w:lineRule="auto"/>
-        <w:jc w:val="both"/>
-      </w:pPr>
-      <w:r>
-        <w:t xml:space="preserve">4. </w:t>
-      </w:r>
-      <w:r>
-        <w:rPr>
-          <w:b/>
-        </w:rPr>
-        <w:t>Evaluar modelos más potentes</w:t>
-      </w:r>
-      <w:r>
-        <w:t>: algoritmos de gradient boosting (XGBoost, LightGBM) y esquemas de stacking, junto con una búsqueda sistemática de hiperparámetros bajo la validación anterior.</w:t>
-      </w:r>
-    </w:p>
-    <w:p>
-      <w:pPr>
-        <w:spacing w:after="160" w:line="276" w:lineRule="auto"/>
-        <w:jc w:val="both"/>
-      </w:pPr>
-      <w:r>
-        <w:t xml:space="preserve">5. </w:t>
-      </w:r>
-      <w:r>
-        <w:rPr>
-          <w:b/>
-        </w:rPr>
-        <w:t>Tratar el desbalance de clases</w:t>
-      </w:r>
-      <w:r>
-        <w:t xml:space="preserve"> (sobremuestreo o ponderación) optimizando la métrica robusta seleccionada.</w:t>
-      </w:r>
-    </w:p>
-    <w:p>
-      <w:pPr>
-        <w:spacing w:after="160" w:line="276" w:lineRule="auto"/>
-        <w:jc w:val="both"/>
-      </w:pPr>
-      <w:r>
-        <w:t xml:space="preserve">En todos los casos, estas mejoras deben perseguirse controlando el </w:t>
-      </w:r>
-      <w:r>
-        <w:rPr>
-          <w:b/>
-        </w:rPr>
-        <w:t>riesgo de sobreajuste</w:t>
-      </w:r>
-      <w:r>
-        <w:t>, especialmente por el tamaño moderado del conjunto (~1.185 registros): conviene establecer primero una medición y una validación correctas y solo después optimizar los modelos, evitando así mejoras que resulten ilusorias sobre datos nuevos.</w:t>
-      </w:r>
-    </w:p>
-    <w:p>
-      <w:pPr>
-        <w:pStyle w:val="Heading1"/>
-      </w:pPr>
-      <w:r>
-        <w:rPr>
-          <w:color w:val="1A3D6D"/>
-        </w:rPr>
         <w:t>Referencias</w:t>
       </w:r>
     </w:p>

</xml_diff>

<commit_message>
Reestructura el informe según la estructura del informe final
Reorganiza el informe (PDF y DOCX) en 7 secciones: Introducción, Marco
Teórico (metodologías/modelos/herramientas), Comprensión del Negocio,
Comprensión de los Datos, Preparación de los Datos (perdidos, descriptivo,
transformación, agrupamiento, análisis factorial/PCA, input/target),
Modelado y Evaluación (segmentación, modelos, validación) y Conclusiones
(resumen, modelo seleccionado, aplicación y extensión).

Co-Authored-By: Claude Opus 4.8 <noreply@anthropic.com>
</commit_message>
<xml_diff>
--- a/proyecto-productividad-textil/Informe_Productividad_Textil.docx
+++ b/proyecto-productividad-textil/Informe_Productividad_Textil.docx
@@ -68,7 +68,7 @@
     </w:p>
     <w:p>
       <w:pPr>
-        <w:spacing w:after="600"/>
+        <w:spacing w:after="120"/>
         <w:jc w:val="center"/>
       </w:pPr>
       <w:r>
@@ -77,7 +77,21 @@
           <w:i w:val="0"/>
           <w:sz w:val="24"/>
         </w:rPr>
-        <w:t>Informe técnico-investigativo</w:t>
+        <w:t>Informe final</w:t>
+      </w:r>
+    </w:p>
+    <w:p>
+      <w:pPr>
+        <w:spacing w:after="600"/>
+        <w:jc w:val="center"/>
+      </w:pPr>
+      <w:r>
+        <w:rPr>
+          <w:b w:val="0"/>
+          <w:i w:val="0"/>
+          <w:sz w:val="24"/>
+        </w:rPr>
+        <w:t>Luna León · Matías Machuca</w:t>
       </w:r>
     </w:p>
     <w:p>
@@ -143,7 +157,7 @@
         <w:jc w:val="both"/>
       </w:pPr>
       <w:r>
-        <w:t xml:space="preserve">La productividad de los equipos en la industria de la confección textil es un factor crítico para la competitividad, pero presenta una alta variabilidad que dificulta su gestión anticipada. Este trabajo aborda, mediante técnicas de minería de datos, la predicción de si un equipo de una fábrica textil </w:t>
+        <w:t xml:space="preserve">Este trabajo aborda, mediante técnicas de minería de datos, la predicción de si un equipo de una fábrica textil </w:t>
       </w:r>
       <w:r>
         <w:rPr>
@@ -152,7 +166,7 @@
         <w:t>alcanzará o no su productividad objetivo</w:t>
       </w:r>
       <w:r>
-        <w:t xml:space="preserve"> en una jornada determinada. El problema se formula como una </w:t>
+        <w:t xml:space="preserve"> en una jornada determinada, formulada como una </w:t>
       </w:r>
       <w:r>
         <w:rPr>
@@ -161,7 +175,7 @@
         <w:t>clasificación binaria supervisada</w:t>
       </w:r>
       <w:r>
-        <w:t xml:space="preserve"> (cumple / no cumple), construida discretizando la productividad real respecto de la objetivo. El aporte central del estudio es la incorporación del </w:t>
+        <w:t xml:space="preserve"> (cumple / no cumple). El aporte central es el uso del </w:t>
       </w:r>
       <w:r>
         <w:rPr>
@@ -170,7 +184,7 @@
         <w:t>comportamiento temporal reciente de cada equipo</w:t>
       </w:r>
       <w:r>
-        <w:t xml:space="preserve"> —retardos, medias móviles, tendencia y antigüedad desde el último cambio de estilo— en lugar de tratar cada jornada de forma aislada. Siguiendo el proceso CRISP-DM (Wirth y Hipp, 2000), se depuró el conjunto de datos de Imran (2020), que reúne 1197 registros y 15 variables; se construyeron variables de historial por equipo; se aplicó selección de variables; y se compararon cinco familias de modelos evaluadas con una partición temporal que evita la fuga de información. La hipótesis planteaba alcanzar al menos un 80% de exactitud (accuracy). El mejor modelo, un </w:t>
+        <w:t xml:space="preserve"> (retardos, medias móviles, tendencia y antigüedad desde el último cambio de estilo). Siguiendo el proceso CRISP-DM (Wirth &amp;amp; Hipp, 2000), se depuró el conjunto de datos de Imran (2020) (1197 registros, 15 variables), se prepararon los datos, se compararon cinco familias de modelos y se validó con una partición temporal. El mejor modelo, un </w:t>
       </w:r>
       <w:r>
         <w:rPr>
@@ -179,7 +193,18 @@
         <w:t>Random Forest, obtuvo un 87.0%</w:t>
       </w:r>
       <w:r>
-        <w:t xml:space="preserve"> sobre datos no vistos, confirmando la hipótesis y superando holgadamente la línea base trivial de 73.2%.</w:t>
+        <w:t xml:space="preserve"> de accuracy, confirmando la hipótesis del 80% y superando la línea base trivial de 73.2%.</w:t>
+      </w:r>
+    </w:p>
+    <w:p>
+      <w:pPr>
+        <w:pStyle w:val="Heading1"/>
+      </w:pPr>
+      <w:r>
+        <w:rPr>
+          <w:color w:val="1A3D6D"/>
+        </w:rPr>
+        <w:t>1. Introducción</w:t>
       </w:r>
     </w:p>
     <w:p>
@@ -188,24 +213,25 @@
         <w:jc w:val="both"/>
       </w:pPr>
       <w:r>
+        <w:t xml:space="preserve">La industria de la confección textil es uno de los sectores manufactureros más intensivos en mano de obra. En este tipo de producción, la unidad operativa fundamental es el </w:t>
+      </w:r>
+      <w:r>
         <w:rPr>
           <w:b/>
         </w:rPr>
-        <w:t>Palabras clave:</w:t>
-      </w:r>
-      <w:r>
-        <w:t xml:space="preserve"> minería de datos, clasificación supervisada, ingeniería de variables temporales, productividad, industria textil, CRISP-DM, Random Forest.</w:t>
-      </w:r>
-    </w:p>
-    <w:p>
-      <w:pPr>
-        <w:pStyle w:val="Heading1"/>
-      </w:pPr>
+        <w:t>equipo</w:t>
+      </w:r>
+      <w:r>
+        <w:t xml:space="preserve">, y el indicador que gobierna la planificación es la </w:t>
+      </w:r>
       <w:r>
         <w:rPr>
-          <w:color w:val="1A3D6D"/>
+          <w:b/>
         </w:rPr>
-        <w:t>1. Introducción</w:t>
+        <w:t>productividad</w:t>
+      </w:r>
+      <w:r>
+        <w:t>: la razón entre lo producido y lo que se esperaba producir en una jornada. A cada equipo se le asigna diariamente una productividad objetivo, cuyo cumplimiento determina tiempos de entrega, costos por horas extra y, en definitiva, la rentabilidad.</w:t>
       </w:r>
     </w:p>
     <w:p>
@@ -214,25 +240,34 @@
         <w:jc w:val="both"/>
       </w:pPr>
       <w:r>
-        <w:t xml:space="preserve">La industria de la confección textil (garment industry) constituye uno de los sectores manufactureros más intensivos en mano de obra del mundo. En este tipo de producción, la unidad operativa fundamental no es el trabajador individual sino el </w:t>
+        <w:t xml:space="preserve">El problema práctico es que la productividad de un equipo es altamente variable y su incumplimiento suele </w:t>
       </w:r>
       <w:r>
         <w:rPr>
           <w:b/>
         </w:rPr>
-        <w:t>equipo</w:t>
-      </w:r>
-      <w:r>
-        <w:t xml:space="preserve">, y el indicador que gobierna la planificación es la </w:t>
+        <w:t>constatarse recién al cerrar la jornada</w:t>
+      </w:r>
+      <w:r>
+        <w:t xml:space="preserve">, cuando ya no es posible intervenir. Frente a ello, este proyecto propone un enfoque </w:t>
       </w:r>
       <w:r>
         <w:rPr>
           <w:b/>
         </w:rPr>
-        <w:t>productividad</w:t>
-      </w:r>
-      <w:r>
-        <w:t>: la razón entre lo efectivamente producido y lo que se esperaba producir en una jornada. A cada equipo se le asigna diariamente una productividad objetivo, y el cumplimiento o incumplimiento de esa meta determina los tiempos de entrega, los costos por horas extra y, en definitiva, la rentabilidad de la fábrica.</w:t>
+        <w:t>predictivo y proactivo</w:t>
+      </w:r>
+      <w:r>
+        <w:t xml:space="preserve">: anticipar, a partir de la información operativa y del </w:t>
+      </w:r>
+      <w:r>
+        <w:rPr>
+          <w:b/>
+        </w:rPr>
+        <w:t>historial reciente de cada equipo</w:t>
+      </w:r>
+      <w:r>
+        <w:t>, si éste alcanzará su meta. La pregunta que articula el trabajo es: ¿se puede predecir hoy si un equipo cumplirá su meta a partir de su comportamiento reciente?</w:t>
       </w:r>
     </w:p>
     <w:p>
@@ -241,16 +276,38 @@
         <w:jc w:val="both"/>
       </w:pPr>
       <w:r>
-        <w:t xml:space="preserve">El problema práctico es que la productividad de un equipo es altamente variable y depende de numerosos factores: la complejidad de la prenda (reflejada en el tiempo estándar o SMV), el volumen de trabajo en proceso, las horas extra, los incentivos económicos, el número de trabajadores, los tiempos ociosos y los cambios de estilo de producción. Debido a esta variabilidad, el incumplimiento de la meta suele </w:t>
+        <w:t xml:space="preserve">El dominio y los datos fueron introducidos por Imran et al. (2019) y difundidos mediante el repositorio UCI (Imran, 2020). A diferencia de otros trabajos que modelan la productividad como valor continuo, aquí se aborda como </w:t>
       </w:r>
       <w:r>
         <w:rPr>
           <w:b/>
         </w:rPr>
-        <w:t>constatarse recién al cerrar la jornada</w:t>
-      </w:r>
-      <w:r>
-        <w:t>, cuando ya no es posible reasignar recursos ni intervenir. La gestión, por tanto, opera de manera reactiva.</w:t>
+        <w:t>clasificación categórica</w:t>
+      </w:r>
+      <w:r>
+        <w:t>, con énfasis en la construcción de variables temporales y en la selección de variables de entrada.</w:t>
+      </w:r>
+    </w:p>
+    <w:p>
+      <w:pPr>
+        <w:pStyle w:val="Heading1"/>
+      </w:pPr>
+      <w:r>
+        <w:rPr>
+          <w:color w:val="1A3D6D"/>
+        </w:rPr>
+        <w:t>2. Marco Teórico</w:t>
+      </w:r>
+    </w:p>
+    <w:p>
+      <w:pPr>
+        <w:pStyle w:val="Heading2"/>
+      </w:pPr>
+      <w:r>
+        <w:rPr>
+          <w:color w:val="2A5A9C"/>
+        </w:rPr>
+        <w:t>2.1 Metodologías</w:t>
       </w:r>
     </w:p>
     <w:p>
@@ -259,25 +316,90 @@
         <w:jc w:val="both"/>
       </w:pPr>
       <w:r>
-        <w:t xml:space="preserve">Frente a este escenario, el presente proyecto propone un enfoque </w:t>
+        <w:t xml:space="preserve">El trabajo se estructura según </w:t>
       </w:r>
       <w:r>
         <w:rPr>
           <w:b/>
         </w:rPr>
-        <w:t>predictivo y proactivo</w:t>
-      </w:r>
-      <w:r>
-        <w:t xml:space="preserve">: anticipar, a partir de la información operativa disponible y —de manera distintiva— del </w:t>
+        <w:t>CRISP-DM</w:t>
+      </w:r>
+      <w:r>
+        <w:t xml:space="preserve"> (Cross-Industry Standard Process for Data Mining; Wirth &amp;amp; Hipp, 2000), que organiza un proyecto en comprensión del negocio, comprensión de los datos, preparación, modelado y evaluación. La tarea se resuelve con </w:t>
       </w:r>
       <w:r>
         <w:rPr>
           <w:b/>
         </w:rPr>
-        <w:t>historial reciente de desempeño de cada equipo</w:t>
-      </w:r>
-      <w:r>
-        <w:t>, si éste alcanzará su meta en la jornada en curso. La pregunta de investigación que articula el trabajo es: ¿es posible predecir si un equipo cumplirá su meta hoy a partir de su comportamiento reciente y de sus variables operativas?</w:t>
+        <w:t>aprendizaje supervisado</w:t>
+      </w:r>
+      <w:r>
+        <w:t xml:space="preserve">: un modelo aprende, a partir de ejemplos etiquetados, la relación entre variables de entrada y una salida conocida; cuando esa salida es una categoría, se habla de </w:t>
+      </w:r>
+      <w:r>
+        <w:rPr>
+          <w:b/>
+        </w:rPr>
+        <w:t>clasificación</w:t>
+      </w:r>
+      <w:r>
+        <w:t xml:space="preserve">. El objetivo continuo se convierte en binario mediante </w:t>
+      </w:r>
+      <w:r>
+        <w:rPr>
+          <w:b/>
+        </w:rPr>
+        <w:t>discretización</w:t>
+      </w:r>
+      <w:r>
+        <w:t xml:space="preserve">. Para estimar el desempeño de forma honesta se emplean la </w:t>
+      </w:r>
+      <w:r>
+        <w:rPr>
+          <w:b/>
+        </w:rPr>
+        <w:t>validación cruzada</w:t>
+      </w:r>
+      <w:r>
+        <w:t xml:space="preserve"> y, dado el componente temporal, una </w:t>
+      </w:r>
+      <w:r>
+        <w:rPr>
+          <w:b/>
+        </w:rPr>
+        <w:t>partición temporal</w:t>
+      </w:r>
+      <w:r>
+        <w:t xml:space="preserve"> y la </w:t>
+      </w:r>
+      <w:r>
+        <w:rPr>
+          <w:b/>
+        </w:rPr>
+        <w:t>validación walk-forward</w:t>
+      </w:r>
+      <w:r>
+        <w:t xml:space="preserve">, que evitan la </w:t>
+      </w:r>
+      <w:r>
+        <w:rPr>
+          <w:b/>
+        </w:rPr>
+        <w:t>fuga de información</w:t>
+      </w:r>
+      <w:r>
+        <w:t xml:space="preserve"> (usar datos no disponibles al momento de predecir).</w:t>
+      </w:r>
+    </w:p>
+    <w:p>
+      <w:pPr>
+        <w:pStyle w:val="Heading2"/>
+      </w:pPr>
+      <w:r>
+        <w:rPr>
+          <w:color w:val="2A5A9C"/>
+        </w:rPr>
+        <w:t>2.2 Modelos</w:t>
       </w:r>
     </w:p>
     <w:p>
@@ -286,45 +408,72 @@
         <w:jc w:val="both"/>
       </w:pPr>
       <w:r>
-        <w:t xml:space="preserve">El dominio y el conjunto de datos utilizados fueron introducidos originalmente por Imran et al. (2019) y posteriormente difundidos a través del repositorio de la Universidad de California en Irvine (Imran, 2020), constituyéndose en un caso de referencia para el estudio de la productividad laboral con aprendizaje automático. A diferencia de buena parte de los trabajos previos, que modelan la productividad como un valor continuo, aquí se aborda como un problema de </w:t>
+        <w:t xml:space="preserve">Se comparan familias de clasificación vistas en el ramo. El </w:t>
       </w:r>
       <w:r>
         <w:rPr>
           <w:b/>
         </w:rPr>
-        <w:t>clasificación categórica</w:t>
-      </w:r>
-      <w:r>
-        <w:t xml:space="preserve"> y se pone el acento en dos desafíos metodológicos: la </w:t>
+        <w:t>árbol de decisión</w:t>
+      </w:r>
+      <w:r>
+        <w:t xml:space="preserve"> divide los datos con preguntas sobre las variables; es interpretable pero propenso al sobreajuste. El </w:t>
       </w:r>
       <w:r>
         <w:rPr>
           <w:b/>
         </w:rPr>
-        <w:t>construcción de variables temporales por equipo</w:t>
-      </w:r>
-      <w:r>
-        <w:t xml:space="preserve"> y la </w:t>
+        <w:t>Random Forest</w:t>
+      </w:r>
+      <w:r>
+        <w:t xml:space="preserve"> combina muchos árboles sobre muestras y variables aleatorias (bagging), reduciendo la varianza. El </w:t>
       </w:r>
       <w:r>
         <w:rPr>
           <w:b/>
         </w:rPr>
-        <w:t>selección de variables de entrada</w:t>
-      </w:r>
-      <w:r>
-        <w:t>, incluyendo la decisión deliberada de prescindir del predictor más obvio para demostrar la robustez del modelo.</w:t>
+        <w:t>AdaBoost</w:t>
+      </w:r>
+      <w:r>
+        <w:t xml:space="preserve"> construye árboles secuenciales dando más peso a los casos mal clasificados (boosting). El </w:t>
+      </w:r>
+      <w:r>
+        <w:rPr>
+          <w:b/>
+        </w:rPr>
+        <w:t>Naive Bayes gaussiano</w:t>
+      </w:r>
+      <w:r>
+        <w:t xml:space="preserve"> es un clasificador probabilístico basado en el teorema de Bayes. La </w:t>
+      </w:r>
+      <w:r>
+        <w:rPr>
+          <w:b/>
+        </w:rPr>
+        <w:t>máquina de soporte vectorial (SVM)</w:t>
+      </w:r>
+      <w:r>
+        <w:t xml:space="preserve"> busca el hiperplano que mejor separa las clases y requiere estandarizar las variables. Como extensión se consideran algoritmos de </w:t>
+      </w:r>
+      <w:r>
+        <w:rPr>
+          <w:b/>
+        </w:rPr>
+        <w:t>gradient boosting</w:t>
+      </w:r>
+      <w:r>
+        <w:t xml:space="preserve"> (XGBoost, LightGBM).</w:t>
       </w:r>
     </w:p>
     <w:p>
       <w:pPr>
-        <w:pStyle w:val="Heading1"/>
+        <w:pStyle w:val="Heading2"/>
       </w:pPr>
       <w:r>
         <w:rPr>
-          <w:color w:val="1A3D6D"/>
+          <w:color w:val="2A5A9C"/>
         </w:rPr>
-        <w:t>2. Marco conceptual</w:t>
+        <w:t>2.3 Herramientas</w:t>
       </w:r>
     </w:p>
     <w:p>
@@ -333,7 +482,117 @@
         <w:jc w:val="both"/>
       </w:pPr>
       <w:r>
-        <w:t>A fin de que el informe sea comprensible más allá del lenguaje técnico, se precisan los conceptos centrales que sustentan el trabajo.</w:t>
+        <w:t xml:space="preserve">La implementación se realizó en </w:t>
+      </w:r>
+      <w:r>
+        <w:rPr>
+          <w:b/>
+        </w:rPr>
+        <w:t>Python</w:t>
+      </w:r>
+      <w:r>
+        <w:t xml:space="preserve"> sobre </w:t>
+      </w:r>
+      <w:r>
+        <w:rPr>
+          <w:b/>
+        </w:rPr>
+        <w:t>Google Colab</w:t>
+      </w:r>
+      <w:r>
+        <w:t xml:space="preserve">. Se utilizaron: </w:t>
+      </w:r>
+      <w:r>
+        <w:rPr>
+          <w:b/>
+        </w:rPr>
+        <w:t>pandas</w:t>
+      </w:r>
+      <w:r>
+        <w:t xml:space="preserve"> y </w:t>
+      </w:r>
+      <w:r>
+        <w:rPr>
+          <w:b/>
+        </w:rPr>
+        <w:t>NumPy</w:t>
+      </w:r>
+      <w:r>
+        <w:t xml:space="preserve"> para la manipulación de datos; </w:t>
+      </w:r>
+      <w:r>
+        <w:rPr>
+          <w:b/>
+        </w:rPr>
+        <w:t>scikit-learn</w:t>
+      </w:r>
+      <w:r>
+        <w:t xml:space="preserve"> (Pedregosa et al., 2011) para el modelado, la validación y las métricas; </w:t>
+      </w:r>
+      <w:r>
+        <w:rPr>
+          <w:b/>
+        </w:rPr>
+        <w:t>matplotlib</w:t>
+      </w:r>
+      <w:r>
+        <w:t xml:space="preserve"> y </w:t>
+      </w:r>
+      <w:r>
+        <w:rPr>
+          <w:b/>
+        </w:rPr>
+        <w:t>seaborn</w:t>
+      </w:r>
+      <w:r>
+        <w:t xml:space="preserve"> para la visualización; </w:t>
+      </w:r>
+      <w:r>
+        <w:rPr>
+          <w:b/>
+        </w:rPr>
+        <w:t>XGBoost</w:t>
+      </w:r>
+      <w:r>
+        <w:t xml:space="preserve">, </w:t>
+      </w:r>
+      <w:r>
+        <w:rPr>
+          <w:b/>
+        </w:rPr>
+        <w:t>LightGBM</w:t>
+      </w:r>
+      <w:r>
+        <w:t xml:space="preserve"> e </w:t>
+      </w:r>
+      <w:r>
+        <w:rPr>
+          <w:b/>
+        </w:rPr>
+        <w:t>imbalanced-learn</w:t>
+      </w:r>
+      <w:r>
+        <w:t xml:space="preserve"> (SMOTE) para la extensión de modelos y el manejo del desbalance; y </w:t>
+      </w:r>
+      <w:r>
+        <w:rPr>
+          <w:b/>
+        </w:rPr>
+        <w:t>ucimlrepo</w:t>
+      </w:r>
+      <w:r>
+        <w:t xml:space="preserve"> para la carga del conjunto de datos. La reproducibilidad se garantizó fijando la semilla aleatoria en 42.</w:t>
+      </w:r>
+    </w:p>
+    <w:p>
+      <w:pPr>
+        <w:pStyle w:val="Heading1"/>
+      </w:pPr>
+      <w:r>
+        <w:rPr>
+          <w:color w:val="1A3D6D"/>
+        </w:rPr>
+        <w:t>3. Comprensión del Negocio</w:t>
       </w:r>
     </w:p>
     <w:p>
@@ -344,7 +603,7 @@
         <w:rPr>
           <w:color w:val="2A5A9C"/>
         </w:rPr>
-        <w:t>2.1 Aprendizaje supervisado y clasificación</w:t>
+        <w:t>3.1 Definición del Problema</w:t>
       </w:r>
     </w:p>
     <w:p>
@@ -353,25 +612,16 @@
         <w:jc w:val="both"/>
       </w:pPr>
       <w:r>
-        <w:t xml:space="preserve">El </w:t>
+        <w:t xml:space="preserve">La detección del bajo desempeño productivo es actualmente </w:t>
       </w:r>
       <w:r>
         <w:rPr>
           <w:b/>
         </w:rPr>
-        <w:t>aprendizaje supervisado</w:t>
-      </w:r>
-      <w:r>
-        <w:t xml:space="preserve"> consiste en entrenar un modelo con ejemplos previamente etiquetados, de modo que aprenda la relación entre un conjunto de variables de entrada y una variable de salida conocida. Cuando esa salida es una categoría, se habla de </w:t>
-      </w:r>
-      <w:r>
-        <w:rPr>
-          <w:b/>
-        </w:rPr>
-        <w:t>clasificación</w:t>
-      </w:r>
-      <w:r>
-        <w:t>. En este estudio la salida es binaria: cumple (1) o no cumple (0) la meta de productividad.</w:t>
+        <w:t>reactiva</w:t>
+      </w:r>
+      <w:r>
+        <w:t>: se confirma al finalizar la jornada, sin margen de intervención, lo que genera incumplimientos de entrega, sobrecostos por horas extra y una supervisión sin criterios anticipatorios. Se requiere un mecanismo que —usando el comportamiento reciente de cada equipo y sus condiciones operativas— permita anticipar el riesgo de incumplimiento y priorizar la supervisión sobre los equipos más vulnerables.</w:t>
       </w:r>
     </w:p>
     <w:p>
@@ -382,7 +632,7 @@
         <w:rPr>
           <w:color w:val="2A5A9C"/>
         </w:rPr>
-        <w:t>2.2 Discretización del objetivo</w:t>
+        <w:t>3.2 Solución Propuesta</w:t>
       </w:r>
     </w:p>
     <w:p>
@@ -391,16 +641,43 @@
         <w:jc w:val="both"/>
       </w:pPr>
       <w:r>
-        <w:t xml:space="preserve">La variable original de productividad real es continua (toma valores entre 0 y 1). Para convertir el problema en una clasificación, se aplica una </w:t>
+        <w:t xml:space="preserve">Se propone un </w:t>
       </w:r>
       <w:r>
         <w:rPr>
           <w:b/>
         </w:rPr>
-        <w:t>discretización</w:t>
-      </w:r>
-      <w:r>
-        <w:t>: se compara, en cada registro, la productividad real con la objetivo y se asigna la etiqueta correspondiente. Esta transformación convierte una tarea de regresión en una de decisión binaria, más alineada con la necesidad operativa de la fábrica.</w:t>
+        <w:t>modelo de clasificación binaria</w:t>
+      </w:r>
+      <w:r>
+        <w:t xml:space="preserve"> que, para una jornada dada, prediga si un equipo </w:t>
+      </w:r>
+      <w:r>
+        <w:rPr>
+          <w:b/>
+        </w:rPr>
+        <w:t>cumplirá o no</w:t>
+      </w:r>
+      <w:r>
+        <w:t xml:space="preserve"> su productividad objetivo. La solución se apoya en dos pilares: (1) </w:t>
+      </w:r>
+      <w:r>
+        <w:rPr>
+          <w:b/>
+        </w:rPr>
+        <w:t>variables temporales por equipo</w:t>
+      </w:r>
+      <w:r>
+        <w:t xml:space="preserve"> que capturan la inercia y el momento del desempeño reciente; y (2) una </w:t>
+      </w:r>
+      <w:r>
+        <w:rPr>
+          <w:b/>
+        </w:rPr>
+        <w:t>selección de variables</w:t>
+      </w:r>
+      <w:r>
+        <w:t xml:space="preserve"> que gestiona redundancias y evalúa deliberadamente excluir la productividad objetivo (un predictor «atajo»), para demostrar que la predicción se sostiene en información operativa y temporal genuina. El resultado es una herramienta de alerta temprana sobre los equipos en riesgo.</w:t>
       </w:r>
     </w:p>
     <w:p>
@@ -411,7 +688,7 @@
         <w:rPr>
           <w:color w:val="2A5A9C"/>
         </w:rPr>
-        <w:t>2.3 Ingeniería de variables temporales</w:t>
+        <w:t>3.3 Objetivos</w:t>
       </w:r>
     </w:p>
     <w:p>
@@ -420,63 +697,13 @@
         <w:jc w:val="both"/>
       </w:pPr>
       <w:r>
-        <w:t xml:space="preserve">La </w:t>
-      </w:r>
-      <w:r>
         <w:rPr>
           <w:b/>
         </w:rPr>
-        <w:t>ingeniería de variables</w:t>
-      </w:r>
-      <w:r>
-        <w:t xml:space="preserve"> es la creación de nuevas variables a partir de las existentes para mejorar la capacidad predictiva. En este proyecto adquiere un rol protagónico: a partir del ordenamiento cronológico de cada equipo se derivan variables de </w:t>
-      </w:r>
-      <w:r>
-        <w:rPr>
-          <w:b/>
-        </w:rPr>
-        <w:t>retardo</w:t>
-      </w:r>
-      <w:r>
-        <w:t xml:space="preserve"> (lag, el valor de la jornada anterior), </w:t>
-      </w:r>
-      <w:r>
-        <w:rPr>
-          <w:b/>
-        </w:rPr>
-        <w:t>media móvil</w:t>
-      </w:r>
-      <w:r>
-        <w:t xml:space="preserve"> (promedio de las jornadas recientes), </w:t>
-      </w:r>
-      <w:r>
-        <w:rPr>
-          <w:b/>
-        </w:rPr>
-        <w:t>tendencia</w:t>
-      </w:r>
-      <w:r>
-        <w:t xml:space="preserve"> (si el desempeño sube o baja) y </w:t>
-      </w:r>
-      <w:r>
-        <w:rPr>
-          <w:b/>
-        </w:rPr>
-        <w:t>antigüedad desde el último cambio de estilo</w:t>
-      </w:r>
-      <w:r>
-        <w:t>. Estas variables capturan la inercia y el momento del equipo, información que se pierde si cada jornada se analiza de forma aislada.</w:t>
-      </w:r>
-    </w:p>
-    <w:p>
-      <w:pPr>
-        <w:pStyle w:val="Heading2"/>
-      </w:pPr>
-      <w:r>
-        <w:rPr>
-          <w:color w:val="2A5A9C"/>
-        </w:rPr>
-        <w:t>2.4 Codificación de variables categóricas</w:t>
+        <w:t>Objetivo general.</w:t>
+      </w:r>
+      <w:r>
+        <w:t xml:space="preserve"> Construir y evaluar un modelo de clasificación binaria que determine si un equipo alcanzará su productividad objetivo en una jornada, logrando al menos un 80% de accuracy, a partir de variables operativas y del comportamiento temporal reciente.</w:t>
       </w:r>
     </w:p>
     <w:p>
@@ -485,27 +712,10 @@
         <w:jc w:val="both"/>
       </w:pPr>
       <w:r>
-        <w:t xml:space="preserve">Los algoritmos de aprendizaje requieren entradas numéricas. Las variables categóricas (día, semana, departamento y equipo) se transforman mediante </w:t>
-      </w:r>
-      <w:r>
         <w:rPr>
           <w:b/>
         </w:rPr>
-        <w:t>one-hot encoding</w:t>
-      </w:r>
-      <w:r>
-        <w:t>, técnica que crea una columna binaria por cada categoría, evitando imponer un orden artificial entre ellas.</w:t>
-      </w:r>
-    </w:p>
-    <w:p>
-      <w:pPr>
-        <w:pStyle w:val="Heading2"/>
-      </w:pPr>
-      <w:r>
-        <w:rPr>
-          <w:color w:val="2A5A9C"/>
-        </w:rPr>
-        <w:t>2.5 Fuga de información y validación</w:t>
+        <w:t>Objetivos específicos.</w:t>
       </w:r>
     </w:p>
     <w:p>
@@ -514,36 +724,7 @@
         <w:jc w:val="both"/>
       </w:pPr>
       <w:r>
-        <w:t xml:space="preserve">La </w:t>
-      </w:r>
-      <w:r>
-        <w:rPr>
-          <w:b/>
-        </w:rPr>
-        <w:t>fuga de información</w:t>
-      </w:r>
-      <w:r>
-        <w:t xml:space="preserve"> (data leakage) ocurre cuando el modelo accede, durante el entrenamiento, a datos que no estarían disponibles en el momento real de la predicción, lo que infla artificialmente su desempeño. Se controla con dos mecanismos: calcular las variables temporales solo con información pasada y particionar los datos respetando el orden cronológico. La </w:t>
-      </w:r>
-      <w:r>
-        <w:rPr>
-          <w:b/>
-        </w:rPr>
-        <w:t>validación cruzada</w:t>
-      </w:r>
-      <w:r>
-        <w:t xml:space="preserve"> estima la estabilidad del modelo entrenándolo y evaluándolo en distintos subconjuntos.</w:t>
-      </w:r>
-    </w:p>
-    <w:p>
-      <w:pPr>
-        <w:pStyle w:val="Heading2"/>
-      </w:pPr>
-      <w:r>
-        <w:rPr>
-          <w:color w:val="2A5A9C"/>
-        </w:rPr>
-        <w:t>2.6 Modelos de clasificación empleados</w:t>
+        <w:t>1. Explorar, limpiar y preparar los datos (nulos, corrección de categorías y discretización del target).</w:t>
       </w:r>
     </w:p>
     <w:p>
@@ -552,63 +733,7 @@
         <w:jc w:val="both"/>
       </w:pPr>
       <w:r>
-        <w:t xml:space="preserve">Se comparan cinco familias vistas en el ramo. El </w:t>
-      </w:r>
-      <w:r>
-        <w:rPr>
-          <w:b/>
-        </w:rPr>
-        <w:t>árbol de decisión</w:t>
-      </w:r>
-      <w:r>
-        <w:t xml:space="preserve"> divide recursivamente los datos mediante preguntas sobre las variables; es interpretable pero propenso al sobreajuste. El </w:t>
-      </w:r>
-      <w:r>
-        <w:rPr>
-          <w:b/>
-        </w:rPr>
-        <w:t>Random Forest</w:t>
-      </w:r>
-      <w:r>
-        <w:t xml:space="preserve"> combina muchos árboles entrenados sobre muestras y variables aleatorias (bagging), reduciendo la varianza. El </w:t>
-      </w:r>
-      <w:r>
-        <w:rPr>
-          <w:b/>
-        </w:rPr>
-        <w:t>AdaBoost</w:t>
-      </w:r>
-      <w:r>
-        <w:t xml:space="preserve"> construye árboles de forma secuencial, dando más peso a los casos mal clasificados (boosting). El </w:t>
-      </w:r>
-      <w:r>
-        <w:rPr>
-          <w:b/>
-        </w:rPr>
-        <w:t>Naive Bayes gaussiano</w:t>
-      </w:r>
-      <w:r>
-        <w:t xml:space="preserve"> es un clasificador probabilístico basado en el teorema de Bayes que asume independencia entre variables. Finalmente, la </w:t>
-      </w:r>
-      <w:r>
-        <w:rPr>
-          <w:b/>
-        </w:rPr>
-        <w:t>máquina de soporte vectorial (SVM)</w:t>
-      </w:r>
-      <w:r>
-        <w:t xml:space="preserve"> busca el hiperplano que mejor separa las clases y, por trabajar con distancias, requiere estandarizar las variables.</w:t>
-      </w:r>
-    </w:p>
-    <w:p>
-      <w:pPr>
-        <w:pStyle w:val="Heading2"/>
-      </w:pPr>
-      <w:r>
-        <w:rPr>
-          <w:color w:val="2A5A9C"/>
-        </w:rPr>
-        <w:t>2.7 Métricas de evaluación</w:t>
+        <w:t>2. Construir las variables temporales por equipo (retardo, media móvil, tendencia y antigüedad de estilo).</w:t>
       </w:r>
     </w:p>
     <w:p>
@@ -617,74 +742,7 @@
         <w:jc w:val="both"/>
       </w:pPr>
       <w:r>
-        <w:t xml:space="preserve">El </w:t>
-      </w:r>
-      <w:r>
-        <w:rPr>
-          <w:b/>
-        </w:rPr>
-        <w:t>accuracy</w:t>
-      </w:r>
-      <w:r>
-        <w:t xml:space="preserve"> es la proporción de predicciones correctas. Ante clases desbalanceadas resulta insuficiente, por lo que se complementa con la </w:t>
-      </w:r>
-      <w:r>
-        <w:rPr>
-          <w:b/>
-        </w:rPr>
-        <w:t>matriz de confusión</w:t>
-      </w:r>
-      <w:r>
-        <w:t xml:space="preserve"> (que desglosa aciertos y errores por clase) y con la </w:t>
-      </w:r>
-      <w:r>
-        <w:rPr>
-          <w:b/>
-        </w:rPr>
-        <w:t>precisión</w:t>
-      </w:r>
-      <w:r>
-        <w:t xml:space="preserve">, el </w:t>
-      </w:r>
-      <w:r>
-        <w:rPr>
-          <w:b/>
-        </w:rPr>
-        <w:t>recall</w:t>
-      </w:r>
-      <w:r>
-        <w:t xml:space="preserve"> y el </w:t>
-      </w:r>
-      <w:r>
-        <w:rPr>
-          <w:b/>
-        </w:rPr>
-        <w:t>F1</w:t>
-      </w:r>
-      <w:r>
-        <w:t xml:space="preserve"> por clase. La precisión responde a «de lo que predije como cumple, cuánto era correcto»; el recall, a «de los casos que realmente cumplían, cuántos detecté».</w:t>
-      </w:r>
-    </w:p>
-    <w:p>
-      <w:pPr>
-        <w:pStyle w:val="Heading1"/>
-      </w:pPr>
-      <w:r>
-        <w:rPr>
-          <w:color w:val="1A3D6D"/>
-        </w:rPr>
-        <w:t>3. Problemática, objetivos e hipótesis</w:t>
-      </w:r>
-    </w:p>
-    <w:p>
-      <w:pPr>
-        <w:pStyle w:val="Heading2"/>
-      </w:pPr>
-      <w:r>
-        <w:rPr>
-          <w:color w:val="2A5A9C"/>
-        </w:rPr>
-        <w:t>3.1 Planteamiento de la problemática</w:t>
+        <w:t>3. Aplicar selección de variables, evaluando el efecto de excluir la productividad objetivo.</w:t>
       </w:r>
     </w:p>
     <w:p>
@@ -693,16 +751,7 @@
         <w:jc w:val="both"/>
       </w:pPr>
       <w:r>
-        <w:t xml:space="preserve">La detección del bajo desempeño productivo en la fábrica es actualmente </w:t>
-      </w:r>
-      <w:r>
-        <w:rPr>
-          <w:b/>
-        </w:rPr>
-        <w:t>reactiva</w:t>
-      </w:r>
-      <w:r>
-        <w:t>: se confirma al finalizar la jornada, sin margen de intervención. Esto genera incumplimientos de entrega, sobrecostos por horas extra y una supervisión que distribuye su atención sin criterios anticipatorios. Se requiere, por tanto, un mecanismo que —utilizando el comportamiento reciente de cada equipo y sus condiciones operativas— permita anticipar sistemáticamente el riesgo de incumplimiento y priorizar la supervisión sobre los equipos más vulnerables.</w:t>
+        <w:t>4. Entrenar y comparar modelos de clasificación, evaluándolos con validación adecuada.</w:t>
       </w:r>
     </w:p>
     <w:p>
@@ -713,7 +762,7 @@
         <w:rPr>
           <w:color w:val="2A5A9C"/>
         </w:rPr>
-        <w:t>3.2 Objetivo general</w:t>
+        <w:t>3.4 Hipótesis</w:t>
       </w:r>
     </w:p>
     <w:p>
@@ -722,7 +771,21 @@
         <w:jc w:val="both"/>
       </w:pPr>
       <w:r>
-        <w:t>Construir y evaluar un modelo de clasificación binaria que determine si un equipo de una fábrica textil alcanzará su productividad objetivo en una jornada dada, logrando un accuracy de al menos 80%, a partir de variables operativas y del comportamiento temporal reciente del equipo.</w:t>
+        <w:rPr>
+          <w:i/>
+        </w:rPr>
+        <w:t>Es posible construir un modelo de clasificación que determine con al menos un 80% de certeza (accuracy) si un equipo de la fábrica alcanzará su productividad objetivo en una jornada dada, a partir de sus variables operativas y de su comportamiento temporal reciente.</w:t>
+      </w:r>
+    </w:p>
+    <w:p>
+      <w:pPr>
+        <w:pStyle w:val="Heading1"/>
+      </w:pPr>
+      <w:r>
+        <w:rPr>
+          <w:color w:val="1A3D6D"/>
+        </w:rPr>
+        <w:t>4. Comprensión de los Datos</w:t>
       </w:r>
     </w:p>
     <w:p>
@@ -733,7 +796,7 @@
         <w:rPr>
           <w:color w:val="2A5A9C"/>
         </w:rPr>
-        <w:t>3.3 Objetivos específicos</w:t>
+        <w:t>4.1 Descripción del Dataset</w:t>
       </w:r>
     </w:p>
     <w:p>
@@ -742,34 +805,34 @@
         <w:jc w:val="both"/>
       </w:pPr>
       <w:r>
-        <w:t>1. Explorar, limpiar y preparar los datos, tratando los valores nulos, corrigiendo categorías y discretizando la variable objetivo.</w:t>
-      </w:r>
-    </w:p>
-    <w:p>
-      <w:pPr>
-        <w:spacing w:after="160" w:line="276" w:lineRule="auto"/>
-        <w:jc w:val="both"/>
-      </w:pPr>
-      <w:r>
-        <w:t>2. Construir las variables temporales por equipo (retardo, media móvil, tendencia y antigüedad de estilo).</w:t>
-      </w:r>
-    </w:p>
-    <w:p>
-      <w:pPr>
-        <w:spacing w:after="160" w:line="276" w:lineRule="auto"/>
-        <w:jc w:val="both"/>
-      </w:pPr>
-      <w:r>
-        <w:t>3. Aplicar selección de variables de entrada, evaluando específicamente el efecto de excluir la productividad objetivo como predictor.</w:t>
-      </w:r>
-    </w:p>
-    <w:p>
-      <w:pPr>
-        <w:spacing w:after="160" w:line="276" w:lineRule="auto"/>
-        <w:jc w:val="both"/>
-      </w:pPr>
-      <w:r>
-        <w:t>4. Entrenar y comparar modelos de clasificación, evaluándolos por accuracy con validación cruzada.</w:t>
+        <w:t xml:space="preserve">Se utiliza el conjunto </w:t>
+      </w:r>
+      <w:r>
+        <w:rPr>
+          <w:b/>
+        </w:rPr>
+        <w:t>Productivity Prediction of Garment Employees</w:t>
+      </w:r>
+      <w:r>
+        <w:t xml:space="preserve"> (Imran, 2020; UCI Machine Learning Repository, id 597), con </w:t>
+      </w:r>
+      <w:r>
+        <w:rPr>
+          <w:b/>
+        </w:rPr>
+        <w:t>1197 registros</w:t>
+      </w:r>
+      <w:r>
+        <w:t xml:space="preserve"> y </w:t>
+      </w:r>
+      <w:r>
+        <w:rPr>
+          <w:b/>
+        </w:rPr>
+        <w:t>15 columnas</w:t>
+      </w:r>
+      <w:r>
+        <w:t xml:space="preserve"> (11 numéricas y 4 categóricas), correspondientes a un periodo de tres meses (enero a marzo de 2015). Cada registro describe el desempeño de un equipo en una jornada y un departamento.</w:t>
       </w:r>
     </w:p>
     <w:p>
@@ -780,88 +843,7 @@
         <w:rPr>
           <w:color w:val="2A5A9C"/>
         </w:rPr>
-        <w:t>3.4 Hipótesis</w:t>
-      </w:r>
-    </w:p>
-    <w:p>
-      <w:pPr>
-        <w:spacing w:after="160" w:line="276" w:lineRule="auto"/>
-        <w:jc w:val="both"/>
-      </w:pPr>
-      <w:r>
-        <w:rPr>
-          <w:i/>
-        </w:rPr>
-        <w:t>Es posible construir un modelo de clasificación que determine con al menos un 80% de certeza (accuracy) si un equipo de la fábrica alcanzará su productividad objetivo en una jornada dada, a partir de sus variables operativas y de su comportamiento temporal reciente.</w:t>
-      </w:r>
-    </w:p>
-    <w:p>
-      <w:pPr>
-        <w:pStyle w:val="Heading1"/>
-      </w:pPr>
-      <w:r>
-        <w:rPr>
-          <w:color w:val="1A3D6D"/>
-        </w:rPr>
-        <w:t>4. Metodología</w:t>
-      </w:r>
-    </w:p>
-    <w:p>
-      <w:pPr>
-        <w:spacing w:after="160" w:line="276" w:lineRule="auto"/>
-        <w:jc w:val="both"/>
-      </w:pPr>
-      <w:r>
-        <w:t xml:space="preserve">El trabajo se estructuró siguiendo las fases de </w:t>
-      </w:r>
-      <w:r>
-        <w:rPr>
-          <w:b/>
-        </w:rPr>
-        <w:t>CRISP-DM</w:t>
-      </w:r>
-      <w:r>
-        <w:t xml:space="preserve"> (Cross-Industry Standard Process for Data Mining; Wirth y Hipp, 2000), marco que organiza un proyecto de minería de datos en comprensión del negocio, comprensión de los datos, preparación, modelado y evaluación. Toda la implementación se realizó en Python con scikit-learn (Pedregosa et al., 2011), fijando la semilla aleatoria en 42 para garantizar la reproducibilidad de los resultados.</w:t>
-      </w:r>
-    </w:p>
-    <w:p>
-      <w:pPr>
-        <w:pStyle w:val="Heading2"/>
-      </w:pPr>
-      <w:r>
-        <w:rPr>
-          <w:color w:val="2A5A9C"/>
-        </w:rPr>
-        <w:t>4.1 Comprensión del negocio</w:t>
-      </w:r>
-    </w:p>
-    <w:p>
-      <w:pPr>
-        <w:spacing w:after="160" w:line="276" w:lineRule="auto"/>
-        <w:jc w:val="both"/>
-      </w:pPr>
-      <w:r>
-        <w:t>Esta fase se desarrolló en la Sección 3: se definió el problema como una clasificación binaria y se estableció la meta cuantitativa de 80% de accuracy, alineada con la necesidad de la fábrica de anticipar el cumplimiento de la productividad objetivo.</w:t>
-      </w:r>
-    </w:p>
-    <w:p>
-      <w:pPr>
-        <w:pStyle w:val="Heading2"/>
-      </w:pPr>
-      <w:r>
-        <w:rPr>
-          <w:color w:val="2A5A9C"/>
-        </w:rPr>
-        <w:t>4.2 Comprensión de los datos</w:t>
-      </w:r>
-    </w:p>
-    <w:p>
-      <w:pPr>
-        <w:spacing w:after="160" w:line="276" w:lineRule="auto"/>
-        <w:jc w:val="both"/>
-      </w:pPr>
-      <w:r>
-        <w:t>El conjunto de datos de Imran (2020) reúne 1197 registros y 15 columnas (11 numéricas y 4 categóricas), correspondientes a un periodo de tres meses (enero a marzo de 2015). Cada registro describe el desempeño de un equipo en una jornada y un departamento. La Tabla 1 detalla las variables.</w:t>
+        <w:t>4.2 Descripción de variables</w:t>
       </w:r>
     </w:p>
     <w:p>
@@ -1608,7 +1590,7 @@
               <w:rPr>
                 <w:sz w:val="18"/>
               </w:rPr>
-              <w:t>Productividad real (0–1); base del objetivo</w:t>
+              <w:t>Productividad real (0–1)</w:t>
             </w:r>
           </w:p>
         </w:tc>
@@ -1645,7 +1627,178 @@
         <w:jc w:val="both"/>
       </w:pPr>
       <w:r>
-        <w:t>El análisis exploratorio comenzó por la distribución de las variables clave (Figura 1). La productividad real se concentra en valores altos, con una marcada acumulación en torno al rango 0,70–0,80, lo que anticipa un predominio de jornadas que cumplen la meta. La productividad objetivo adopta un conjunto reducido de valores discretos (escalones administrativos fijados por la gerencia), y las horas extra presentan una distribución fuertemente sesgada a la derecha, con numerosos registros en cero y una cola de valores elevados.</w:t>
+        <w:rPr>
+          <w:b/>
+        </w:rPr>
+        <w:t>Input candidatos.</w:t>
+      </w:r>
+      <w:r>
+        <w:t xml:space="preserve"> Como variables de entrada se consideran las </w:t>
+      </w:r>
+      <w:r>
+        <w:rPr>
+          <w:b/>
+        </w:rPr>
+        <w:t>operativas</w:t>
+      </w:r>
+      <w:r>
+        <w:t xml:space="preserve"> (smv, wip, over_time, incentive, idle_time, idle_men, no_of_style_change, no_of_workers), las </w:t>
+      </w:r>
+      <w:r>
+        <w:rPr>
+          <w:b/>
+        </w:rPr>
+        <w:t>categóricas</w:t>
+      </w:r>
+      <w:r>
+        <w:t xml:space="preserve"> (day, week, department, team) y las </w:t>
+      </w:r>
+      <w:r>
+        <w:rPr>
+          <w:b/>
+        </w:rPr>
+        <w:t>temporales derivadas</w:t>
+      </w:r>
+      <w:r>
+        <w:t xml:space="preserve"> que se construyen en la preparación (retardo, media móvil, tendencia y antigüedad de estilo).</w:t>
+      </w:r>
+    </w:p>
+    <w:p>
+      <w:pPr>
+        <w:spacing w:after="160" w:line="276" w:lineRule="auto"/>
+        <w:jc w:val="both"/>
+      </w:pPr>
+      <w:r>
+        <w:rPr>
+          <w:b/>
+        </w:rPr>
+        <w:t>Target candidatos.</w:t>
+      </w:r>
+      <w:r>
+        <w:t xml:space="preserve"> La variable </w:t>
+      </w:r>
+      <w:r>
+        <w:rPr>
+          <w:b/>
+        </w:rPr>
+        <w:t>actual_productivity</w:t>
+      </w:r>
+      <w:r>
+        <w:t xml:space="preserve"> (continua, 0–1) es la base del objetivo: se discretiza en la etiqueta binaria </w:t>
+      </w:r>
+      <w:r>
+        <w:rPr>
+          <w:b/>
+        </w:rPr>
+        <w:t>cumple</w:t>
+      </w:r>
+      <w:r>
+        <w:t xml:space="preserve">. La variable </w:t>
+      </w:r>
+      <w:r>
+        <w:rPr>
+          <w:b/>
+        </w:rPr>
+        <w:t>targeted_productivity</w:t>
+      </w:r>
+      <w:r>
+        <w:t xml:space="preserve"> interviene en la definición del target (cumple si la real ≥ la objetivo); por su vínculo directo con la etiqueta se la trata como predictor «atajo» y se evalúa su exclusión de los inputs.</w:t>
+      </w:r>
+    </w:p>
+    <w:p>
+      <w:pPr>
+        <w:pStyle w:val="Heading1"/>
+      </w:pPr>
+      <w:r>
+        <w:rPr>
+          <w:color w:val="1A3D6D"/>
+        </w:rPr>
+        <w:t>5. Preparación de los Datos</w:t>
+      </w:r>
+    </w:p>
+    <w:p>
+      <w:pPr>
+        <w:pStyle w:val="Heading2"/>
+      </w:pPr>
+      <w:r>
+        <w:rPr>
+          <w:color w:val="2A5A9C"/>
+        </w:rPr>
+        <w:t>5.1 Tratamiento de valores perdidos</w:t>
+      </w:r>
+    </w:p>
+    <w:p>
+      <w:pPr>
+        <w:spacing w:after="160" w:line="276" w:lineRule="auto"/>
+        <w:jc w:val="both"/>
+      </w:pPr>
+      <w:r>
+        <w:t xml:space="preserve">La variable </w:t>
+      </w:r>
+      <w:r>
+        <w:rPr>
+          <w:b/>
+        </w:rPr>
+        <w:t>wip</w:t>
+      </w:r>
+      <w:r>
+        <w:t xml:space="preserve"> presenta </w:t>
+      </w:r>
+      <w:r>
+        <w:rPr>
+          <w:b/>
+        </w:rPr>
+        <w:t>506 valores nulos</w:t>
+      </w:r>
+      <w:r>
+        <w:t xml:space="preserve">, que no son aleatorios: corresponden al departamento finishing, en el que —por la naturaleza del proceso— no existe trabajo en proceso. Por ello se imputan con el valor </w:t>
+      </w:r>
+      <w:r>
+        <w:rPr>
+          <w:b/>
+        </w:rPr>
+        <w:t>0</w:t>
+      </w:r>
+      <w:r>
+        <w:t>, decisión semánticamente correcta que además conserva la totalidad de los registros.</w:t>
+      </w:r>
+    </w:p>
+    <w:p>
+      <w:pPr>
+        <w:pStyle w:val="Heading2"/>
+      </w:pPr>
+      <w:r>
+        <w:rPr>
+          <w:color w:val="2A5A9C"/>
+        </w:rPr>
+        <w:t>5.2 Análisis descriptivo de los datos</w:t>
+      </w:r>
+    </w:p>
+    <w:p>
+      <w:pPr>
+        <w:spacing w:after="160" w:line="276" w:lineRule="auto"/>
+        <w:jc w:val="both"/>
+      </w:pPr>
+      <w:r>
+        <w:t xml:space="preserve">El análisis exploratorio (Figura 1) muestra que la productividad real se concentra en valores altos (0,70–0,80), la productividad objetivo adopta valores discretos y las horas extra están sesgadas a la derecha. Al discretizar el objetivo, el balance de clases (Figura 2) es de </w:t>
+      </w:r>
+      <w:r>
+        <w:rPr>
+          <w:b/>
+        </w:rPr>
+        <w:t>875 «cumple» (73.1%)</w:t>
+      </w:r>
+      <w:r>
+        <w:t xml:space="preserve"> frente a </w:t>
+      </w:r>
+      <w:r>
+        <w:rPr>
+          <w:b/>
+        </w:rPr>
+        <w:t>322 «no cumple» (26.9%)</w:t>
+      </w:r>
+      <w:r>
+        <w:t>: un desbalance relevante, pues un clasificador trivial que siempre predijera «cumple» acertaría cerca del 73.1%.</w:t>
       </w:r>
     </w:p>
     <w:p>
@@ -1669,7 +1822,7 @@
           <w:i/>
           <w:sz w:val="19"/>
         </w:rPr>
-        <w:t>Distribución de las variables clave: productividad real, productividad objetivo y horas extra.</w:t>
+        <w:t>Distribución de las variables clave.</w:t>
       </w:r>
     </w:p>
     <w:p>
@@ -1728,25 +1881,7 @@
           <w:color w:val="555555"/>
           <w:sz w:val="17"/>
         </w:rPr>
-        <w:t>Elaboración propia con base en los datos de Imran (2020), procesados mediante scikit-learn (Pedregosa et al., 2011).</w:t>
-      </w:r>
-    </w:p>
-    <w:p>
-      <w:pPr>
-        <w:spacing w:after="160" w:line="276" w:lineRule="auto"/>
-        <w:jc w:val="both"/>
-      </w:pPr>
-      <w:r>
-        <w:t xml:space="preserve">A continuación se examinaron las relaciones lineales entre variables numéricas mediante un mapa de calor de correlaciones (Figura 2). Se detectaron </w:t>
-      </w:r>
-      <w:r>
-        <w:rPr>
-          <w:b/>
-        </w:rPr>
-        <w:t>redundancias relevantes</w:t>
-      </w:r>
-      <w:r>
-        <w:t>: la correlación entre el número de trabajadores y el tiempo estándar (no_of_workers y smv) alcanza 0.91, y entre las horas extra y el número de trabajadores (over_time y no_of_workers) 0.73. Estas correlaciones altas son esperables —equipos más grandes ejecutan tareas más extensas y acumulan más horas extra— pero implican información duplicada que se tendrá en cuenta en la selección de variables. El resto de las correlaciones es de magnitud baja a moderada, lo que sugiere que ninguna variable operativa explica por sí sola la productividad.</w:t>
+        <w:t>Elaboración propia con base en los datos de Imran (2020), procesados con scikit-learn (Pedregosa et al., 2011).</w:t>
       </w:r>
     </w:p>
     <w:p>
@@ -1770,7 +1905,7 @@
           <w:i/>
           <w:sz w:val="19"/>
         </w:rPr>
-        <w:t>Mapa de calor de correlaciones entre las variables numéricas del conjunto de datos.</w:t>
+        <w:t>Balance de clases de la variable objetivo (cumple).</w:t>
       </w:r>
     </w:p>
     <w:p>
@@ -1780,192 +1915,8 @@
       <w:r>
         <w:drawing>
           <wp:inline xmlns:a="http://schemas.openxmlformats.org/drawingml/2006/main" xmlns:pic="http://schemas.openxmlformats.org/drawingml/2006/picture">
-            <wp:extent cx="6120000" cy="5129335"/>
+            <wp:extent cx="3420000" cy="2718601"/>
             <wp:docPr id="2" name="Picture 2"/>
-            <wp:cNvGraphicFramePr>
-              <a:graphicFrameLocks noChangeAspect="1"/>
-            </wp:cNvGraphicFramePr>
-            <a:graphic>
-              <a:graphicData uri="http://schemas.openxmlformats.org/drawingml/2006/picture">
-                <pic:pic>
-                  <pic:nvPicPr>
-                    <pic:cNvPr id="0" name="fig2_correlaciones.png"/>
-                    <pic:cNvPicPr/>
-                  </pic:nvPicPr>
-                  <pic:blipFill>
-                    <a:blip r:embed="rId10"/>
-                    <a:stretch>
-                      <a:fillRect/>
-                    </a:stretch>
-                  </pic:blipFill>
-                  <pic:spPr>
-                    <a:xfrm>
-                      <a:off x="0" y="0"/>
-                      <a:ext cx="6120000" cy="5129335"/>
-                    </a:xfrm>
-                    <a:prstGeom prst="rect"/>
-                  </pic:spPr>
-                </pic:pic>
-              </a:graphicData>
-            </a:graphic>
-          </wp:inline>
-        </w:drawing>
-      </w:r>
-    </w:p>
-    <w:p>
-      <w:pPr>
-        <w:spacing w:after="240"/>
-      </w:pPr>
-      <w:r>
-        <w:rPr>
-          <w:i/>
-          <w:color w:val="555555"/>
-          <w:sz w:val="17"/>
-        </w:rPr>
-        <w:t xml:space="preserve">Nota. </w:t>
-      </w:r>
-      <w:r>
-        <w:rPr>
-          <w:color w:val="555555"/>
-          <w:sz w:val="17"/>
-        </w:rPr>
-        <w:t>Elaboración propia con base en los datos de Imran (2020), procesados mediante scikit-learn (Pedregosa et al., 2011).</w:t>
-      </w:r>
-    </w:p>
-    <w:p>
-      <w:pPr>
-        <w:pStyle w:val="Heading2"/>
-      </w:pPr>
-      <w:r>
-        <w:rPr>
-          <w:color w:val="2A5A9C"/>
-        </w:rPr>
-        <w:t>4.3 Preparación de los datos</w:t>
-      </w:r>
-    </w:p>
-    <w:p>
-      <w:pPr>
-        <w:spacing w:after="160" w:line="276" w:lineRule="auto"/>
-        <w:jc w:val="both"/>
-      </w:pPr>
-      <w:r>
-        <w:t xml:space="preserve">Esta fase concentró el grueso de la manipulación. En primer lugar, se trataron los </w:t>
-      </w:r>
-      <w:r>
-        <w:rPr>
-          <w:b/>
-        </w:rPr>
-        <w:t>506 valores nulos de la variable wip</w:t>
-      </w:r>
-      <w:r>
-        <w:t>. El análisis reveló que estos nulos no son aleatorios: corresponden al departamento finishing, en el que —por la naturaleza del proceso— no existe trabajo en proceso. Por ello se imputaron con el valor 0, decisión semánticamente correcta que además conserva la totalidad de los registros.</w:t>
-      </w:r>
-    </w:p>
-    <w:p>
-      <w:pPr>
-        <w:spacing w:after="160" w:line="276" w:lineRule="auto"/>
-        <w:jc w:val="both"/>
-      </w:pPr>
-      <w:r>
-        <w:t xml:space="preserve">En segundo lugar, se corrigió un </w:t>
-      </w:r>
-      <w:r>
-        <w:rPr>
-          <w:b/>
-        </w:rPr>
-        <w:t>error tipográfico</w:t>
-      </w:r>
-      <w:r>
-        <w:t xml:space="preserve"> en la variable department, donde la categoría «sweing» debía ser «sewing»; se normalizaron además los espacios y las mayúsculas. En tercer lugar, se identificó que la variable quarter, pese a su nombre, </w:t>
-      </w:r>
-      <w:r>
-        <w:rPr>
-          <w:b/>
-        </w:rPr>
-        <w:t>no representa un trimestre sino la semana del mes</w:t>
-      </w:r>
-      <w:r>
-        <w:t>; se renombró a week y se extrajo su valor numérico. Por último, la variable date se convirtió a tipo fecha, requisito indispensable para el ordenamiento temporal posterior.</w:t>
-      </w:r>
-    </w:p>
-    <w:p>
-      <w:pPr>
-        <w:spacing w:after="160" w:line="276" w:lineRule="auto"/>
-        <w:jc w:val="both"/>
-      </w:pPr>
-      <w:r>
-        <w:t xml:space="preserve">La </w:t>
-      </w:r>
-      <w:r>
-        <w:rPr>
-          <w:b/>
-        </w:rPr>
-        <w:t>variable objetivo</w:t>
-      </w:r>
-      <w:r>
-        <w:t xml:space="preserve"> se construyó comparando, en cada registro, la productividad real con la objetivo: se asignó la etiqueta «cumple» (1) cuando la real es igual o superior a la objetivo, y «no cumple» (0) en caso contrario. El balance resultante (Figura 3) es de </w:t>
-      </w:r>
-      <w:r>
-        <w:rPr>
-          <w:b/>
-        </w:rPr>
-        <w:t>875 casos «cumple» (73.1%)</w:t>
-      </w:r>
-      <w:r>
-        <w:t xml:space="preserve"> frente a </w:t>
-      </w:r>
-      <w:r>
-        <w:rPr>
-          <w:b/>
-        </w:rPr>
-        <w:t>322 «no cumple» (26.9%)</w:t>
-      </w:r>
-      <w:r>
-        <w:t xml:space="preserve">. Este </w:t>
-      </w:r>
-      <w:r>
-        <w:rPr>
-          <w:b/>
-        </w:rPr>
-        <w:t>desbalance</w:t>
-      </w:r>
-      <w:r>
-        <w:t xml:space="preserve"> es metodológicamente importante: un clasificador trivial que predijera siempre «cumple» acertaría cerca del 73.1% de las veces, por lo que ése es el piso que cualquier modelo útil debe superar de forma significativa.</w:t>
-      </w:r>
-    </w:p>
-    <w:p>
-      <w:pPr>
-        <w:spacing w:after="20"/>
-      </w:pPr>
-      <w:r>
-        <w:rPr>
-          <w:b/>
-          <w:sz w:val="19"/>
-        </w:rPr>
-        <w:t>Figura 3</w:t>
-      </w:r>
-    </w:p>
-    <w:p>
-      <w:pPr>
-        <w:spacing w:after="40"/>
-      </w:pPr>
-      <w:r>
-        <w:rPr>
-          <w:i/>
-          <w:sz w:val="19"/>
-        </w:rPr>
-        <w:t>Balance de clases de la variable objetivo (cumple).</w:t>
-      </w:r>
-    </w:p>
-    <w:p>
-      <w:pPr>
-        <w:jc w:val="center"/>
-      </w:pPr>
-      <w:r>
-        <w:drawing>
-          <wp:inline xmlns:a="http://schemas.openxmlformats.org/drawingml/2006/main" xmlns:pic="http://schemas.openxmlformats.org/drawingml/2006/picture">
-            <wp:extent cx="3420000" cy="2718601"/>
-            <wp:docPr id="3" name="Picture 3"/>
             <wp:cNvGraphicFramePr>
               <a:graphicFrameLocks noChangeAspect="1"/>
             </wp:cNvGraphicFramePr>
@@ -1977,7 +1928,7 @@
                     <pic:cNvPicPr/>
                   </pic:nvPicPr>
                   <pic:blipFill>
-                    <a:blip r:embed="rId11"/>
+                    <a:blip r:embed="rId10"/>
                     <a:stretch>
                       <a:fillRect/>
                     </a:stretch>
@@ -2013,7 +1964,7 @@
           <w:color w:val="555555"/>
           <w:sz w:val="17"/>
         </w:rPr>
-        <w:t>Elaboración propia con base en los datos de Imran (2020), procesados mediante scikit-learn (Pedregosa et al., 2011).</w:t>
+        <w:t>Elaboración propia con base en los datos de Imran (2020), procesados con scikit-learn (Pedregosa et al., 2011).</w:t>
       </w:r>
     </w:p>
     <w:p>
@@ -2022,129 +1973,108 @@
         <w:jc w:val="both"/>
       </w:pPr>
       <w:r>
+        <w:t xml:space="preserve">Se analizaron además los </w:t>
+      </w:r>
+      <w:r>
         <w:rPr>
           <w:b/>
         </w:rPr>
-        <w:t>Construcción de las variables temporales por equipo (eje del proyecto).</w:t>
-      </w:r>
-      <w:r>
-        <w:t xml:space="preserve"> Tras ordenar los registros por equipo y fecha, se generaron cuatro variables de historial reciente: </w:t>
+        <w:t>valores atípicos</w:t>
+      </w:r>
+      <w:r>
+        <w:t xml:space="preserve"> con el criterio del rango intercuartílico (IQR; Figura 3, Tabla 2). Se hallaron extremos operativos legítimos (wip hasta 23.122, over_time hasta 25.920) y «atípicos» que son artefactos de variables discretas (no_of_style_change, idle_time). En consecuencia, se optó por </w:t>
       </w:r>
       <w:r>
         <w:rPr>
           <w:b/>
         </w:rPr>
-        <w:t>prod_lag1</w:t>
-      </w:r>
-      <w:r>
-        <w:t xml:space="preserve">, la productividad de la jornada inmediatamente anterior del equipo; </w:t>
-      </w:r>
-      <w:r>
-        <w:rPr>
-          <w:b/>
-        </w:rPr>
-        <w:t>prod_media_movil3</w:t>
-      </w:r>
-      <w:r>
-        <w:t xml:space="preserve">, la media móvil de las tres jornadas previas, que suaviza el ruido diario; </w:t>
-      </w:r>
-      <w:r>
-        <w:rPr>
-          <w:b/>
-        </w:rPr>
-        <w:t>tendencia</w:t>
-      </w:r>
-      <w:r>
-        <w:t xml:space="preserve">, un indicador binario de si la productividad venía subiendo respecto del registro anterior; y </w:t>
-      </w:r>
-      <w:r>
-        <w:rPr>
-          <w:b/>
-        </w:rPr>
-        <w:t>reg_desde_cambio_estilo</w:t>
-      </w:r>
-      <w:r>
-        <w:t xml:space="preserve">, el número de jornadas transcurridas desde el último cambio de estilo, que aproxima la curva de aprendizaje del equipo ante un nuevo producto. Es fundamental destacar que </w:t>
-      </w:r>
-      <w:r>
-        <w:rPr>
-          <w:b/>
-        </w:rPr>
-        <w:t>todas estas variables se calcularon exclusivamente con información pasada</w:t>
-      </w:r>
-      <w:r>
-        <w:t xml:space="preserve"> (mediante desplazamientos temporales), de modo que nunca incorporan el dato del día actual. Tras eliminar el primer registro de cada equipo quedaron 1185 registros válidos para el modelado.</w:t>
+        <w:t>conservarlos</w:t>
+      </w:r>
+      <w:r>
+        <w:t xml:space="preserve"> (sin recorte ni winsorización): representan eventos reales que interesa predecir, el Random Forest es robusto a ellos y la SVM se estandariza.</w:t>
       </w:r>
     </w:p>
     <w:p>
       <w:pPr>
-        <w:spacing w:after="160" w:line="276" w:lineRule="auto"/>
-        <w:jc w:val="both"/>
+        <w:spacing w:after="20"/>
       </w:pPr>
       <w:r>
         <w:rPr>
           <w:b/>
+          <w:sz w:val="19"/>
         </w:rPr>
-        <w:t>Codificación y definición de conjuntos.</w:t>
-      </w:r>
-      <w:r>
-        <w:t xml:space="preserve"> Las variables categóricas (day, week, department y team) se transformaron mediante one-hot encoding. Con el propósito de poner a prueba la robustez del modelo, se definieron deliberadamente </w:t>
-      </w:r>
-      <w:r>
-        <w:rPr>
-          <w:b/>
-        </w:rPr>
-        <w:t>dos conjuntos de variables</w:t>
-      </w:r>
-      <w:r>
-        <w:t xml:space="preserve">: el </w:t>
-      </w:r>
-      <w:r>
-        <w:rPr>
-          <w:b/>
-        </w:rPr>
-        <w:t>Conjunto A</w:t>
-      </w:r>
-      <w:r>
-        <w:t xml:space="preserve"> (34 variables), que incluye la productividad objetivo, y el </w:t>
-      </w:r>
-      <w:r>
-        <w:rPr>
-          <w:b/>
-        </w:rPr>
-        <w:t>Conjunto B</w:t>
-      </w:r>
-      <w:r>
-        <w:t xml:space="preserve"> (33 variables), que la excluye. La productividad objetivo es un predictor «atajo»: al estar directamente ligada a la definición de la etiqueta, podría inflar el rendimiento sin que el modelo aprenda patrones operativos reales. Comparar ambos conjuntos permite demostrar que la predicción se sostiene en información genuina.</w:t>
+        <w:t>Figura 3</w:t>
       </w:r>
     </w:p>
     <w:p>
       <w:pPr>
-        <w:pStyle w:val="Heading2"/>
+        <w:spacing w:after="40"/>
       </w:pPr>
       <w:r>
         <w:rPr>
-          <w:color w:val="2A5A9C"/>
+          <w:i/>
+          <w:sz w:val="19"/>
         </w:rPr>
-        <w:t>4.4 Análisis y tratamiento de valores atípicos (outliers)</w:t>
+        <w:t>Diagramas de caja de las variables operativas (detección de valores atípicos).</w:t>
       </w:r>
     </w:p>
     <w:p>
       <w:pPr>
-        <w:spacing w:after="160" w:line="276" w:lineRule="auto"/>
-        <w:jc w:val="both"/>
+        <w:jc w:val="center"/>
       </w:pPr>
       <w:r>
-        <w:t xml:space="preserve">Antes del modelado se realizó un análisis de valores atípicos sobre las variables numéricas mediante el criterio del </w:t>
-      </w:r>
+        <w:drawing>
+          <wp:inline xmlns:a="http://schemas.openxmlformats.org/drawingml/2006/main" xmlns:pic="http://schemas.openxmlformats.org/drawingml/2006/picture">
+            <wp:extent cx="6120000" cy="2839502"/>
+            <wp:docPr id="3" name="Picture 3"/>
+            <wp:cNvGraphicFramePr>
+              <a:graphicFrameLocks noChangeAspect="1"/>
+            </wp:cNvGraphicFramePr>
+            <a:graphic>
+              <a:graphicData uri="http://schemas.openxmlformats.org/drawingml/2006/picture">
+                <pic:pic>
+                  <pic:nvPicPr>
+                    <pic:cNvPr id="0" name="fig_outliers.png"/>
+                    <pic:cNvPicPr/>
+                  </pic:nvPicPr>
+                  <pic:blipFill>
+                    <a:blip r:embed="rId11"/>
+                    <a:stretch>
+                      <a:fillRect/>
+                    </a:stretch>
+                  </pic:blipFill>
+                  <pic:spPr>
+                    <a:xfrm>
+                      <a:off x="0" y="0"/>
+                      <a:ext cx="6120000" cy="2839502"/>
+                    </a:xfrm>
+                    <a:prstGeom prst="rect"/>
+                  </pic:spPr>
+                </pic:pic>
+              </a:graphicData>
+            </a:graphic>
+          </wp:inline>
+        </w:drawing>
+      </w:r>
+    </w:p>
+    <w:p>
+      <w:pPr>
+        <w:spacing w:after="240"/>
+      </w:pPr>
       <w:r>
         <w:rPr>
-          <w:b/>
+          <w:i/>
+          <w:color w:val="555555"/>
+          <w:sz w:val="17"/>
         </w:rPr>
-        <w:t>rango intercuartílico (IQR)</w:t>
-      </w:r>
-      <w:r>
-        <w:t>, que marca como atípico todo valor situado a más de 1,5·IQR por debajo del primer cuartil o por encima del tercero. La Figura 4 presenta los diagramas de caja de las principales variables operativas y la Tabla 2 resume la incidencia de atípicos por variable.</w:t>
+        <w:t xml:space="preserve">Nota. </w:t>
+      </w:r>
+      <w:r>
+        <w:rPr>
+          <w:color w:val="555555"/>
+          <w:sz w:val="17"/>
+        </w:rPr>
+        <w:t>Elaboración propia con base en los datos de Imran (2020), procesados con scikit-learn (Pedregosa et al., 2011).</w:t>
       </w:r>
     </w:p>
     <w:p>
@@ -2704,6 +2634,154 @@
     </w:p>
     <w:p>
       <w:pPr>
+        <w:pStyle w:val="Heading2"/>
+      </w:pPr>
+      <w:r>
+        <w:rPr>
+          <w:color w:val="2A5A9C"/>
+        </w:rPr>
+        <w:t>5.3 Transformación de variables</w:t>
+      </w:r>
+    </w:p>
+    <w:p>
+      <w:pPr>
+        <w:spacing w:after="160" w:line="276" w:lineRule="auto"/>
+        <w:jc w:val="both"/>
+      </w:pPr>
+      <w:r>
+        <w:t xml:space="preserve">Se corrigió el error tipográfico del departamento («sweing» → «sewing»); se reinterpretó </w:t>
+      </w:r>
+      <w:r>
+        <w:rPr>
+          <w:b/>
+        </w:rPr>
+        <w:t>quarter</w:t>
+      </w:r>
+      <w:r>
+        <w:t xml:space="preserve"> como la </w:t>
+      </w:r>
+      <w:r>
+        <w:rPr>
+          <w:b/>
+        </w:rPr>
+        <w:t>semana del mes</w:t>
+      </w:r>
+      <w:r>
+        <w:t xml:space="preserve"> (renombrada week); se convirtió </w:t>
+      </w:r>
+      <w:r>
+        <w:rPr>
+          <w:b/>
+        </w:rPr>
+        <w:t>date</w:t>
+      </w:r>
+      <w:r>
+        <w:t xml:space="preserve"> a tipo fecha; y se discretizó el objetivo en </w:t>
+      </w:r>
+      <w:r>
+        <w:rPr>
+          <w:b/>
+        </w:rPr>
+        <w:t>cumple = 1</w:t>
+      </w:r>
+      <w:r>
+        <w:t xml:space="preserve"> si actual_productivity ≥ targeted_productivity, y 0 en caso contrario. Además, se </w:t>
+      </w:r>
+      <w:r>
+        <w:rPr>
+          <w:b/>
+        </w:rPr>
+        <w:t>construyeron las variables temporales por equipo</w:t>
+      </w:r>
+      <w:r>
+        <w:t xml:space="preserve"> (eje del proyecto): tras ordenar por equipo y fecha se derivaron </w:t>
+      </w:r>
+      <w:r>
+        <w:rPr>
+          <w:b/>
+        </w:rPr>
+        <w:t>prod_lag1</w:t>
+      </w:r>
+      <w:r>
+        <w:t xml:space="preserve"> (jornada anterior), </w:t>
+      </w:r>
+      <w:r>
+        <w:rPr>
+          <w:b/>
+        </w:rPr>
+        <w:t>prod_media_movil3</w:t>
+      </w:r>
+      <w:r>
+        <w:t xml:space="preserve"> (media de 3 jornadas), </w:t>
+      </w:r>
+      <w:r>
+        <w:rPr>
+          <w:b/>
+        </w:rPr>
+        <w:t>tendencia</w:t>
+      </w:r>
+      <w:r>
+        <w:t xml:space="preserve"> (sube/baja) y </w:t>
+      </w:r>
+      <w:r>
+        <w:rPr>
+          <w:b/>
+        </w:rPr>
+        <w:t>reg_desde_cambio_estilo</w:t>
+      </w:r>
+      <w:r>
+        <w:t xml:space="preserve">, todas calculadas </w:t>
+      </w:r>
+      <w:r>
+        <w:rPr>
+          <w:b/>
+        </w:rPr>
+        <w:t>solo con información pasada</w:t>
+      </w:r>
+      <w:r>
+        <w:t xml:space="preserve"> para no generar fuga. Finalmente, las categóricas se transformaron con </w:t>
+      </w:r>
+      <w:r>
+        <w:rPr>
+          <w:b/>
+        </w:rPr>
+        <w:t>one-hot encoding</w:t>
+      </w:r>
+      <w:r>
+        <w:t>.</w:t>
+      </w:r>
+    </w:p>
+    <w:p>
+      <w:pPr>
+        <w:pStyle w:val="Heading2"/>
+      </w:pPr>
+      <w:r>
+        <w:rPr>
+          <w:color w:val="2A5A9C"/>
+        </w:rPr>
+        <w:t>5.4 Agrupamiento de variables</w:t>
+      </w:r>
+    </w:p>
+    <w:p>
+      <w:pPr>
+        <w:spacing w:after="160" w:line="276" w:lineRule="auto"/>
+        <w:jc w:val="both"/>
+      </w:pPr>
+      <w:r>
+        <w:t xml:space="preserve">Se examinaron las relaciones entre variables numéricas mediante un mapa de calor de correlaciones (Figura 4). Se detectaron </w:t>
+      </w:r>
+      <w:r>
+        <w:rPr>
+          <w:b/>
+        </w:rPr>
+        <w:t>grupos de variables redundantes</w:t>
+      </w:r>
+      <w:r>
+        <w:t>: no_of_workers, smv y over_time están fuertemente correlacionadas (no_of_workers–smv = 0.91; over_time–no_of_workers = 0.73), por lo que aportan información parcialmente duplicada. Este agrupamiento orienta la selección de variables. Adicionalmente, cada variable categórica se agrupa en sus categorías mediante one-hot, y de forma exploratoria se aplicó un agrupamiento no supervisado (K-Means) que se comenta junto al análisis factorial.</w:t>
+      </w:r>
+    </w:p>
+    <w:p>
+      <w:pPr>
         <w:spacing w:after="20"/>
       </w:pPr>
       <w:r>
@@ -2723,7 +2801,7 @@
           <w:i/>
           <w:sz w:val="19"/>
         </w:rPr>
-        <w:t>Diagramas de caja de las principales variables operativas para la detección de valores atípicos.</w:t>
+        <w:t>Mapa de calor de correlaciones entre las variables numéricas.</w:t>
       </w:r>
     </w:p>
     <w:p>
@@ -2733,7 +2811,7 @@
       <w:r>
         <w:drawing>
           <wp:inline xmlns:a="http://schemas.openxmlformats.org/drawingml/2006/main" xmlns:pic="http://schemas.openxmlformats.org/drawingml/2006/picture">
-            <wp:extent cx="6120000" cy="2839502"/>
+            <wp:extent cx="6120000" cy="5129335"/>
             <wp:docPr id="4" name="Picture 4"/>
             <wp:cNvGraphicFramePr>
               <a:graphicFrameLocks noChangeAspect="1"/>
@@ -2742,7 +2820,7 @@
               <a:graphicData uri="http://schemas.openxmlformats.org/drawingml/2006/picture">
                 <pic:pic>
                   <pic:nvPicPr>
-                    <pic:cNvPr id="0" name="fig_outliers.png"/>
+                    <pic:cNvPr id="0" name="fig2_correlaciones.png"/>
                     <pic:cNvPicPr/>
                   </pic:nvPicPr>
                   <pic:blipFill>
@@ -2754,7 +2832,7 @@
                   <pic:spPr>
                     <a:xfrm>
                       <a:off x="0" y="0"/>
-                      <a:ext cx="6120000" cy="2839502"/>
+                      <a:ext cx="6120000" cy="5129335"/>
                     </a:xfrm>
                     <a:prstGeom prst="rect"/>
                   </pic:spPr>
@@ -2782,7 +2860,18 @@
           <w:color w:val="555555"/>
           <w:sz w:val="17"/>
         </w:rPr>
-        <w:t>Elaboración propia con base en los datos de Imran (2020), procesados mediante scikit-learn (Pedregosa et al., 2011).</w:t>
+        <w:t>Elaboración propia con base en los datos de Imran (2020), procesados con scikit-learn (Pedregosa et al., 2011).</w:t>
+      </w:r>
+    </w:p>
+    <w:p>
+      <w:pPr>
+        <w:pStyle w:val="Heading2"/>
+      </w:pPr>
+      <w:r>
+        <w:rPr>
+          <w:color w:val="2A5A9C"/>
+        </w:rPr>
+        <w:t>5.5 Análisis Factorial</w:t>
       </w:r>
     </w:p>
     <w:p>
@@ -2791,25 +2880,146 @@
         <w:jc w:val="both"/>
       </w:pPr>
       <w:r>
-        <w:t xml:space="preserve">El análisis arrojó tres hallazgos. Primero, algunas variables presentan valores extremos aislados pero </w:t>
+        <w:t xml:space="preserve">Para explorar la estructura latente de los datos y reducir la dimensionalidad se aplicó un </w:t>
       </w:r>
       <w:r>
         <w:rPr>
           <w:b/>
         </w:rPr>
-        <w:t>operativamente legítimos</w:t>
-      </w:r>
-      <w:r>
-        <w:t xml:space="preserve">: wip alcanza un máximo de 23.122 unidades, over_time de 25.920 minutos e incentive de 3.600, cifras plausibles en jornadas de equipos grandes o con lotes voluminosos, y no errores de registro. Segundo, buena parte de los «atípicos» detectados por el IQR son en realidad </w:t>
+        <w:t>Análisis de Componentes Principales (PCA)</w:t>
+      </w:r>
+      <w:r>
+        <w:t xml:space="preserve">, técnica emparentada con el análisis factorial. Las dos primeras componentes explican solo el </w:t>
       </w:r>
       <w:r>
         <w:rPr>
           <w:b/>
         </w:rPr>
-        <w:t>artefactos de variables discretas o dispersas</w:t>
-      </w:r>
-      <w:r>
-        <w:t>: no_of_style_change se marca en un 12,3% de los casos simplemente porque su valor habitual es 0 y cualquier cambio (1 o 2) queda fuera del rango; algo análogo ocurre con idle_time e idle_men, nulos salvo en incidencias puntuales. Tercero, la variable actual_productivity registra algunos valores levemente superiores a 1 (máximo 1.12), correspondientes a jornadas de sobrecumplimiento, que no constituyen un error.</w:t>
+        <w:t>18.8%</w:t>
+      </w:r>
+      <w:r>
+        <w:t xml:space="preserve"> de la varianza —reflejo de la alta dimensionalidad tras la codificación— y las clases aparecen </w:t>
+      </w:r>
+      <w:r>
+        <w:rPr>
+          <w:b/>
+        </w:rPr>
+        <w:t>solapadas</w:t>
+      </w:r>
+      <w:r>
+        <w:t xml:space="preserve"> (Figura 5). Un agrupamiento </w:t>
+      </w:r>
+      <w:r>
+        <w:rPr>
+          <w:b/>
+        </w:rPr>
+        <w:t>K-Means (k=2)</w:t>
+      </w:r>
+      <w:r>
+        <w:t xml:space="preserve"> sobre el mismo espacio no reproduce las clases, lo que confirma que el problema </w:t>
+      </w:r>
+      <w:r>
+        <w:rPr>
+          <w:b/>
+        </w:rPr>
+        <w:t>no es trivialmente separable</w:t>
+      </w:r>
+      <w:r>
+        <w:t xml:space="preserve"> y justifica el uso de modelos supervisados no lineales.</w:t>
+      </w:r>
+    </w:p>
+    <w:p>
+      <w:pPr>
+        <w:spacing w:after="20"/>
+      </w:pPr>
+      <w:r>
+        <w:rPr>
+          <w:b/>
+          <w:sz w:val="19"/>
+        </w:rPr>
+        <w:t>Figura 5</w:t>
+      </w:r>
+    </w:p>
+    <w:p>
+      <w:pPr>
+        <w:spacing w:after="40"/>
+      </w:pPr>
+      <w:r>
+        <w:rPr>
+          <w:i/>
+          <w:sz w:val="19"/>
+        </w:rPr>
+        <w:t>Proyección PCA en 2D por clase real (izquierda) y por clúster de K-Means (derecha).</w:t>
+      </w:r>
+    </w:p>
+    <w:p>
+      <w:pPr>
+        <w:jc w:val="center"/>
+      </w:pPr>
+      <w:r>
+        <w:drawing>
+          <wp:inline xmlns:a="http://schemas.openxmlformats.org/drawingml/2006/main" xmlns:pic="http://schemas.openxmlformats.org/drawingml/2006/picture">
+            <wp:extent cx="6120000" cy="2033544"/>
+            <wp:docPr id="5" name="Picture 5"/>
+            <wp:cNvGraphicFramePr>
+              <a:graphicFrameLocks noChangeAspect="1"/>
+            </wp:cNvGraphicFramePr>
+            <a:graphic>
+              <a:graphicData uri="http://schemas.openxmlformats.org/drawingml/2006/picture">
+                <pic:pic>
+                  <pic:nvPicPr>
+                    <pic:cNvPr id="0" name="fig7_pca_kmeans.png"/>
+                    <pic:cNvPicPr/>
+                  </pic:nvPicPr>
+                  <pic:blipFill>
+                    <a:blip r:embed="rId13"/>
+                    <a:stretch>
+                      <a:fillRect/>
+                    </a:stretch>
+                  </pic:blipFill>
+                  <pic:spPr>
+                    <a:xfrm>
+                      <a:off x="0" y="0"/>
+                      <a:ext cx="6120000" cy="2033544"/>
+                    </a:xfrm>
+                    <a:prstGeom prst="rect"/>
+                  </pic:spPr>
+                </pic:pic>
+              </a:graphicData>
+            </a:graphic>
+          </wp:inline>
+        </w:drawing>
+      </w:r>
+    </w:p>
+    <w:p>
+      <w:pPr>
+        <w:spacing w:after="240"/>
+      </w:pPr>
+      <w:r>
+        <w:rPr>
+          <w:i/>
+          <w:color w:val="555555"/>
+          <w:sz w:val="17"/>
+        </w:rPr>
+        <w:t xml:space="preserve">Nota. </w:t>
+      </w:r>
+      <w:r>
+        <w:rPr>
+          <w:color w:val="555555"/>
+          <w:sz w:val="17"/>
+        </w:rPr>
+        <w:t>Elaboración propia con base en los datos de Imran (2020), procesados con scikit-learn (Pedregosa et al., 2011).</w:t>
+      </w:r>
+    </w:p>
+    <w:p>
+      <w:pPr>
+        <w:pStyle w:val="Heading2"/>
+      </w:pPr>
+      <w:r>
+        <w:rPr>
+          <w:color w:val="2A5A9C"/>
+        </w:rPr>
+        <w:t>5.6 Definición de variables Input y Target</w:t>
       </w:r>
     </w:p>
     <w:p>
@@ -2818,110 +3028,61 @@
         <w:jc w:val="both"/>
       </w:pPr>
       <w:r>
-        <w:t xml:space="preserve">En consecuencia, la estrategia adoptada fue la </w:t>
+        <w:t xml:space="preserve">El </w:t>
       </w:r>
       <w:r>
         <w:rPr>
           <w:b/>
         </w:rPr>
-        <w:t>conservación justificada de los valores atípicos</w:t>
-      </w:r>
-      <w:r>
-        <w:t xml:space="preserve">, sin recorte ni winsorización, por tres razones: (i) los extremos representan eventos reales del proceso productivo —precisamente los equipos excepcionales o en dificultades que interesa predecir—, de modo que eliminarlos descartaría señal valiosa; (ii) el modelo finalmente seleccionado, el Random Forest, se basa en árboles de decisión que dividen por umbrales y son </w:t>
+        <w:t>target</w:t>
+      </w:r>
+      <w:r>
+        <w:t xml:space="preserve"> es la variable binaria </w:t>
       </w:r>
       <w:r>
         <w:rPr>
           <w:b/>
         </w:rPr>
-        <w:t>intrínsecamente robustos a los valores atípicos</w:t>
-      </w:r>
-      <w:r>
-        <w:t>, que no distorsionan sus particiones; y (iii) para la SVM, sensible a la escala, el efecto de los extremos se neutralizó con la estandarización (StandardScaler) incluida en su flujo. El único ajuste de calidad aplicado sobre los datos crudos fue la imputación de los nulos de wip descrita en la sección anterior.</w:t>
-      </w:r>
-    </w:p>
-    <w:p>
-      <w:pPr>
-        <w:pStyle w:val="Heading2"/>
-      </w:pPr>
-      <w:r>
-        <w:rPr>
-          <w:color w:val="2A5A9C"/>
-        </w:rPr>
-        <w:t>4.5 Partición temporal y control de la fuga de información</w:t>
-      </w:r>
-    </w:p>
-    <w:p>
-      <w:pPr>
-        <w:spacing w:after="160" w:line="276" w:lineRule="auto"/>
-        <w:jc w:val="both"/>
-      </w:pPr>
-      <w:r>
-        <w:t xml:space="preserve">Dado que el conjunto incorpora variables de historial, </w:t>
+        <w:t>cumple</w:t>
+      </w:r>
+      <w:r>
+        <w:t xml:space="preserve">. Como </w:t>
       </w:r>
       <w:r>
         <w:rPr>
           <w:b/>
         </w:rPr>
-        <w:t>una partición aleatoria habría provocado fuga de información</w:t>
-      </w:r>
-      <w:r>
-        <w:t xml:space="preserve">: registros futuros de un equipo podrían quedar en el conjunto de entrenamiento y emplearse para predecir su propio pasado. Para evitarlo, se utilizó una </w:t>
+        <w:t>inputs</w:t>
+      </w:r>
+      <w:r>
+        <w:t xml:space="preserve"> se excluyen date, actual_productivity y cumple (para evitar fuga) y, tras la codificación, se definen dos conjuntos: el </w:t>
       </w:r>
       <w:r>
         <w:rPr>
           <w:b/>
         </w:rPr>
-        <w:t>partición temporal</w:t>
-      </w:r>
-      <w:r>
-        <w:t>: se entrenó con las jornadas más antiguas (anteriores al 2015-02-26, 931 registros) y se evaluó con las más recientes (254 registros). Este esquema reproduce el escenario real de uso, en el que se predice el futuro a partir del pasado, y ofrece una estimación honesta del desempeño esperado en producción.</w:t>
-      </w:r>
-    </w:p>
-    <w:p>
-      <w:pPr>
-        <w:pStyle w:val="Heading2"/>
-      </w:pPr>
-      <w:r>
-        <w:rPr>
-          <w:color w:val="2A5A9C"/>
-        </w:rPr>
-        <w:t>4.6 Modelado y selección de variables</w:t>
-      </w:r>
-    </w:p>
-    <w:p>
-      <w:pPr>
-        <w:spacing w:after="160" w:line="276" w:lineRule="auto"/>
-        <w:jc w:val="both"/>
-      </w:pPr>
-      <w:r>
-        <w:t>Sobre el Conjunto B se entrenaron y compararon los cinco modelos descritos en el marco conceptual: árbol de decisión, Random Forest (300 árboles), AdaBoost (200 estimadores), Naive Bayes gaussiano y SVM con kernel radial, esta última encapsulada en un flujo que estandariza previamente las variables. La estabilidad de cada modelo se verificó mediante validación cruzada estratificada de cinco pliegues sobre el conjunto de entrenamiento.</w:t>
-      </w:r>
-    </w:p>
-    <w:p>
-      <w:pPr>
-        <w:spacing w:after="160" w:line="276" w:lineRule="auto"/>
-        <w:jc w:val="both"/>
-      </w:pPr>
-      <w:r>
-        <w:t xml:space="preserve">Para la </w:t>
+        <w:t>Conjunto A</w:t>
+      </w:r>
+      <w:r>
+        <w:t xml:space="preserve"> (34 variables, con targeted_productivity) y el </w:t>
       </w:r>
       <w:r>
         <w:rPr>
           <w:b/>
         </w:rPr>
-        <w:t>selección de variables</w:t>
-      </w:r>
-      <w:r>
-        <w:t xml:space="preserve"> se empleó la importancia que el Random Forest asigna a cada predictor (Figura 5). El resultado más destacable es que la importancia se distribuye de forma relativamente equilibrada —ningún predictor domina en solitario— y que entre los más relevantes conviven variables operativas (incentive, smv, no_of_workers, over_time) con </w:t>
+        <w:t>Conjunto B</w:t>
+      </w:r>
+      <w:r>
+        <w:t xml:space="preserve"> (33 variables, sin ese predictor «atajo»). La importancia estimada por Random Forest (Figura 6) guía la selección: entre las variables más relevantes conviven operativas (incentive, smv) con </w:t>
       </w:r>
       <w:r>
         <w:rPr>
           <w:b/>
         </w:rPr>
-        <w:t>dos de las variables temporales construidas en este trabajo</w:t>
-      </w:r>
-      <w:r>
-        <w:t>: la media móvil (prod_media_movil3) y el retardo (prod_lag1). Esto constituye evidencia directa a favor del eje del proyecto: el historial reciente del equipo aporta poder predictivo real.</w:t>
+        <w:t>dos variables temporales construidas en el proyecto</w:t>
+      </w:r>
+      <w:r>
+        <w:t xml:space="preserve"> (prod_media_movil3 y prod_lag1), evidencia directa del aporte del historial reciente.</w:t>
       </w:r>
     </w:p>
     <w:p>
@@ -2933,7 +3094,7 @@
           <w:b/>
           <w:sz w:val="19"/>
         </w:rPr>
-        <w:t>Figura 5</w:t>
+        <w:t>Figura 6</w:t>
       </w:r>
     </w:p>
     <w:p>
@@ -2945,7 +3106,7 @@
           <w:i/>
           <w:sz w:val="19"/>
         </w:rPr>
-        <w:t>Importancia de variables según Random Forest sobre el Conjunto B (sin productividad objetivo).</w:t>
+        <w:t>Importancia de variables según Random Forest (Conjunto B).</w:t>
       </w:r>
     </w:p>
     <w:p>
@@ -2956,7 +3117,7 @@
         <w:drawing>
           <wp:inline xmlns:a="http://schemas.openxmlformats.org/drawingml/2006/main" xmlns:pic="http://schemas.openxmlformats.org/drawingml/2006/picture">
             <wp:extent cx="6120000" cy="4564475"/>
-            <wp:docPr id="5" name="Picture 5"/>
+            <wp:docPr id="6" name="Picture 6"/>
             <wp:cNvGraphicFramePr>
               <a:graphicFrameLocks noChangeAspect="1"/>
             </wp:cNvGraphicFramePr>
@@ -2968,7 +3129,7 @@
                     <pic:cNvPicPr/>
                   </pic:nvPicPr>
                   <pic:blipFill>
-                    <a:blip r:embed="rId13"/>
+                    <a:blip r:embed="rId14"/>
                     <a:stretch>
                       <a:fillRect/>
                     </a:stretch>
@@ -3004,7 +3165,7 @@
           <w:color w:val="555555"/>
           <w:sz w:val="17"/>
         </w:rPr>
-        <w:t>Elaboración propia con base en los datos de Imran (2020), procesados mediante scikit-learn (Pedregosa et al., 2011).</w:t>
+        <w:t>Elaboración propia con base en los datos de Imran (2020), procesados con scikit-learn (Pedregosa et al., 2011).</w:t>
       </w:r>
     </w:p>
     <w:p>
@@ -3015,7 +3176,18 @@
         <w:rPr>
           <w:color w:val="1A3D6D"/>
         </w:rPr>
-        <w:t>5. Resultados</w:t>
+        <w:t>6. Modelado y Evaluación</w:t>
+      </w:r>
+    </w:p>
+    <w:p>
+      <w:pPr>
+        <w:pStyle w:val="Heading2"/>
+      </w:pPr>
+      <w:r>
+        <w:rPr>
+          <w:color w:val="2A5A9C"/>
+        </w:rPr>
+        <w:t>6.1 Segmentación de los datos</w:t>
       </w:r>
     </w:p>
     <w:p>
@@ -3024,16 +3196,101 @@
         <w:jc w:val="both"/>
       </w:pPr>
       <w:r>
-        <w:t xml:space="preserve">La Tabla 3 y la Figura 6 sintetizan el accuracy de cada modelo sobre el conjunto de prueba temporal. El mejor desempeño correspondió al </w:t>
+        <w:t xml:space="preserve">Como el conjunto incorpora variables de historial, </w:t>
       </w:r>
       <w:r>
         <w:rPr>
           <w:b/>
         </w:rPr>
-        <w:t>Random Forest, con un 87.0%</w:t>
-      </w:r>
-      <w:r>
-        <w:t>, seguido por la SVM (85.0%) y AdaBoost (81.1%). Tres de los cinco modelos alcanzaron o superaron la meta del 80%, mientras que el árbol de decisión (76.0%) y el Naive Bayes (78.0%) quedaron por debajo, aunque ambos superaron la línea base trivial de 73.2%.</w:t>
+        <w:t>no se usó una partición aleatoria</w:t>
+      </w:r>
+      <w:r>
+        <w:t xml:space="preserve"> (provocaría fuga de información). Se empleó una </w:t>
+      </w:r>
+      <w:r>
+        <w:rPr>
+          <w:b/>
+        </w:rPr>
+        <w:t>partición temporal</w:t>
+      </w:r>
+      <w:r>
+        <w:t>: entrenamiento con las jornadas más antiguas (anteriores al 2015-02-26, 931 registros) y evaluación con las más recientes (254 registros), reproduciendo el escenario real de predecir el futuro a partir del pasado.</w:t>
+      </w:r>
+    </w:p>
+    <w:p>
+      <w:pPr>
+        <w:pStyle w:val="Heading2"/>
+      </w:pPr>
+      <w:r>
+        <w:rPr>
+          <w:color w:val="2A5A9C"/>
+        </w:rPr>
+        <w:t>6.2 Aplicación de diversos modelos</w:t>
+      </w:r>
+    </w:p>
+    <w:p>
+      <w:pPr>
+        <w:spacing w:after="160" w:line="276" w:lineRule="auto"/>
+        <w:jc w:val="both"/>
+      </w:pPr>
+      <w:r>
+        <w:t xml:space="preserve">Sobre el Conjunto B se entrenaron y compararon cinco modelos: </w:t>
+      </w:r>
+      <w:r>
+        <w:rPr>
+          <w:b/>
+        </w:rPr>
+        <w:t>árbol de decisión, Random Forest (300 árboles), AdaBoost (200 estimadores), Naive Bayes gaussiano y SVM</w:t>
+      </w:r>
+      <w:r>
+        <w:t xml:space="preserve"> (kernel RBF, con estandarización previa), evaluados con validación cruzada estratificada de cinco pliegues. Como extensión, se evaluaron </w:t>
+      </w:r>
+      <w:r>
+        <w:rPr>
+          <w:b/>
+        </w:rPr>
+        <w:t>modelos de gradient boosting</w:t>
+      </w:r>
+      <w:r>
+        <w:t xml:space="preserve"> (HistGradientBoosting, XGBoost, LightGBM) y el </w:t>
+      </w:r>
+      <w:r>
+        <w:rPr>
+          <w:b/>
+        </w:rPr>
+        <w:t>manejo del desbalance</w:t>
+      </w:r>
+      <w:r>
+        <w:t xml:space="preserve"> (ponderación de clases y sobremuestreo SMOTE), bajo un protocolo de validación más estricto (walk-forward).</w:t>
+      </w:r>
+    </w:p>
+    <w:p>
+      <w:pPr>
+        <w:pStyle w:val="Heading2"/>
+      </w:pPr>
+      <w:r>
+        <w:rPr>
+          <w:color w:val="2A5A9C"/>
+        </w:rPr>
+        <w:t>6.3 Validación de los diversos modelos</w:t>
+      </w:r>
+    </w:p>
+    <w:p>
+      <w:pPr>
+        <w:spacing w:after="160" w:line="276" w:lineRule="auto"/>
+        <w:jc w:val="both"/>
+      </w:pPr>
+      <w:r>
+        <w:t xml:space="preserve">La Tabla 3 y la Figura 7 resumen el accuracy sobre el conjunto de prueba. El mejor modelo fue el </w:t>
+      </w:r>
+      <w:r>
+        <w:rPr>
+          <w:b/>
+        </w:rPr>
+        <w:t>Random Forest, con 87.0%</w:t>
+      </w:r>
+      <w:r>
+        <w:t>, seguido por la SVM (85.0%) y AdaBoost (81.1%); tres de los cinco superaron la meta del 80%. Todos superan la línea base trivial de 73.2%.</w:t>
       </w:r>
     </w:p>
     <w:p>
@@ -3057,7 +3314,7 @@
           <w:i/>
           <w:sz w:val="19"/>
         </w:rPr>
-        <w:t>Comparación de accuracy por modelo sobre el conjunto de prueba (Conjunto B).</w:t>
+        <w:t>Comparación de accuracy por modelo (Conjunto B).</w:t>
       </w:r>
     </w:p>
     <w:tbl>
@@ -3380,7 +3637,7 @@
           <w:b/>
           <w:sz w:val="19"/>
         </w:rPr>
-        <w:t>Figura 6</w:t>
+        <w:t>Figura 7</w:t>
       </w:r>
     </w:p>
     <w:p>
@@ -3392,7 +3649,7 @@
           <w:i/>
           <w:sz w:val="19"/>
         </w:rPr>
-        <w:t>Comparación del accuracy por modelo frente a la meta del 80% (línea roja discontinua).</w:t>
+        <w:t>Comparación del accuracy por modelo frente a la meta del 80%.</w:t>
       </w:r>
     </w:p>
     <w:p>
@@ -3403,7 +3660,7 @@
         <w:drawing>
           <wp:inline xmlns:a="http://schemas.openxmlformats.org/drawingml/2006/main" xmlns:pic="http://schemas.openxmlformats.org/drawingml/2006/picture">
             <wp:extent cx="6120000" cy="3355614"/>
-            <wp:docPr id="6" name="Picture 6"/>
+            <wp:docPr id="7" name="Picture 7"/>
             <wp:cNvGraphicFramePr>
               <a:graphicFrameLocks noChangeAspect="1"/>
             </wp:cNvGraphicFramePr>
@@ -3415,7 +3672,7 @@
                     <pic:cNvPicPr/>
                   </pic:nvPicPr>
                   <pic:blipFill>
-                    <a:blip r:embed="rId14"/>
+                    <a:blip r:embed="rId15"/>
                     <a:stretch>
                       <a:fillRect/>
                     </a:stretch>
@@ -3451,7 +3708,7 @@
           <w:color w:val="555555"/>
           <w:sz w:val="17"/>
         </w:rPr>
-        <w:t>Elaboración propia con base en los datos de Imran (2020), procesados mediante scikit-learn (Pedregosa et al., 2011).</w:t>
+        <w:t>Elaboración propia con base en los datos de Imran (2020), procesados con scikit-learn (Pedregosa et al., 2011).</w:t>
       </w:r>
     </w:p>
     <w:p>
@@ -3460,45 +3717,7 @@
         <w:jc w:val="both"/>
       </w:pPr>
       <w:r>
-        <w:t>La Figura 6 evidencia con claridad la jerarquía entre familias de modelos: los métodos de ensemble (Random Forest y AdaBoost) y la SVM se ubican por sobre los modelos individuales más simples. La superioridad del Random Forest es consistente con la naturaleza del problema, en el que múltiples variables interactúan de manera no lineal y ningún predictor resulta dominante, condiciones en las que la combinación de muchos árboles reduce la varianza y mejora la generalización.</w:t>
-      </w:r>
-    </w:p>
-    <w:p>
-      <w:pPr>
-        <w:pStyle w:val="Heading2"/>
-      </w:pPr>
-      <w:r>
-        <w:rPr>
-          <w:color w:val="2A5A9C"/>
-        </w:rPr>
-        <w:t>5.1 Análisis de las matrices de confusión</w:t>
-      </w:r>
-    </w:p>
-    <w:p>
-      <w:pPr>
-        <w:spacing w:after="160" w:line="276" w:lineRule="auto"/>
-        <w:jc w:val="both"/>
-      </w:pPr>
-      <w:r>
-        <w:t xml:space="preserve">Las matrices de confusión (Figura 7) permiten ir más allá del accuracy y observar </w:t>
-      </w:r>
-      <w:r>
-        <w:rPr>
-          <w:b/>
-        </w:rPr>
-        <w:t>qué tipo de error comete cada modelo</w:t>
-      </w:r>
-      <w:r>
-        <w:t>. Tomando el mejor modelo, el Random Forest, sobre los 254 casos de prueba (186 «cumple» y 68 «no cumple») clasificó correctamente 173 de los 186 casos que sí cumplían (recall de 93.0%) y 48 de los 68 que no cumplían (recall de 70.6%). Es decir, el modelo es muy fiable detectando a los equipos que cumplirán y, aun con la dificultad propia de la clase minoritaria, identifica a cerca de siete de cada diez equipos en riesgo de no cumplir —precisamente los casos de mayor interés operativo para la supervisión.</w:t>
-      </w:r>
-    </w:p>
-    <w:p>
-      <w:pPr>
-        <w:spacing w:after="160" w:line="276" w:lineRule="auto"/>
-        <w:jc w:val="both"/>
-      </w:pPr>
-      <w:r>
-        <w:t>De forma transversal, todos los modelos exhiben un patrón coherente con el desbalance: aciertan con facilidad la clase mayoritaria («cumple») y concentran sus errores en la clase minoritaria. La SVM logra el mayor recall en «cumple» pero a costa de más falsos positivos en «no cumple», mientras que el Random Forest ofrece el mejor equilibrio entre ambas clases. Esta lectura es relevante porque, en el contexto de la fábrica, no detectar a un equipo en riesgo (un falso negativo) suele ser más costoso que una falsa alarma.</w:t>
+        <w:t>Las matrices de confusión (Figura 8) muestran el tipo de error. El Random Forest clasificó correctamente 173 de 186 casos «cumple» (recall 93.0%) y 48 de 68 «no cumple» (recall 70.6%), con el mejor equilibrio entre clases —relevante porque no detectar a un equipo en riesgo es el error más costoso.</w:t>
       </w:r>
     </w:p>
     <w:p>
@@ -3510,7 +3729,7 @@
           <w:b/>
           <w:sz w:val="19"/>
         </w:rPr>
-        <w:t>Figura 7</w:t>
+        <w:t>Figura 8</w:t>
       </w:r>
     </w:p>
     <w:p>
@@ -3522,7 +3741,7 @@
           <w:i/>
           <w:sz w:val="19"/>
         </w:rPr>
-        <w:t>Matrices de confusión por modelo sobre el conjunto de prueba (Conjunto B).</w:t>
+        <w:t>Matrices de confusión por modelo (Conjunto B).</w:t>
       </w:r>
     </w:p>
     <w:p>
@@ -3533,7 +3752,7 @@
         <w:drawing>
           <wp:inline xmlns:a="http://schemas.openxmlformats.org/drawingml/2006/main" xmlns:pic="http://schemas.openxmlformats.org/drawingml/2006/picture">
             <wp:extent cx="6120000" cy="3682889"/>
-            <wp:docPr id="7" name="Picture 7"/>
+            <wp:docPr id="8" name="Picture 8"/>
             <wp:cNvGraphicFramePr>
               <a:graphicFrameLocks noChangeAspect="1"/>
             </wp:cNvGraphicFramePr>
@@ -3545,7 +3764,7 @@
                     <pic:cNvPicPr/>
                   </pic:nvPicPr>
                   <pic:blipFill>
-                    <a:blip r:embed="rId15"/>
+                    <a:blip r:embed="rId16"/>
                     <a:stretch>
                       <a:fillRect/>
                     </a:stretch>
@@ -3581,18 +3800,7 @@
           <w:color w:val="555555"/>
           <w:sz w:val="17"/>
         </w:rPr>
-        <w:t>Elaboración propia con base en los datos de Imran (2020), procesados mediante scikit-learn (Pedregosa et al., 2011).</w:t>
-      </w:r>
-    </w:p>
-    <w:p>
-      <w:pPr>
-        <w:pStyle w:val="Heading2"/>
-      </w:pPr>
-      <w:r>
-        <w:rPr>
-          <w:color w:val="2A5A9C"/>
-        </w:rPr>
-        <w:t>5.2 Efecto del predictor «atajo»</w:t>
+        <w:t>Elaboración propia con base en los datos de Imran (2020), procesados con scikit-learn (Pedregosa et al., 2011).</w:t>
       </w:r>
     </w:p>
     <w:p>
@@ -3601,36 +3809,22 @@
         <w:jc w:val="both"/>
       </w:pPr>
       <w:r>
-        <w:t xml:space="preserve">Un resultado central del estudio es la comparación entre los conjuntos de variables. Utilizando el Random Forest, el Conjunto A (que incluye la productividad objetivo) alcanzó un 85.8%, mientras que el Conjunto B (que la excluye) obtuvo un 87.0%. El hecho de que el Conjunto B no solo iguale sino que </w:t>
-      </w:r>
-      <w:r>
         <w:rPr>
           <w:b/>
         </w:rPr>
-        <w:t>supere</w:t>
-      </w:r>
-      <w:r>
-        <w:t xml:space="preserve"> al Conjunto A demuestra de forma contundente que el modelo </w:t>
+        <w:t>Efecto del predictor «atajo».</w:t>
+      </w:r>
+      <w:r>
+        <w:t xml:space="preserve"> Con Random Forest, el Conjunto A alcanzó 85.8% y el Conjunto B 87.0%: el hecho de que B iguale e incluso supere a A demuestra que el modelo </w:t>
       </w:r>
       <w:r>
         <w:rPr>
           <w:b/>
         </w:rPr>
-        <w:t>no depende del predictor «atajo»</w:t>
-      </w:r>
-      <w:r>
-        <w:t>: la capacidad predictiva proviene genuinamente de las variables operativas y, sobre todo, de las variables temporales de historial. Este hallazgo valida el enfoque metodológico y refuerza la credibilidad del modelo de cara a un uso real.</w:t>
-      </w:r>
-    </w:p>
-    <w:p>
-      <w:pPr>
-        <w:pStyle w:val="Heading2"/>
-      </w:pPr>
-      <w:r>
-        <w:rPr>
-          <w:color w:val="2A5A9C"/>
-        </w:rPr>
-        <w:t>5.3 Exploración complementaria: PCA y K-Means</w:t>
+        <w:t>no depende del atajo</w:t>
+      </w:r>
+      <w:r>
+        <w:t>, sustentándose en variables operativas y temporales genuinas.</w:t>
       </w:r>
     </w:p>
     <w:p>
@@ -3639,173 +3833,22 @@
         <w:jc w:val="both"/>
       </w:pPr>
       <w:r>
-        <w:t xml:space="preserve">Como análisis complementario se aplicó una reducción de dimensionalidad mediante Análisis de Componentes Principales (PCA) y un agrupamiento no supervisado con K-Means (Figura 8). Las dos primeras componentes principales explican únicamente el 18.8% de la varianza total, porcentaje bajo que se explica por la alta dimensionalidad introducida por la codificación one-hot. En la proyección, las clases «cumple» y «no cumple» aparecen considerablemente </w:t>
-      </w:r>
-      <w:r>
         <w:rPr>
           <w:b/>
         </w:rPr>
-        <w:t>solapadas</w:t>
-      </w:r>
-      <w:r>
-        <w:t xml:space="preserve">, y los clústeres hallados por K-Means no reproducen la separación entre clases. Lejos de ser un resultado negativo, esto confirma que el problema </w:t>
+        <w:t>Validación adicional.</w:t>
+      </w:r>
+      <w:r>
+        <w:t xml:space="preserve"> Bajo una validación </w:t>
       </w:r>
       <w:r>
         <w:rPr>
           <w:b/>
         </w:rPr>
-        <w:t>no es trivialmente separable</w:t>
-      </w:r>
-      <w:r>
-        <w:t xml:space="preserve"> en el espacio de las variables, lo que justifica el recurso a modelos supervisados no lineales como el Random Forest y dimensiona el mérito del 87% de accuracy alcanzado.</w:t>
-      </w:r>
-    </w:p>
-    <w:p>
-      <w:pPr>
-        <w:spacing w:after="20"/>
-      </w:pPr>
-      <w:r>
-        <w:rPr>
-          <w:b/>
-          <w:sz w:val="19"/>
-        </w:rPr>
-        <w:t>Figura 8</w:t>
-      </w:r>
-    </w:p>
-    <w:p>
-      <w:pPr>
-        <w:spacing w:after="40"/>
-      </w:pPr>
-      <w:r>
-        <w:rPr>
-          <w:i/>
-          <w:sz w:val="19"/>
-        </w:rPr>
-        <w:t>Proyección PCA en 2D coloreada por clase real (izquierda) y por clúster de K-Means (derecha).</w:t>
-      </w:r>
-    </w:p>
-    <w:p>
-      <w:pPr>
-        <w:jc w:val="center"/>
-      </w:pPr>
-      <w:r>
-        <w:drawing>
-          <wp:inline xmlns:a="http://schemas.openxmlformats.org/drawingml/2006/main" xmlns:pic="http://schemas.openxmlformats.org/drawingml/2006/picture">
-            <wp:extent cx="6120000" cy="2033544"/>
-            <wp:docPr id="8" name="Picture 8"/>
-            <wp:cNvGraphicFramePr>
-              <a:graphicFrameLocks noChangeAspect="1"/>
-            </wp:cNvGraphicFramePr>
-            <a:graphic>
-              <a:graphicData uri="http://schemas.openxmlformats.org/drawingml/2006/picture">
-                <pic:pic>
-                  <pic:nvPicPr>
-                    <pic:cNvPr id="0" name="fig7_pca_kmeans.png"/>
-                    <pic:cNvPicPr/>
-                  </pic:nvPicPr>
-                  <pic:blipFill>
-                    <a:blip r:embed="rId16"/>
-                    <a:stretch>
-                      <a:fillRect/>
-                    </a:stretch>
-                  </pic:blipFill>
-                  <pic:spPr>
-                    <a:xfrm>
-                      <a:off x="0" y="0"/>
-                      <a:ext cx="6120000" cy="2033544"/>
-                    </a:xfrm>
-                    <a:prstGeom prst="rect"/>
-                  </pic:spPr>
-                </pic:pic>
-              </a:graphicData>
-            </a:graphic>
-          </wp:inline>
-        </w:drawing>
-      </w:r>
-    </w:p>
-    <w:p>
-      <w:pPr>
-        <w:spacing w:after="240"/>
-      </w:pPr>
-      <w:r>
-        <w:rPr>
-          <w:i/>
-          <w:color w:val="555555"/>
-          <w:sz w:val="17"/>
-        </w:rPr>
-        <w:t xml:space="preserve">Nota. </w:t>
-      </w:r>
-      <w:r>
-        <w:rPr>
-          <w:color w:val="555555"/>
-          <w:sz w:val="17"/>
-        </w:rPr>
-        <w:t>Elaboración propia con base en los datos de Imran (2020), procesados mediante scikit-learn (Pedregosa et al., 2011).</w:t>
-      </w:r>
-    </w:p>
-    <w:p>
-      <w:pPr>
-        <w:pStyle w:val="Heading2"/>
-      </w:pPr>
-      <w:r>
-        <w:rPr>
-          <w:color w:val="2A5A9C"/>
-        </w:rPr>
-        <w:t>5.4 Validación adicional: variables enriquecidas y walk-forward</w:t>
-      </w:r>
-    </w:p>
-    <w:p>
-      <w:pPr>
-        <w:spacing w:after="160" w:line="276" w:lineRule="auto"/>
-        <w:jc w:val="both"/>
-      </w:pPr>
-      <w:r>
-        <w:t>Como contraste de solidez de los resultados anteriores, se desarrollaron las principales líneas de mejora propuestas como trabajo futuro (documento complementario) bajo un protocolo de evaluación más estricto.</w:t>
-      </w:r>
-    </w:p>
-    <w:p>
-      <w:pPr>
-        <w:spacing w:after="160" w:line="276" w:lineRule="auto"/>
-        <w:jc w:val="both"/>
-      </w:pPr>
-      <w:r>
-        <w:t xml:space="preserve">Los cambios aplicados fueron: (i) </w:t>
-      </w:r>
-      <w:r>
-        <w:rPr>
-          <w:b/>
-        </w:rPr>
-        <w:t>ingeniería de variables enriquecida</w:t>
-      </w:r>
-      <w:r>
-        <w:t xml:space="preserve">, añadiendo retardos y medias móviles adicionales (retardo de dos jornadas, media móvil de cinco, delta respecto a la media reciente) y el historial de incentive y over_time, pasando de 33 a 40 variables; (ii) </w:t>
-      </w:r>
-      <w:r>
-        <w:rPr>
-          <w:b/>
-        </w:rPr>
-        <w:t>validación walk-forward</w:t>
-      </w:r>
-      <w:r>
-        <w:t xml:space="preserve"> (TimeSeriesSplit de cinco particiones), que entrena y evalúa avanzando en el tiempo en lugar de un único corte; (iii) </w:t>
-      </w:r>
-      <w:r>
-        <w:rPr>
-          <w:b/>
-        </w:rPr>
-        <w:t>métricas robustas</w:t>
-      </w:r>
-      <w:r>
-        <w:t xml:space="preserve">, reportando —además del accuracy— el F1 y el PR-AUC de la clase «no cumple» (la minoritaria y de mayor interés operativo); y (iv) </w:t>
-      </w:r>
-      <w:r>
-        <w:rPr>
-          <w:b/>
-        </w:rPr>
-        <w:t>modelos adicionales</w:t>
-      </w:r>
-      <w:r>
-        <w:t>: gradient boosting (HistGradientBoosting, XGBoost, LightGBM) y manejo del desbalance (ponderación de clases y sobremuestreo SMOTE). La Tabla 4 y la Figura 9 resumen los resultados.</w:t>
+        <w:t>walk-forward</w:t>
+      </w:r>
+      <w:r>
+        <w:t xml:space="preserve"> (más estricta) con variables enriquecidas y métricas robustas (Tabla 4, Figura 9), el Random Forest se sitúa en torno a 0.808 de accuracy —más realista que el corte único—, las features enriquecidas resultan la mejor palanca, el gradient boosting no supera al RF con este tamaño de datos, y el manejo del desbalance (SMOTE) eleva el F1 de «no cumple» a 0.619 a costa del accuracy, lo que confirma la importancia de elegir una métrica acorde al objetivo.</w:t>
       </w:r>
     </w:p>
     <w:p>
@@ -4368,7 +4411,7 @@
           <w:i/>
           <w:sz w:val="19"/>
         </w:rPr>
-        <w:t>Comparación de modelos en las tres métricas bajo validación walk-forward; la línea roja marca la base trivial.</w:t>
+        <w:t>Comparación de modelos en tres métricas bajo validación walk-forward.</w:t>
       </w:r>
     </w:p>
     <w:p>
@@ -4427,7 +4470,29 @@
           <w:color w:val="555555"/>
           <w:sz w:val="17"/>
         </w:rPr>
-        <w:t>Elaboración propia con base en los datos de Imran (2020), procesados mediante scikit-learn (Pedregosa et al., 2011).</w:t>
+        <w:t>Elaboración propia con base en los datos de Imran (2020), procesados con scikit-learn (Pedregosa et al., 2011).</w:t>
+      </w:r>
+    </w:p>
+    <w:p>
+      <w:pPr>
+        <w:pStyle w:val="Heading1"/>
+      </w:pPr>
+      <w:r>
+        <w:rPr>
+          <w:color w:val="1A3D6D"/>
+        </w:rPr>
+        <w:t>7. Conclusiones</w:t>
+      </w:r>
+    </w:p>
+    <w:p>
+      <w:pPr>
+        <w:pStyle w:val="Heading2"/>
+      </w:pPr>
+      <w:r>
+        <w:rPr>
+          <w:color w:val="2A5A9C"/>
+        </w:rPr>
+        <w:t>7.1 Resumen del trabajo efectuado</w:t>
       </w:r>
     </w:p>
     <w:p>
@@ -4436,25 +4501,18 @@
         <w:jc w:val="both"/>
       </w:pPr>
       <w:r>
-        <w:t xml:space="preserve">Se observan cuatro hallazgos. Primero, la </w:t>
-      </w:r>
+        <w:t>Se desarrolló un flujo completo de minería de datos conforme a CRISP-DM para predecir el cumplimiento de la productividad objetivo de equipos textiles, formulado como clasificación binaria. Se comprendió y preparó el conjunto de datos (nulos, transformación, construcción de variables temporales, agrupamiento y reducción dimensional), se definieron los conjuntos de entrada y se compararon cinco modelos bajo una partición temporal, con una validación adicional walk-forward.</w:t>
+      </w:r>
+    </w:p>
+    <w:p>
+      <w:pPr>
+        <w:pStyle w:val="Heading2"/>
+      </w:pPr>
       <w:r>
         <w:rPr>
-          <w:b/>
+          <w:color w:val="2A5A9C"/>
         </w:rPr>
-        <w:t>validación walk-forward</w:t>
-      </w:r>
-      <w:r>
-        <w:t xml:space="preserve"> —más exigente que el corte único usado en la evaluación principal— sitúa al Random Forest en torno a 0.808 de accuracy, por debajo del 87% obtenido con una sola partición; esta cifra es más realista y </w:t>
-      </w:r>
-      <w:r>
-        <w:rPr>
-          <w:b/>
-        </w:rPr>
-        <w:t>confirma el riesgo de sobreajuste</w:t>
-      </w:r>
-      <w:r>
-        <w:t xml:space="preserve"> de una validación menos estricta.</w:t>
+        <w:t>7.2 Modelo seleccionado y motivos</w:t>
       </w:r>
     </w:p>
     <w:p>
@@ -4463,16 +4521,63 @@
         <w:jc w:val="both"/>
       </w:pPr>
       <w:r>
-        <w:t xml:space="preserve">Segundo, la </w:t>
+        <w:t xml:space="preserve">Se selecciona el </w:t>
       </w:r>
       <w:r>
         <w:rPr>
           <w:b/>
         </w:rPr>
-        <w:t>ingeniería de variables enriquecida</w:t>
-      </w:r>
-      <w:r>
-        <w:t xml:space="preserve"> fue la palanca más efectiva: el accuracy del Random Forest subió de 0.794 a 0.808 y, sobre todo, el modelo se volvió más estable entre particiones.</w:t>
+        <w:t>Random Forest</w:t>
+      </w:r>
+      <w:r>
+        <w:t xml:space="preserve"> como modelo final. Los motivos: obtuvo el </w:t>
+      </w:r>
+      <w:r>
+        <w:rPr>
+          <w:b/>
+        </w:rPr>
+        <w:t>mayor accuracy (87.0%)</w:t>
+      </w:r>
+      <w:r>
+        <w:t xml:space="preserve">, superando la meta del 80%; presentó el </w:t>
+      </w:r>
+      <w:r>
+        <w:rPr>
+          <w:b/>
+        </w:rPr>
+        <w:t>mejor equilibrio entre clases</w:t>
+      </w:r>
+      <w:r>
+        <w:t xml:space="preserve"> en las matrices de confusión; se mostró el </w:t>
+      </w:r>
+      <w:r>
+        <w:rPr>
+          <w:b/>
+        </w:rPr>
+        <w:t>más estable</w:t>
+      </w:r>
+      <w:r>
+        <w:t xml:space="preserve"> bajo la validación walk-forward; y es </w:t>
+      </w:r>
+      <w:r>
+        <w:rPr>
+          <w:b/>
+        </w:rPr>
+        <w:t>robusto a los valores atípicos</w:t>
+      </w:r>
+      <w:r>
+        <w:t xml:space="preserve"> y a las variables redundantes. Además, confirmó la hipótesis sin depender del predictor «atajo», apoyándose en las variables temporales creadas en el proyecto.</w:t>
+      </w:r>
+    </w:p>
+    <w:p>
+      <w:pPr>
+        <w:pStyle w:val="Heading2"/>
+      </w:pPr>
+      <w:r>
+        <w:rPr>
+          <w:color w:val="2A5A9C"/>
+        </w:rPr>
+        <w:t>7.3 Aplicación del modelo y extensión del trabajo</w:t>
       </w:r>
     </w:p>
     <w:p>
@@ -4481,173 +4586,25 @@
         <w:jc w:val="both"/>
       </w:pPr>
       <w:r>
-        <w:t xml:space="preserve">Tercero, los modelos de </w:t>
+        <w:t xml:space="preserve">En un uso real, el modelo funcionaría como un </w:t>
       </w:r>
       <w:r>
         <w:rPr>
           <w:b/>
         </w:rPr>
-        <w:t>gradient boosting no superaron al Random Forest</w:t>
-      </w:r>
-      <w:r>
-        <w:t xml:space="preserve"> con este tamaño de datos (~1185 registros): XGBoost, LightGBM e HistGradientBoosting quedaron por debajo en accuracy y PR-AUC, mostrando que un método más complejo no garantiza mejores resultados.</w:t>
-      </w:r>
-    </w:p>
-    <w:p>
-      <w:pPr>
-        <w:spacing w:after="160" w:line="276" w:lineRule="auto"/>
-        <w:jc w:val="both"/>
-      </w:pPr>
-      <w:r>
-        <w:t xml:space="preserve">Cuarto, el </w:t>
+        <w:t>sistema de alerta temprana</w:t>
+      </w:r>
+      <w:r>
+        <w:t xml:space="preserve">: al inicio o durante la jornada estimaría el riesgo de incumplimiento de cada equipo, permitiendo a la supervisión priorizar su atención sobre los equipos vulnerables. Como </w:t>
       </w:r>
       <w:r>
         <w:rPr>
           <w:b/>
         </w:rPr>
-        <w:t>manejo del desbalance mejora la detección de los equipos en riesgo a costa del accuracy</w:t>
-      </w:r>
-      <w:r>
-        <w:t xml:space="preserve">: XGBoost con SMOTE eleva el F1 de «no cumple» a 0.619 (frente a 0.599 del Random Forest), pero con menor accuracy. Esto </w:t>
-      </w:r>
-      <w:r>
-        <w:rPr>
-          <w:b/>
-        </w:rPr>
-        <w:t>confirma que medir solo con accuracy puede ocultar mejoras valiosas</w:t>
-      </w:r>
-      <w:r>
-        <w:t>: si el objetivo es detectar a los equipos que no cumplirán, la métrica adecuada es el F1 o el PR-AUC, no el accuracy.</w:t>
-      </w:r>
-    </w:p>
-    <w:p>
-      <w:pPr>
-        <w:spacing w:after="160" w:line="276" w:lineRule="auto"/>
-        <w:jc w:val="both"/>
-      </w:pPr>
-      <w:r>
-        <w:t xml:space="preserve">En síntesis, la mejor configuración </w:t>
-      </w:r>
-      <w:r>
-        <w:rPr>
-          <w:b/>
-        </w:rPr>
-        <w:t>depende del objetivo</w:t>
-      </w:r>
-      <w:r>
-        <w:t>: para calidad predictiva global y estable, el Random Forest con variables enriquecidas (0.808 de accuracy); para maximizar la detección de equipos en riesgo, XGBoost con SMOTE (F1 de 0.619) o LightGBM con balance (F1 de 0.616). Todos los modelos superan ampliamente la base trivial (PR-AUC de 0.269).</w:t>
-      </w:r>
-    </w:p>
-    <w:p>
-      <w:pPr>
-        <w:pStyle w:val="Heading1"/>
-      </w:pPr>
-      <w:r>
-        <w:rPr>
-          <w:color w:val="1A3D6D"/>
-        </w:rPr>
-        <w:t>6. Discusión</w:t>
-      </w:r>
-    </w:p>
-    <w:p>
-      <w:pPr>
-        <w:spacing w:after="160" w:line="276" w:lineRule="auto"/>
-        <w:jc w:val="both"/>
-      </w:pPr>
-      <w:r>
-        <w:t xml:space="preserve">Los resultados confirman que es posible anticipar el cumplimiento de la productividad objetivo con un nivel de exactitud que supera la meta propuesta. Más allá de la cifra, el diseño experimental fue concebido para resistir las amenazas habituales a la validez en problemas con componente temporal. La </w:t>
-      </w:r>
-      <w:r>
-        <w:rPr>
-          <w:b/>
-        </w:rPr>
-        <w:t>fuga de información</w:t>
-      </w:r>
-      <w:r>
-        <w:t xml:space="preserve"> se mitigó de raíz mediante variables calculadas solo con el pasado y una partición temporal estricta; el riesgo de </w:t>
-      </w:r>
-      <w:r>
-        <w:rPr>
-          <w:b/>
-        </w:rPr>
-        <w:t>predictores tramposos</w:t>
-      </w:r>
-      <w:r>
-        <w:t xml:space="preserve"> se neutralizó con el Conjunto B; y la </w:t>
-      </w:r>
-      <w:r>
-        <w:rPr>
-          <w:b/>
-        </w:rPr>
-        <w:t>redundancia</w:t>
-      </w:r>
-      <w:r>
-        <w:t xml:space="preserve"> entre variables, detectada en el análisis exploratorio, se gestionó en la etapa de selección.</w:t>
-      </w:r>
-    </w:p>
-    <w:p>
-      <w:pPr>
-        <w:spacing w:after="160" w:line="276" w:lineRule="auto"/>
-        <w:jc w:val="both"/>
-      </w:pPr>
-      <w:r>
-        <w:t xml:space="preserve">Debe leerse el accuracy, no obstante, a la luz del </w:t>
-      </w:r>
-      <w:r>
-        <w:rPr>
-          <w:b/>
-        </w:rPr>
-        <w:t>desbalance de clases</w:t>
-      </w:r>
-      <w:r>
-        <w:t xml:space="preserve"> (73.1% de la clase mayoritaria). Por ello el análisis se complementó con las matrices de confusión y con la línea base trivial, que el mejor modelo supera en más de trece puntos porcentuales. Entre las </w:t>
-      </w:r>
-      <w:r>
-        <w:rPr>
-          <w:b/>
-        </w:rPr>
-        <w:t>limitaciones</w:t>
-      </w:r>
-      <w:r>
-        <w:t xml:space="preserve"> del estudio cabe señalar el tamaño moderado del conjunto (poco más de mil registros tras la preparación), la cobertura temporal de solo tres meses —que impide capturar estacionalidades anuales— y el hecho de que las variables temporales reducen ligeramente la muestra al descartar el primer registro de cada equipo.</w:t>
-      </w:r>
-    </w:p>
-    <w:p>
-      <w:pPr>
-        <w:pStyle w:val="Heading1"/>
-      </w:pPr>
-      <w:r>
-        <w:rPr>
-          <w:color w:val="1A3D6D"/>
-        </w:rPr>
-        <w:t>7. Conclusiones</w:t>
-      </w:r>
-    </w:p>
-    <w:p>
-      <w:pPr>
-        <w:spacing w:after="160" w:line="276" w:lineRule="auto"/>
-        <w:jc w:val="both"/>
-      </w:pPr>
-      <w:r>
-        <w:t xml:space="preserve">Primero, se diseñó e implementó un flujo completo de minería de datos conforme a CRISP-DM para predecir el cumplimiento de la productividad objetivo de equipos textiles, formulado como una clasificación binaria. Segundo, la hipótesis se </w:t>
-      </w:r>
-      <w:r>
-        <w:rPr>
-          <w:b/>
-        </w:rPr>
-        <w:t>confirma</w:t>
-      </w:r>
-      <w:r>
-        <w:t>: el mejor modelo (Random Forest) alcanzó un 87.0% de accuracy sobre datos no vistos, por encima de la meta del 80% y muy por sobre la línea base de 73.2%. Tercero, las variables temporales construidas en este trabajo (media móvil y retardo de la productividad) se ubicaron entre las más importantes, validando el eje conceptual del proyecto. Cuarto, la comparación de conjuntos demostró que el modelo no depende del predictor «atajo», sustentándose en información operativa y temporal genuina.</w:t>
-      </w:r>
-    </w:p>
-    <w:p>
-      <w:pPr>
-        <w:spacing w:after="160" w:line="276" w:lineRule="auto"/>
-        <w:jc w:val="both"/>
-      </w:pPr>
-      <w:r>
-        <w:t>Quinto, la validación adicional bajo un protocolo más estricto (walk-forward y métricas robustas, Sección 5.4) confirmó la solidez de los hallazgos: el desempeño se mantiene sólido (0.808 de accuracy, una cifra más realista que la del corte único), las variables temporales enriquecidas resultaron la palanca más efectiva, y la elección del modelo y de la métrica debe guiarse por el objetivo —calidad global frente a detección de los equipos en riesgo.</w:t>
+        <w:t>extensión</w:t>
+      </w:r>
+      <w:r>
+        <w:t>, se propone: optimizar una métrica robusta (F1 / PR-AUC) por el desbalance; adoptar validación walk-forward de forma sistemática; enriquecer aún más la ingeniería de variables temporales; y evaluar gradient boosting con búsqueda de hiperparámetros. El detalle de estas líneas se recoge en el documento complementario de trabajo futuro.</w:t>
       </w:r>
     </w:p>
     <w:p>
@@ -4713,24 +4670,6 @@
       </w:r>
       <w:r>
         <w:t>, 2825–2830.</w:t>
-      </w:r>
-    </w:p>
-    <w:p>
-      <w:pPr>
-        <w:spacing w:after="120"/>
-        <w:ind w:left="709" w:hanging="709"/>
-      </w:pPr>
-      <w:r>
-        <w:t xml:space="preserve">Rahim, M. S., Imran, A. A., y Ahmed, T. (2021). Mining the productivity data of the garment industry. </w:t>
-      </w:r>
-      <w:r>
-        <w:rPr>
-          <w:i/>
-        </w:rPr>
-        <w:t>International Journal of Business Intelligence and Data Mining, 19</w:t>
-      </w:r>
-      <w:r>
-        <w:t>(3), 319–342.</w:t>
       </w:r>
     </w:p>
     <w:p>

</xml_diff>